<commit_message>
Refresh Rose attorney review package
</commit_message>
<xml_diff>
--- a/Project Rooms/Contract for Deed/output/320 Rose - Contract for Deed Agreement - ATTORNEY REVIEW PACKAGE.docx
+++ b/Project Rooms/Contract for Deed/output/320 Rose - Contract for Deed Agreement - ATTORNEY REVIEW PACKAGE.docx
@@ -87,7 +87,6 @@
           <w:b/>
           <w:bCs/>
           <w:noProof/>
-          <w:color w:val="C00000"/>
           <w:sz w:val="28"/>
           <w:szCs w:val="28"/>
         </w:rPr>
@@ -114,20 +113,7 @@
           <w:szCs w:val="28"/>
         </w:rPr>
         <w:tab/>
-      </w:r>
-      <w:proofErr w:type="gramStart"/>
-      <w:r>
-        <w:rPr>
-          <w:szCs w:val="28"/>
-        </w:rPr>
-        <w:t>Whose</w:t>
-      </w:r>
-      <w:proofErr w:type="gramEnd"/>
-      <w:r>
-        <w:rPr>
-          <w:szCs w:val="28"/>
-        </w:rPr>
-        <w:t xml:space="preserve"> principal address is:</w:t>
+        <w:t>Whose principal address is:</w:t>
       </w:r>
     </w:p>
     <w:p>
@@ -576,7 +562,8 @@
         <w:rPr>
           <w:szCs w:val="28"/>
         </w:rPr>
-        <w:t>County of: WAKE</w:t>
+        <w:tab/>
+        <w:t>County of: Wake</w:t>
       </w:r>
     </w:p>
     <w:p>
@@ -673,7 +660,7 @@
       </w:tblGrid>
       <w:tr>
         <w:trPr>
-          <w:trHeight w:hRule="exact" w:val="911"/>
+          <w:trHeight w:hRule="exact" w:val="1540"/>
         </w:trPr>
         <w:tc>
           <w:tcPr>
@@ -709,15 +696,81 @@
             <w:tcW w:w="1459" w:type="dxa"/>
           </w:tcPr>
           <w:p>
+            <w:pPr>
+              <w:jc w:val="right"/>
+            </w:pPr>
             <w:r>
-              <w:t>20,790.00</w:t>
+              <w:t>6,000.00</w:t>
             </w:r>
           </w:p>
         </w:tc>
       </w:tr>
       <w:tr>
         <w:trPr>
-          <w:trHeight w:hRule="exact" w:val="542"/>
+          <w:trHeight w:hRule="exact" w:val="272"/>
+        </w:trPr>
+        <w:tc>
+          <w:tcPr>
+            <w:tcW w:w="522" w:type="dxa"/>
+          </w:tcPr>
+          <w:p>
+            <w:pPr>
+              <w:pStyle w:val="Textbody"/>
+              <w:tabs>
+                <w:tab w:val="clear" w:pos="280"/>
+                <w:tab w:val="clear" w:pos="10350"/>
+                <w:tab w:val="left" w:pos="720"/>
+              </w:tabs>
+              <w:spacing w:line="264" w:lineRule="auto"/>
+              <w:ind w:left="270"/>
+              <w:jc w:val="right"/>
+              <w:rPr>
+                <w:sz w:val="24"/>
+                <w:szCs w:val="24"/>
+              </w:rPr>
+            </w:pPr>
+            <w:r>
+              <w:rPr>
+                <w:sz w:val="24"/>
+                <w:szCs w:val="24"/>
+              </w:rPr>
+              <w:t>$</w:t>
+            </w:r>
+          </w:p>
+        </w:tc>
+        <w:tc>
+          <w:tcPr>
+            <w:tcW w:w="1459" w:type="dxa"/>
+          </w:tcPr>
+          <w:p>
+            <w:pPr>
+              <w:pStyle w:val="Textbody"/>
+              <w:tabs>
+                <w:tab w:val="clear" w:pos="280"/>
+                <w:tab w:val="clear" w:pos="10350"/>
+                <w:tab w:val="left" w:pos="720"/>
+              </w:tabs>
+              <w:spacing w:line="264" w:lineRule="auto"/>
+              <w:ind w:left="270"/>
+              <w:jc w:val="right"/>
+              <w:rPr>
+                <w:sz w:val="24"/>
+                <w:szCs w:val="24"/>
+              </w:rPr>
+            </w:pPr>
+            <w:r>
+              <w:rPr>
+                <w:sz w:val="24"/>
+                <w:szCs w:val="24"/>
+              </w:rPr>
+              <w:t>14,790.00</w:t>
+            </w:r>
+          </w:p>
+        </w:tc>
+      </w:tr>
+      <w:tr>
+        <w:trPr>
+          <w:trHeight w:hRule="exact" w:val="623"/>
         </w:trPr>
         <w:tc>
           <w:tcPr>
@@ -747,53 +800,10 @@
           </w:tcPr>
           <w:p>
             <w:pPr>
-              <w:pStyle w:val="Textbody"/>
-              <w:tabs>
-                <w:tab w:val="clear" w:pos="280"/>
-                <w:tab w:val="clear" w:pos="10350"/>
-                <w:tab w:val="left" w:pos="720"/>
-              </w:tabs>
-              <w:spacing w:line="264" w:lineRule="auto"/>
-              <w:ind w:left="270"/>
-              <w:rPr>
-                <w:sz w:val="24"/>
-                <w:szCs w:val="28"/>
-              </w:rPr>
+              <w:jc w:val="right"/>
             </w:pPr>
+            <w:r/>
           </w:p>
-        </w:tc>
-      </w:tr>
-      <w:tr>
-        <w:trPr>
-          <w:trHeight w:hRule="exact" w:val="632"/>
-        </w:trPr>
-        <w:tc>
-          <w:tcPr>
-            <w:tcW w:w="522" w:type="dxa"/>
-          </w:tcPr>
-          <w:p>
-            <w:pPr>
-              <w:pStyle w:val="Textbody"/>
-              <w:tabs>
-                <w:tab w:val="clear" w:pos="280"/>
-                <w:tab w:val="clear" w:pos="10350"/>
-                <w:tab w:val="left" w:pos="720"/>
-              </w:tabs>
-              <w:spacing w:line="264" w:lineRule="auto"/>
-              <w:ind w:left="270"/>
-              <w:jc w:val="right"/>
-              <w:rPr>
-                <w:sz w:val="24"/>
-                <w:szCs w:val="28"/>
-              </w:rPr>
-            </w:pPr>
-          </w:p>
-        </w:tc>
-        <w:tc>
-          <w:tcPr>
-            <w:tcW w:w="1459" w:type="dxa"/>
-          </w:tcPr>
-          <w:p/>
         </w:tc>
       </w:tr>
       <w:tr>
@@ -836,6 +846,7 @@
               </w:tabs>
               <w:spacing w:line="264" w:lineRule="auto"/>
               <w:ind w:left="270"/>
+              <w:jc w:val="right"/>
               <w:rPr>
                 <w:sz w:val="24"/>
                 <w:szCs w:val="28"/>
@@ -884,6 +895,7 @@
               </w:tabs>
               <w:spacing w:line="264" w:lineRule="auto"/>
               <w:ind w:left="270"/>
+              <w:jc w:val="right"/>
               <w:rPr>
                 <w:sz w:val="24"/>
                 <w:szCs w:val="28"/>
@@ -932,6 +944,7 @@
               </w:tabs>
               <w:spacing w:line="264" w:lineRule="auto"/>
               <w:ind w:left="270"/>
+              <w:jc w:val="right"/>
               <w:rPr>
                 <w:sz w:val="24"/>
                 <w:szCs w:val="28"/>
@@ -978,6 +991,9 @@
             <w:tcW w:w="1459" w:type="dxa"/>
           </w:tcPr>
           <w:p>
+            <w:pPr>
+              <w:jc w:val="right"/>
+            </w:pPr>
             <w:r>
               <w:t>325,710.00</w:t>
             </w:r>
@@ -1024,6 +1040,7 @@
               </w:tabs>
               <w:spacing w:line="264" w:lineRule="auto"/>
               <w:ind w:left="270"/>
+              <w:jc w:val="right"/>
               <w:rPr>
                 <w:sz w:val="24"/>
                 <w:szCs w:val="28"/>
@@ -1070,6 +1087,9 @@
             <w:tcW w:w="1459" w:type="dxa"/>
           </w:tcPr>
           <w:p>
+            <w:pPr>
+              <w:jc w:val="right"/>
+            </w:pPr>
             <w:r>
               <w:t>346,500.00</w:t>
             </w:r>
@@ -1101,25 +1121,7 @@
         <w:rPr>
           <w:szCs w:val="24"/>
         </w:rPr>
-        <w:t>Binder deposit which will remain as a binder until closing, unless sooner forfeited or returned,</w:t>
-      </w:r>
-      <w:r>
-        <w:rPr>
-          <w:szCs w:val="24"/>
-        </w:rPr>
-        <w:t xml:space="preserve"> </w:t>
-      </w:r>
-      <w:r>
-        <w:rPr>
-          <w:szCs w:val="24"/>
-        </w:rPr>
-        <w:t xml:space="preserve">according to the provisions in this Agreement.         </w:t>
-      </w:r>
-      <w:r>
-        <w:rPr>
-          <w:szCs w:val="24"/>
-        </w:rPr>
-        <w:tab/>
+        <w:t>Earnest money deposit to be paid by Purchaser upon execution of this Contract. This earnest money shall remain as a binder until closing, unless sooner forfeited or returned according to the provisions in this Agreement, and shall be credited toward the total down payment.</w:t>
       </w:r>
     </w:p>
     <w:p>
@@ -1146,21 +1148,7 @@
         <w:rPr>
           <w:szCs w:val="24"/>
         </w:rPr>
-        <w:t xml:space="preserve">Additional binder deposit </w:t>
-      </w:r>
-      <w:proofErr w:type="gramStart"/>
-      <w:r>
-        <w:rPr>
-          <w:szCs w:val="24"/>
-        </w:rPr>
-        <w:t>due</w:t>
-      </w:r>
-      <w:proofErr w:type="gramEnd"/>
-      <w:r>
-        <w:rPr>
-          <w:szCs w:val="24"/>
-        </w:rPr>
-        <w:t xml:space="preserve"> within ______days after date of this agreement.                                                                     </w:t>
+        <w:t>Remaining balance of the down payment due at closing.</w:t>
       </w:r>
     </w:p>
     <w:p>
@@ -1329,21 +1317,7 @@
         <w:rPr>
           <w:szCs w:val="24"/>
         </w:rPr>
-        <w:t xml:space="preserve">Existing mortgage balance encumbering the Property to </w:t>
-      </w:r>
-      <w:proofErr w:type="gramStart"/>
-      <w:r>
-        <w:rPr>
-          <w:szCs w:val="24"/>
-        </w:rPr>
-        <w:t>be taken</w:t>
-      </w:r>
-      <w:proofErr w:type="gramEnd"/>
-      <w:r>
-        <w:rPr>
-          <w:szCs w:val="24"/>
-        </w:rPr>
-        <w:t xml:space="preserve"> subject to by Purchaser (approximately).                     </w:t>
+        <w:t xml:space="preserve">Existing mortgage balance encumbering the Property to be taken subject to by Purchaser (approximately).                     </w:t>
       </w:r>
       <w:r>
         <w:rPr>
@@ -1377,21 +1351,7 @@
         <w:rPr>
           <w:szCs w:val="24"/>
         </w:rPr>
-        <w:t xml:space="preserve">Total Purchase </w:t>
-      </w:r>
-      <w:proofErr w:type="gramStart"/>
-      <w:r>
-        <w:rPr>
-          <w:szCs w:val="24"/>
-        </w:rPr>
-        <w:t>Price  -</w:t>
-      </w:r>
-      <w:proofErr w:type="gramEnd"/>
-      <w:r>
-        <w:rPr>
-          <w:szCs w:val="24"/>
-        </w:rPr>
-        <w:t xml:space="preserve"> exactly</w:t>
+        <w:t>Total Purchase Price  - exactly</w:t>
       </w:r>
       <w:r>
         <w:rPr>
@@ -1451,21 +1411,7 @@
         <w:rPr>
           <w:szCs w:val="28"/>
         </w:rPr>
-        <w:t xml:space="preserve">Purchaser agrees to provide </w:t>
-      </w:r>
-      <w:proofErr w:type="gramStart"/>
-      <w:r>
-        <w:rPr>
-          <w:szCs w:val="28"/>
-        </w:rPr>
-        <w:t>an additional</w:t>
-      </w:r>
-      <w:proofErr w:type="gramEnd"/>
-      <w:r>
-        <w:rPr>
-          <w:szCs w:val="28"/>
-        </w:rPr>
-        <w:t xml:space="preserve"> charges and fees associated with the recording of a Memorandum of (this) Contract for Deed and administrative costs of the Seller</w:t>
+        <w:t>Purchaser agrees to provide an additional charges and fees associated with the recording of a Memorandum of (this) Contract for Deed and administrative costs of the Seller</w:t>
       </w:r>
       <w:r>
         <w:rPr>
@@ -1500,31 +1446,7 @@
         <w:rPr>
           <w:szCs w:val="28"/>
         </w:rPr>
-        <w:t>Purchaser Will Pay the following options</w:t>
-      </w:r>
-      <w:r>
-        <w:rPr>
-          <w:szCs w:val="28"/>
-        </w:rPr>
-        <w:t>,</w:t>
-      </w:r>
-      <w:r>
-        <w:rPr>
-          <w:szCs w:val="28"/>
-        </w:rPr>
-        <w:t xml:space="preserve"> if they </w:t>
-      </w:r>
-      <w:r>
-        <w:rPr>
-          <w:szCs w:val="28"/>
-        </w:rPr>
-        <w:t>apply</w:t>
-      </w:r>
-      <w:r>
-        <w:rPr>
-          <w:szCs w:val="28"/>
-        </w:rPr>
-        <w:t xml:space="preserve">: </w:t>
+        <w:t xml:space="preserve">Purchaser Will Pay the following options, if they apply: </w:t>
       </w:r>
     </w:p>
     <w:p>
@@ -1618,59 +1540,27 @@
         <w:rPr>
           <w:szCs w:val="28"/>
         </w:rPr>
-        <w:t xml:space="preserve"> Wood Destroying Organism </w:t>
-      </w:r>
-      <w:proofErr w:type="gramStart"/>
-      <w:r>
-        <w:rPr>
-          <w:szCs w:val="28"/>
-        </w:rPr>
-        <w:t xml:space="preserve">Report </w:t>
-      </w:r>
-      <w:r>
-        <w:rPr>
-          <w:szCs w:val="28"/>
-        </w:rPr>
-        <w:tab/>
-      </w:r>
-      <w:r>
-        <w:rPr>
-          <w:b/>
-          <w:bCs/>
-          <w:szCs w:val="28"/>
-        </w:rPr>
-        <w:t>[</w:t>
-      </w:r>
-      <w:proofErr w:type="gramEnd"/>
-      <w:r>
-        <w:rPr>
-          <w:b/>
-          <w:bCs/>
-          <w:szCs w:val="28"/>
-        </w:rPr>
-        <w:t>X</w:t>
-      </w:r>
-      <w:proofErr w:type="gramStart"/>
-      <w:r>
-        <w:rPr>
-          <w:b/>
-          <w:bCs/>
-          <w:szCs w:val="28"/>
-        </w:rPr>
-        <w:t>]</w:t>
-      </w:r>
-      <w:r>
-        <w:rPr>
-          <w:szCs w:val="28"/>
-        </w:rPr>
-        <w:t xml:space="preserve">  Real</w:t>
-      </w:r>
-      <w:proofErr w:type="gramEnd"/>
-      <w:r>
-        <w:rPr>
-          <w:szCs w:val="28"/>
-        </w:rPr>
-        <w:t xml:space="preserve"> estate brokerage fee</w:t>
+        <w:t xml:space="preserve"> Wood Destroying Organism Report </w:t>
+      </w:r>
+      <w:r>
+        <w:rPr>
+          <w:szCs w:val="28"/>
+        </w:rPr>
+        <w:tab/>
+      </w:r>
+      <w:r>
+        <w:rPr>
+          <w:b/>
+          <w:bCs/>
+          <w:szCs w:val="28"/>
+        </w:rPr>
+        <w:t>[X]</w:t>
+      </w:r>
+      <w:r>
+        <w:rPr>
+          <w:szCs w:val="28"/>
+        </w:rPr>
+        <w:t xml:space="preserve">  Real estate brokerage fee</w:t>
       </w:r>
     </w:p>
     <w:p>
@@ -1730,21 +1620,7 @@
         <w:rPr>
           <w:szCs w:val="28"/>
         </w:rPr>
-        <w:t xml:space="preserve">[ </w:t>
-      </w:r>
-      <w:proofErr w:type="gramStart"/>
-      <w:r>
-        <w:rPr>
-          <w:szCs w:val="28"/>
-        </w:rPr>
-        <w:t xml:space="preserve">  ]</w:t>
-      </w:r>
-      <w:proofErr w:type="gramEnd"/>
-      <w:r>
-        <w:rPr>
-          <w:szCs w:val="28"/>
-        </w:rPr>
-        <w:t xml:space="preserve"> Other______________________________________</w:t>
+        <w:t>[   ] Other______________________________________</w:t>
       </w:r>
     </w:p>
     <w:p>
@@ -1834,34 +1710,16 @@
           <w:bCs/>
           <w:szCs w:val="28"/>
         </w:rPr>
-        <w:t xml:space="preserve">[X]Title insurance </w:t>
-      </w:r>
-      <w:proofErr w:type="gramStart"/>
-      <w:r>
-        <w:rPr>
-          <w:b/>
-          <w:bCs/>
-          <w:szCs w:val="28"/>
-        </w:rPr>
-        <w:t xml:space="preserve">policy   </w:t>
-      </w:r>
-      <w:r>
-        <w:rPr>
-          <w:b/>
-          <w:bCs/>
-          <w:szCs w:val="28"/>
-        </w:rPr>
-        <w:tab/>
-        <w:t>[</w:t>
-      </w:r>
-      <w:proofErr w:type="gramEnd"/>
-      <w:r>
-        <w:rPr>
-          <w:b/>
-          <w:bCs/>
-          <w:szCs w:val="28"/>
-        </w:rPr>
-        <w:t xml:space="preserve">X] Attorney's fee </w:t>
+        <w:t xml:space="preserve">[X]Title insurance policy   </w:t>
+      </w:r>
+      <w:r>
+        <w:rPr>
+          <w:b/>
+          <w:bCs/>
+          <w:szCs w:val="28"/>
+        </w:rPr>
+        <w:tab/>
+        <w:t xml:space="preserve">[X] Attorney's fee </w:t>
       </w:r>
     </w:p>
     <w:p>
@@ -1886,34 +1744,16 @@
           <w:bCs/>
           <w:szCs w:val="28"/>
         </w:rPr>
-        <w:t xml:space="preserve">[X] Closing </w:t>
-      </w:r>
-      <w:proofErr w:type="gramStart"/>
-      <w:r>
-        <w:rPr>
-          <w:b/>
-          <w:bCs/>
-          <w:szCs w:val="28"/>
-        </w:rPr>
-        <w:t xml:space="preserve">Costs   </w:t>
-      </w:r>
-      <w:r>
-        <w:rPr>
-          <w:b/>
-          <w:bCs/>
-          <w:szCs w:val="28"/>
-        </w:rPr>
-        <w:tab/>
-        <w:t>[</w:t>
-      </w:r>
-      <w:proofErr w:type="gramEnd"/>
-      <w:r>
-        <w:rPr>
-          <w:b/>
-          <w:bCs/>
-          <w:szCs w:val="28"/>
-        </w:rPr>
-        <w:t xml:space="preserve">X] Recording fees   </w:t>
+        <w:t xml:space="preserve">[X] Closing Costs   </w:t>
+      </w:r>
+      <w:r>
+        <w:rPr>
+          <w:b/>
+          <w:bCs/>
+          <w:szCs w:val="28"/>
+        </w:rPr>
+        <w:tab/>
+        <w:t xml:space="preserve">[X] Recording fees   </w:t>
       </w:r>
     </w:p>
     <w:p>
@@ -1938,34 +1778,16 @@
           <w:bCs/>
           <w:szCs w:val="28"/>
         </w:rPr>
-        <w:t xml:space="preserve">[X] Note </w:t>
-      </w:r>
-      <w:proofErr w:type="gramStart"/>
-      <w:r>
-        <w:rPr>
-          <w:b/>
-          <w:bCs/>
-          <w:szCs w:val="28"/>
-        </w:rPr>
-        <w:t xml:space="preserve">stamps   </w:t>
-      </w:r>
-      <w:r>
-        <w:rPr>
-          <w:b/>
-          <w:bCs/>
-          <w:szCs w:val="28"/>
-        </w:rPr>
-        <w:tab/>
-        <w:t>[</w:t>
-      </w:r>
-      <w:proofErr w:type="gramEnd"/>
-      <w:r>
-        <w:rPr>
-          <w:b/>
-          <w:bCs/>
-          <w:szCs w:val="28"/>
-        </w:rPr>
-        <w:t xml:space="preserve">X] Intangible tax    </w:t>
+        <w:t xml:space="preserve">[X] Note stamps   </w:t>
+      </w:r>
+      <w:r>
+        <w:rPr>
+          <w:b/>
+          <w:bCs/>
+          <w:szCs w:val="28"/>
+        </w:rPr>
+        <w:tab/>
+        <w:t xml:space="preserve">[X] Intangible tax    </w:t>
       </w:r>
     </w:p>
     <w:p>
@@ -2009,42 +1831,14 @@
         <w:rPr>
           <w:szCs w:val="28"/>
         </w:rPr>
-        <w:t xml:space="preserve">[ </w:t>
-      </w:r>
-      <w:proofErr w:type="gramStart"/>
-      <w:r>
-        <w:rPr>
-          <w:szCs w:val="28"/>
-        </w:rPr>
-        <w:t xml:space="preserve">  ]</w:t>
-      </w:r>
-      <w:proofErr w:type="gramEnd"/>
-      <w:r>
-        <w:rPr>
-          <w:szCs w:val="28"/>
-        </w:rPr>
-        <w:t xml:space="preserve"> Credit reports   </w:t>
-      </w:r>
-      <w:r>
-        <w:rPr>
-          <w:szCs w:val="28"/>
-        </w:rPr>
-        <w:tab/>
-        <w:t xml:space="preserve">[ </w:t>
-      </w:r>
-      <w:proofErr w:type="gramStart"/>
-      <w:r>
-        <w:rPr>
-          <w:szCs w:val="28"/>
-        </w:rPr>
-        <w:t xml:space="preserve">  ]</w:t>
-      </w:r>
-      <w:proofErr w:type="gramEnd"/>
-      <w:r>
-        <w:rPr>
-          <w:szCs w:val="28"/>
-        </w:rPr>
-        <w:t xml:space="preserve"> Loan origination fee   </w:t>
+        <w:t xml:space="preserve">[   ] Credit reports   </w:t>
+      </w:r>
+      <w:r>
+        <w:rPr>
+          <w:szCs w:val="28"/>
+        </w:rPr>
+        <w:tab/>
+        <w:t xml:space="preserve">[   ] Loan origination fee   </w:t>
       </w:r>
     </w:p>
     <w:p>
@@ -2065,42 +1859,14 @@
         <w:rPr>
           <w:szCs w:val="28"/>
         </w:rPr>
-        <w:t xml:space="preserve">[ </w:t>
-      </w:r>
-      <w:proofErr w:type="gramStart"/>
-      <w:r>
-        <w:rPr>
-          <w:szCs w:val="28"/>
-        </w:rPr>
-        <w:t xml:space="preserve">  ]</w:t>
-      </w:r>
-      <w:proofErr w:type="gramEnd"/>
-      <w:r>
-        <w:rPr>
-          <w:szCs w:val="28"/>
-        </w:rPr>
-        <w:t xml:space="preserve"> Loan insurance premium   </w:t>
-      </w:r>
-      <w:r>
-        <w:rPr>
-          <w:szCs w:val="28"/>
-        </w:rPr>
-        <w:tab/>
-        <w:t xml:space="preserve">[ </w:t>
-      </w:r>
-      <w:proofErr w:type="gramStart"/>
-      <w:r>
-        <w:rPr>
-          <w:szCs w:val="28"/>
-        </w:rPr>
-        <w:t xml:space="preserve">  ]</w:t>
-      </w:r>
-      <w:proofErr w:type="gramEnd"/>
-      <w:r>
-        <w:rPr>
-          <w:szCs w:val="28"/>
-        </w:rPr>
-        <w:t xml:space="preserve"> Other_________________________________</w:t>
+        <w:t xml:space="preserve">[   ] Loan insurance premium   </w:t>
+      </w:r>
+      <w:r>
+        <w:rPr>
+          <w:szCs w:val="28"/>
+        </w:rPr>
+        <w:tab/>
+        <w:t>[   ] Other_________________________________</w:t>
       </w:r>
     </w:p>
     <w:p>
@@ -2117,19 +1883,11 @@
           <w:szCs w:val="28"/>
         </w:rPr>
       </w:pPr>
-      <w:proofErr w:type="gramStart"/>
-      <w:r>
-        <w:rPr>
-          <w:szCs w:val="28"/>
-        </w:rPr>
-        <w:t>[  ]</w:t>
-      </w:r>
-      <w:proofErr w:type="gramEnd"/>
-      <w:r>
-        <w:rPr>
-          <w:szCs w:val="28"/>
-        </w:rPr>
-        <w:t xml:space="preserve"> All other charges required by lender which Purchaser is prohibited from paying by law or regulation.</w:t>
+      <w:r>
+        <w:rPr>
+          <w:szCs w:val="28"/>
+        </w:rPr>
+        <w:t>[  ] All other charges required by lender which Purchaser is prohibited from paying by law or regulation.</w:t>
       </w:r>
     </w:p>
     <w:p>
@@ -2145,21 +1903,7 @@
         <w:rPr>
           <w:szCs w:val="28"/>
         </w:rPr>
-        <w:t xml:space="preserve">[ </w:t>
-      </w:r>
-      <w:proofErr w:type="gramStart"/>
-      <w:r>
-        <w:rPr>
-          <w:szCs w:val="28"/>
-        </w:rPr>
-        <w:t xml:space="preserve">  ]</w:t>
-      </w:r>
-      <w:proofErr w:type="gramEnd"/>
-      <w:r>
-        <w:rPr>
-          <w:szCs w:val="28"/>
-        </w:rPr>
-        <w:t xml:space="preserve"> Repairs or replacements, in addition to those in paragraph 9, not to exceed $_________________________</w:t>
+        <w:t>[   ] Repairs or replacements, in addition to those in paragraph 9, not to exceed $_________________________</w:t>
       </w:r>
     </w:p>
     <w:p>
@@ -2175,21 +1919,14 @@
         <w:rPr>
           <w:szCs w:val="28"/>
         </w:rPr>
-        <w:t xml:space="preserve">[ </w:t>
-      </w:r>
-      <w:proofErr w:type="gramStart"/>
-      <w:r>
-        <w:rPr>
-          <w:szCs w:val="28"/>
-        </w:rPr>
-        <w:t xml:space="preserve">  ]</w:t>
-      </w:r>
-      <w:proofErr w:type="gramEnd"/>
-      <w:r>
-        <w:rPr>
-          <w:szCs w:val="28"/>
-        </w:rPr>
-        <w:t xml:space="preserve"> All mortgage payments or condominium and association fees will be current at Seller's expense at the time of closing.</w:t>
+        <w:t xml:space="preserve">[   ] All mortgage payments or condominium and association fees will be </w:t>
+      </w:r>
+      <w:r>
+        <w:rPr>
+          <w:szCs w:val="28"/>
+        </w:rPr>
+        <w:lastRenderedPageBreak/>
+        <w:t>current at Seller's expense at the time of closing.</w:t>
       </w:r>
     </w:p>
     <w:p>
@@ -2255,12 +1992,27 @@
           <w:bCs/>
           <w:szCs w:val="28"/>
         </w:rPr>
-        <w:t>INTEREST RATE: Unpaid principal shall accrue interest at a rate of 7.500%(APR), with interest to be amortized over the term of this Contract for Deed. The Amount of Each Installment Payment above includes any interest payable, property Insurance, and escrowed Property Tax. Late payments shall accrue interest at a rate of four percent (4%) on any delinquent monies owed.</w:t>
-      </w:r>
+        <w:t>INTEREST RATE: Unpaid principal shall accrue interest at a rate of 8.500%(APR), with interest to be amortized over the term of this Contract for Deed. The Amount of Each Installment Payment above includes any interest payable, property Insurance, and escrowed Property Tax. Late payments shall accrue interest at a rate of four percent (4%) on any delinquent monies owed.</w:t>
+      </w:r>
+    </w:p>
+    <w:p>
+      <w:pPr>
+        <w:pStyle w:val="ListParagraph"/>
+        <w:ind w:left="0"/>
+        <w:rPr>
+          <w:b/>
+          <w:bCs/>
+          <w:szCs w:val="28"/>
+        </w:rPr>
+      </w:pPr>
     </w:p>
     <w:p>
       <w:pPr>
         <w:pStyle w:val="t1"/>
+        <w:numPr>
+          <w:ilvl w:val="0"/>
+          <w:numId w:val="10"/>
+        </w:numPr>
         <w:tabs>
           <w:tab w:val="left" w:pos="360"/>
           <w:tab w:val="left" w:pos="720"/>
@@ -2270,9 +2022,374 @@
           <w:tab w:val="left" w:pos="9780"/>
         </w:tabs>
         <w:spacing w:line="264" w:lineRule="auto"/>
+        <w:rPr>
+          <w:b/>
+          <w:bCs/>
+          <w:szCs w:val="28"/>
+        </w:rPr>
+      </w:pPr>
+      <w:r>
+        <w:rPr>
+          <w:b/>
+          <w:bCs/>
+          <w:szCs w:val="28"/>
+        </w:rPr>
+        <w:t>Installment Payments</w:t>
+      </w:r>
+    </w:p>
+    <w:p>
+      <w:r>
+        <w:rPr>
+          <w:b/>
+          <w:color w:val="0000FF"/>
+        </w:rPr>
+        <w:t>MANAGEMENT REVIEW NOTE: Confirm these business terms match the intended deal before sending to counsel or the parties: purchase price, down payment, loan amount, interest rate, monthly ACH draft/payment amount, first payment date, final payment date, number of payments, escrow amounts, and annual statement process. Do not ask the attorney to compare these values against the spreadsheet because the spreadsheet is not part of the attorney review package.</w:t>
+      </w:r>
+    </w:p>
+    <w:tbl>
+      <w:tblPr>
+        <w:tblW w:w="9737" w:type="dxa"/>
+        <w:jc w:val="center"/>
+        <w:tblLook w:val="04A0" w:firstRow="1" w:lastRow="0" w:firstColumn="1" w:lastColumn="0" w:noHBand="0" w:noVBand="1"/>
+      </w:tblPr>
+      <w:tblGrid>
+        <w:gridCol w:w="5828"/>
+        <w:gridCol w:w="3909"/>
+      </w:tblGrid>
+      <w:tr>
+        <w:trPr>
+          <w:jc w:val="center"/>
+        </w:trPr>
+        <w:tc>
+          <w:tcPr>
+            <w:tcW w:w="5828" w:type="dxa"/>
+          </w:tcPr>
+          <w:p>
+            <w:pPr>
+              <w:pStyle w:val="t1"/>
+              <w:numPr>
+                <w:ilvl w:val="1"/>
+                <w:numId w:val="10"/>
+              </w:numPr>
+              <w:spacing w:line="264" w:lineRule="auto"/>
+              <w:ind w:right="-223"/>
+            </w:pPr>
+            <w:r>
+              <w:t>Number of I</w:t>
+            </w:r>
+            <w:r>
+              <w:t>nstal</w:t>
+            </w:r>
+            <w:r>
+              <w:t>l</w:t>
+            </w:r>
+            <w:r>
+              <w:t>ments:</w:t>
+            </w:r>
+          </w:p>
+          <w:p>
+            <w:pPr>
+              <w:pStyle w:val="t1"/>
+              <w:numPr>
+                <w:ilvl w:val="1"/>
+                <w:numId w:val="10"/>
+              </w:numPr>
+              <w:spacing w:line="264" w:lineRule="auto"/>
+            </w:pPr>
+            <w:r>
+              <w:t>Due Date of the First Installment Payment:</w:t>
+            </w:r>
+          </w:p>
+          <w:p>
+            <w:pPr>
+              <w:pStyle w:val="t1"/>
+              <w:numPr>
+                <w:ilvl w:val="1"/>
+                <w:numId w:val="10"/>
+              </w:numPr>
+              <w:spacing w:line="264" w:lineRule="auto"/>
+            </w:pPr>
+            <w:r>
+              <w:t>Due Date of the Last Installment Payment:</w:t>
+            </w:r>
+          </w:p>
+          <w:p>
+            <w:pPr>
+              <w:pStyle w:val="t1"/>
+              <w:numPr>
+                <w:ilvl w:val="1"/>
+                <w:numId w:val="10"/>
+              </w:numPr>
+              <w:spacing w:line="264" w:lineRule="auto"/>
+            </w:pPr>
+            <w:r>
+              <w:t>Principal and Interest:</w:t>
+            </w:r>
+          </w:p>
+          <w:p>
+            <w:pPr>
+              <w:pStyle w:val="t1"/>
+              <w:numPr>
+                <w:ilvl w:val="1"/>
+                <w:numId w:val="10"/>
+              </w:numPr>
+              <w:spacing w:line="264" w:lineRule="auto"/>
+            </w:pPr>
+            <w:r>
+              <w:t>Property Insurance</w:t>
+            </w:r>
+            <w:r>
+              <w:t>-paid into escrow</w:t>
+            </w:r>
+            <w:r>
+              <w:t xml:space="preserve"> *:</w:t>
+            </w:r>
+          </w:p>
+          <w:p>
+            <w:pPr>
+              <w:pStyle w:val="t1"/>
+              <w:numPr>
+                <w:ilvl w:val="1"/>
+                <w:numId w:val="10"/>
+              </w:numPr>
+              <w:spacing w:line="264" w:lineRule="auto"/>
+            </w:pPr>
+            <w:r>
+              <w:t>Property Tax</w:t>
+            </w:r>
+            <w:r>
+              <w:t>-</w:t>
+            </w:r>
+            <w:r>
+              <w:t>paid into escrow</w:t>
+            </w:r>
+            <w:r>
+              <w:t xml:space="preserve"> *:</w:t>
+            </w:r>
+          </w:p>
+          <w:p>
+            <w:pPr>
+              <w:pStyle w:val="t1"/>
+              <w:numPr>
+                <w:ilvl w:val="1"/>
+                <w:numId w:val="10"/>
+              </w:numPr>
+              <w:spacing w:line="264" w:lineRule="auto"/>
+            </w:pPr>
+            <w:r>
+              <w:t>Total Monthly Payment:</w:t>
+            </w:r>
+          </w:p>
+          <w:p/>
+        </w:tc>
+        <w:tc>
+          <w:tcPr>
+            <w:tcW w:w="3909" w:type="dxa"/>
+          </w:tcPr>
+          <w:tbl>
+            <w:tblPr>
+              <w:tblW w:w="2284" w:type="dxa"/>
+              <w:jc w:val="center"/>
+              <w:tblBorders>
+                <w:top w:val="single" w:sz="4" w:space="0" w:color="auto"/>
+                <w:left w:val="single" w:sz="4" w:space="0" w:color="auto"/>
+                <w:bottom w:val="single" w:sz="4" w:space="0" w:color="auto"/>
+                <w:right w:val="single" w:sz="4" w:space="0" w:color="auto"/>
+                <w:insideH w:val="single" w:sz="4" w:space="0" w:color="auto"/>
+                <w:insideV w:val="single" w:sz="4" w:space="0" w:color="auto"/>
+              </w:tblBorders>
+              <w:tblLook w:val="04A0" w:firstRow="1" w:lastRow="0" w:firstColumn="1" w:lastColumn="0" w:noHBand="0" w:noVBand="1"/>
+            </w:tblPr>
+            <w:tblGrid>
+              <w:gridCol w:w="2284"/>
+            </w:tblGrid>
+            <w:tr>
+              <w:trPr>
+                <w:jc w:val="center"/>
+              </w:trPr>
+              <w:tc>
+                <w:tcPr>
+                  <w:tcW w:w="2284" w:type="dxa"/>
+                  <w:vAlign w:val="center"/>
+                </w:tcPr>
+                <w:p>
+                  <w:pPr>
+                    <w:jc w:val="right"/>
+                  </w:pPr>
+                  <w:r>
+                    <w:t>360</w:t>
+                  </w:r>
+                </w:p>
+              </w:tc>
+            </w:tr>
+            <w:tr>
+              <w:trPr>
+                <w:jc w:val="center"/>
+              </w:trPr>
+              <w:tc>
+                <w:tcPr>
+                  <w:tcW w:w="2284" w:type="dxa"/>
+                  <w:vAlign w:val="center"/>
+                </w:tcPr>
+                <w:p>
+                  <w:pPr>
+                    <w:jc w:val="right"/>
+                  </w:pPr>
+                  <w:r>
+                    <w:t>7/1/2026</w:t>
+                  </w:r>
+                </w:p>
+              </w:tc>
+            </w:tr>
+            <w:tr>
+              <w:trPr>
+                <w:jc w:val="center"/>
+              </w:trPr>
+              <w:tc>
+                <w:tcPr>
+                  <w:tcW w:w="2284" w:type="dxa"/>
+                  <w:vAlign w:val="center"/>
+                </w:tcPr>
+                <w:p>
+                  <w:pPr>
+                    <w:jc w:val="right"/>
+                  </w:pPr>
+                  <w:r>
+                    <w:t>6/1/2056</w:t>
+                  </w:r>
+                </w:p>
+              </w:tc>
+            </w:tr>
+            <w:tr>
+              <w:trPr>
+                <w:jc w:val="center"/>
+              </w:trPr>
+              <w:tc>
+                <w:tcPr>
+                  <w:tcW w:w="2284" w:type="dxa"/>
+                  <w:vAlign w:val="center"/>
+                </w:tcPr>
+                <w:p>
+                  <w:pPr>
+                    <w:jc w:val="right"/>
+                  </w:pPr>
+                  <w:r>
+                    <w:t>2,504.43</w:t>
+                  </w:r>
+                </w:p>
+              </w:tc>
+            </w:tr>
+            <w:tr>
+              <w:trPr>
+                <w:jc w:val="center"/>
+              </w:trPr>
+              <w:tc>
+                <w:tcPr>
+                  <w:tcW w:w="2284" w:type="dxa"/>
+                  <w:vAlign w:val="center"/>
+                </w:tcPr>
+                <w:p>
+                  <w:pPr>
+                    <w:jc w:val="right"/>
+                  </w:pPr>
+                  <w:r>
+                    <w:t>51.50</w:t>
+                  </w:r>
+                </w:p>
+              </w:tc>
+            </w:tr>
+            <w:tr>
+              <w:trPr>
+                <w:jc w:val="center"/>
+              </w:trPr>
+              <w:tc>
+                <w:tcPr>
+                  <w:tcW w:w="2284" w:type="dxa"/>
+                  <w:vAlign w:val="center"/>
+                </w:tcPr>
+                <w:p>
+                  <w:pPr>
+                    <w:jc w:val="right"/>
+                  </w:pPr>
+                  <w:r>
+                    <w:t>145.10</w:t>
+                  </w:r>
+                </w:p>
+              </w:tc>
+            </w:tr>
+            <w:tr>
+              <w:trPr>
+                <w:trHeight w:val="350"/>
+                <w:jc w:val="center"/>
+              </w:trPr>
+              <w:tc>
+                <w:tcPr>
+                  <w:tcW w:w="2284" w:type="dxa"/>
+                  <w:vAlign w:val="center"/>
+                </w:tcPr>
+                <w:p>
+                  <w:pPr>
+                    <w:jc w:val="right"/>
+                  </w:pPr>
+                  <w:r>
+                    <w:t>2,701.03</w:t>
+                  </w:r>
+                </w:p>
+              </w:tc>
+            </w:tr>
+          </w:tbl>
+          <w:p>
+            <w:pPr>
+              <w:pStyle w:val="t1"/>
+              <w:spacing w:line="264" w:lineRule="auto"/>
+            </w:pPr>
+          </w:p>
+        </w:tc>
+      </w:tr>
+    </w:tbl>
+    <w:p>
+      <w:pPr>
+        <w:pStyle w:val="t1"/>
+        <w:numPr>
+          <w:ilvl w:val="1"/>
+          <w:numId w:val="10"/>
+        </w:numPr>
+        <w:tabs>
+          <w:tab w:val="left" w:pos="720"/>
+          <w:tab w:val="left" w:pos="3240"/>
+          <w:tab w:val="left" w:pos="7200"/>
+          <w:tab w:val="left" w:pos="8280"/>
+          <w:tab w:val="left" w:pos="9780"/>
+        </w:tabs>
+        <w:spacing w:line="264" w:lineRule="auto"/>
+        <w:ind w:left="630"/>
         <w:jc w:val="both"/>
         <w:rPr>
-          <w:szCs w:val="28"/>
+          <w:szCs w:val="24"/>
+        </w:rPr>
+      </w:pPr>
+      <w:r>
+        <w:t>(</w:t>
+      </w:r>
+      <w:r>
+        <w:t>*) The property Insurance and Property Tax values are correct for the contract year only and will adjust annually.</w:t>
+      </w:r>
+    </w:p>
+    <w:p>
+      <w:pPr>
+        <w:pStyle w:val="t1"/>
+        <w:tabs>
+          <w:tab w:val="left" w:pos="720"/>
+          <w:tab w:val="left" w:pos="3240"/>
+          <w:tab w:val="left" w:pos="7200"/>
+          <w:tab w:val="left" w:pos="8280"/>
+          <w:tab w:val="left" w:pos="9780"/>
+        </w:tabs>
+        <w:spacing w:line="264" w:lineRule="auto"/>
+        <w:ind w:left="630"/>
+        <w:jc w:val="both"/>
+        <w:rPr>
+          <w:szCs w:val="24"/>
         </w:rPr>
       </w:pPr>
     </w:p>
@@ -2292,64 +2409,35 @@
           <w:tab w:val="left" w:pos="9780"/>
         </w:tabs>
         <w:spacing w:line="264" w:lineRule="auto"/>
-        <w:rPr>
-          <w:b/>
-          <w:bCs/>
-          <w:szCs w:val="28"/>
-        </w:rPr>
-      </w:pPr>
-      <w:r>
-        <w:rPr>
-          <w:b/>
-          <w:bCs/>
-          <w:szCs w:val="28"/>
-        </w:rPr>
-        <w:t>INSTALLMENT PAYMENTS:</w:t>
-      </w:r>
-    </w:p>
-    <w:p>
-      <w:r>
-        <w:rPr>
-          <w:b/>
-          <w:color w:val="0000FF"/>
-        </w:rPr>
-        <w:t>MANAGEMENT REVIEW NOTE: Confirm these business terms match the intended deal before sending to counsel or the parties: purchase price, down payment, loan amount, interest rate, monthly ACH draft/payment amount, first payment date, final payment date, number of payments, escrow amounts, and annual statement process. Do not ask the attorney to compare these values against the spreadsheet because the spreadsheet is not part of the attorney review package.</w:t>
+        <w:jc w:val="both"/>
+        <w:rPr>
+          <w:szCs w:val="24"/>
+        </w:rPr>
+      </w:pPr>
+      <w:r>
+        <w:rPr>
+          <w:b/>
+          <w:bCs/>
+          <w:szCs w:val="28"/>
+        </w:rPr>
+        <w:t xml:space="preserve">ACH DRAFT PAYMENTS: </w:t>
+      </w:r>
+      <w:r>
+        <w:rPr>
+          <w:szCs w:val="28"/>
+        </w:rPr>
+        <w:t>Purchaser shall make each monthly payment by automatic ACH draft. Seller shall set up the ACH draft using the bank account and routing information provided by Purchaser</w:t>
+      </w:r>
+      <w:r>
+        <w:t xml:space="preserve"> </w:t>
+      </w:r>
+      <w:r>
+        <w:t>on the signature page.</w:t>
       </w:r>
     </w:p>
     <w:p>
       <w:pPr>
         <w:pStyle w:val="t1"/>
-        <w:numPr>
-          <w:ilvl w:val="1"/>
-          <w:numId w:val="10"/>
-        </w:numPr>
-        <w:tabs>
-          <w:tab w:val="left" w:pos="720"/>
-          <w:tab w:val="left" w:pos="3240"/>
-          <w:tab w:val="left" w:pos="7200"/>
-          <w:tab w:val="left" w:pos="8280"/>
-          <w:tab w:val="left" w:pos="9780"/>
-        </w:tabs>
-        <w:spacing w:line="264" w:lineRule="auto"/>
-        <w:ind w:left="630"/>
-        <w:rPr>
-          <w:szCs w:val="24"/>
-        </w:rPr>
-      </w:pPr>
-      <w:r>
-        <w:rPr>
-          <w:szCs w:val="24"/>
-        </w:rPr>
-        <w:t>For the first 360 instalments:</w:t>
-      </w:r>
-    </w:p>
-    <w:p>
-      <w:pPr>
-        <w:pStyle w:val="t1"/>
-        <w:numPr>
-          <w:ilvl w:val="2"/>
-          <w:numId w:val="10"/>
-        </w:numPr>
         <w:tabs>
           <w:tab w:val="left" w:pos="720"/>
           <w:tab w:val="left" w:pos="1620"/>
@@ -2361,416 +2449,6 @@
           <w:tab w:val="left" w:pos="9780"/>
         </w:tabs>
         <w:spacing w:line="264" w:lineRule="auto"/>
-        <w:ind w:left="990" w:firstLine="0"/>
-        <w:rPr>
-          <w:szCs w:val="24"/>
-        </w:rPr>
-      </w:pPr>
-      <w:r>
-        <w:rPr>
-          <w:szCs w:val="24"/>
-        </w:rPr>
-        <w:t>Due Date of the First Installment Payment:</w:t>
-      </w:r>
-      <w:r>
-        <w:rPr>
-          <w:szCs w:val="24"/>
-        </w:rPr>
-        <w:tab/>
-        <w:t>6/1/2026</w:t>
-      </w:r>
-    </w:p>
-    <w:p>
-      <w:pPr>
-        <w:pStyle w:val="t1"/>
-        <w:numPr>
-          <w:ilvl w:val="2"/>
-          <w:numId w:val="10"/>
-        </w:numPr>
-        <w:tabs>
-          <w:tab w:val="left" w:pos="720"/>
-          <w:tab w:val="left" w:pos="1620"/>
-          <w:tab w:val="left" w:pos="1980"/>
-          <w:tab w:val="left" w:pos="3240"/>
-          <w:tab w:val="left" w:pos="5040"/>
-          <w:tab w:val="left" w:pos="7200"/>
-          <w:tab w:val="left" w:pos="8280"/>
-          <w:tab w:val="left" w:pos="9780"/>
-        </w:tabs>
-        <w:spacing w:line="264" w:lineRule="auto"/>
-        <w:ind w:left="990" w:firstLine="0"/>
-        <w:rPr>
-          <w:szCs w:val="24"/>
-        </w:rPr>
-      </w:pPr>
-      <w:r>
-        <w:rPr>
-          <w:szCs w:val="24"/>
-        </w:rPr>
-        <w:t>Due Date of the Last Installment Payment:</w:t>
-      </w:r>
-      <w:r>
-        <w:rPr>
-          <w:szCs w:val="24"/>
-        </w:rPr>
-        <w:tab/>
-        <w:t>5/1/2056</w:t>
-      </w:r>
-    </w:p>
-    <w:p>
-      <w:pPr>
-        <w:pStyle w:val="t1"/>
-        <w:numPr>
-          <w:ilvl w:val="2"/>
-          <w:numId w:val="10"/>
-        </w:numPr>
-        <w:tabs>
-          <w:tab w:val="left" w:pos="720"/>
-          <w:tab w:val="left" w:pos="1620"/>
-          <w:tab w:val="left" w:pos="1980"/>
-          <w:tab w:val="left" w:pos="3240"/>
-          <w:tab w:val="left" w:pos="7200"/>
-          <w:tab w:val="left" w:pos="8280"/>
-          <w:tab w:val="left" w:pos="9780"/>
-        </w:tabs>
-        <w:spacing w:line="264" w:lineRule="auto"/>
-        <w:ind w:left="990" w:firstLine="0"/>
-        <w:rPr>
-          <w:szCs w:val="24"/>
-        </w:rPr>
-      </w:pPr>
-      <w:r>
-        <w:rPr>
-          <w:szCs w:val="24"/>
-        </w:rPr>
-        <w:t>Amount of Each Installment Payment includes</w:t>
-      </w:r>
-    </w:p>
-    <w:p>
-      <w:pPr>
-        <w:pStyle w:val="t1"/>
-        <w:numPr>
-          <w:ilvl w:val="3"/>
-          <w:numId w:val="10"/>
-        </w:numPr>
-        <w:tabs>
-          <w:tab w:val="left" w:pos="720"/>
-          <w:tab w:val="left" w:pos="1890"/>
-          <w:tab w:val="left" w:pos="1980"/>
-          <w:tab w:val="left" w:pos="3870"/>
-          <w:tab w:val="left" w:pos="7200"/>
-          <w:tab w:val="left" w:pos="8280"/>
-          <w:tab w:val="left" w:pos="9780"/>
-        </w:tabs>
-        <w:spacing w:line="264" w:lineRule="auto"/>
-        <w:ind w:left="1260" w:firstLine="0"/>
-        <w:rPr>
-          <w:szCs w:val="24"/>
-        </w:rPr>
-      </w:pPr>
-      <w:r>
-        <w:rPr>
-          <w:szCs w:val="24"/>
-        </w:rPr>
-        <w:t>Principal and Interest:</w:t>
-      </w:r>
-      <w:r>
-        <w:rPr>
-          <w:szCs w:val="24"/>
-        </w:rPr>
-        <w:tab/>
-        <w:t>2,277.41</w:t>
-      </w:r>
-    </w:p>
-    <w:p>
-      <w:pPr>
-        <w:pStyle w:val="t1"/>
-        <w:numPr>
-          <w:ilvl w:val="3"/>
-          <w:numId w:val="10"/>
-        </w:numPr>
-        <w:tabs>
-          <w:tab w:val="left" w:pos="720"/>
-          <w:tab w:val="left" w:pos="1890"/>
-          <w:tab w:val="left" w:pos="1980"/>
-          <w:tab w:val="left" w:pos="3870"/>
-          <w:tab w:val="left" w:pos="7200"/>
-          <w:tab w:val="left" w:pos="8280"/>
-          <w:tab w:val="left" w:pos="9780"/>
-        </w:tabs>
-        <w:spacing w:line="264" w:lineRule="auto"/>
-        <w:ind w:left="1260" w:firstLine="0"/>
-        <w:rPr>
-          <w:szCs w:val="24"/>
-        </w:rPr>
-      </w:pPr>
-      <w:r>
-        <w:rPr>
-          <w:szCs w:val="24"/>
-        </w:rPr>
-        <w:t>Property Insurance</w:t>
-      </w:r>
-      <w:r>
-        <w:rPr>
-          <w:szCs w:val="24"/>
-        </w:rPr>
-        <w:t xml:space="preserve"> </w:t>
-      </w:r>
-      <w:r>
-        <w:rPr>
-          <w:szCs w:val="24"/>
-        </w:rPr>
-        <w:t>*</w:t>
-      </w:r>
-      <w:proofErr w:type="gramStart"/>
-      <w:r>
-        <w:rPr>
-          <w:szCs w:val="24"/>
-        </w:rPr>
-        <w:t>:</w:t>
-      </w:r>
-      <w:r>
-        <w:rPr>
-          <w:szCs w:val="24"/>
-        </w:rPr>
-        <w:tab/>
-        <w:t xml:space="preserve"> 51.50</w:t>
-      </w:r>
-      <w:proofErr w:type="gramEnd"/>
-    </w:p>
-    <w:p>
-      <w:pPr>
-        <w:pStyle w:val="t1"/>
-        <w:numPr>
-          <w:ilvl w:val="3"/>
-          <w:numId w:val="10"/>
-        </w:numPr>
-        <w:tabs>
-          <w:tab w:val="left" w:pos="720"/>
-          <w:tab w:val="left" w:pos="1890"/>
-          <w:tab w:val="left" w:pos="1980"/>
-          <w:tab w:val="left" w:pos="3870"/>
-          <w:tab w:val="left" w:pos="7200"/>
-          <w:tab w:val="left" w:pos="8280"/>
-          <w:tab w:val="left" w:pos="9780"/>
-        </w:tabs>
-        <w:spacing w:line="264" w:lineRule="auto"/>
-        <w:ind w:left="1260" w:firstLine="0"/>
-        <w:rPr>
-          <w:szCs w:val="24"/>
-        </w:rPr>
-      </w:pPr>
-      <w:r>
-        <w:rPr>
-          <w:szCs w:val="24"/>
-        </w:rPr>
-        <w:t>Property Tax</w:t>
-      </w:r>
-      <w:r>
-        <w:rPr>
-          <w:szCs w:val="24"/>
-        </w:rPr>
-        <w:t xml:space="preserve"> </w:t>
-      </w:r>
-      <w:r>
-        <w:rPr>
-          <w:szCs w:val="24"/>
-        </w:rPr>
-        <w:t>*</w:t>
-      </w:r>
-      <w:proofErr w:type="gramStart"/>
-      <w:r>
-        <w:rPr>
-          <w:szCs w:val="24"/>
-        </w:rPr>
-        <w:t>:</w:t>
-      </w:r>
-      <w:r>
-        <w:rPr>
-          <w:szCs w:val="24"/>
-        </w:rPr>
-        <w:tab/>
-        <w:t xml:space="preserve"> </w:t>
-      </w:r>
-      <w:r>
-        <w:rPr>
-          <w:szCs w:val="24"/>
-        </w:rPr>
-        <w:tab/>
-      </w:r>
-      <w:proofErr w:type="gramEnd"/>
-      <w:r>
-        <w:rPr>
-          <w:szCs w:val="24"/>
-        </w:rPr>
-        <w:t>145.10</w:t>
-      </w:r>
-    </w:p>
-    <w:p>
-      <w:pPr>
-        <w:pStyle w:val="t1"/>
-        <w:numPr>
-          <w:ilvl w:val="3"/>
-          <w:numId w:val="10"/>
-        </w:numPr>
-        <w:tabs>
-          <w:tab w:val="left" w:pos="720"/>
-          <w:tab w:val="left" w:pos="1890"/>
-          <w:tab w:val="left" w:pos="1980"/>
-          <w:tab w:val="left" w:pos="3870"/>
-          <w:tab w:val="left" w:pos="7200"/>
-          <w:tab w:val="left" w:pos="8280"/>
-          <w:tab w:val="left" w:pos="9780"/>
-        </w:tabs>
-        <w:spacing w:line="264" w:lineRule="auto"/>
-        <w:ind w:left="1260" w:firstLine="0"/>
-        <w:rPr>
-          <w:szCs w:val="24"/>
-        </w:rPr>
-      </w:pPr>
-      <w:r>
-        <w:rPr>
-          <w:szCs w:val="24"/>
-        </w:rPr>
-        <w:t>Total Monthly Payment:</w:t>
-      </w:r>
-      <w:r>
-        <w:rPr>
-          <w:szCs w:val="24"/>
-        </w:rPr>
-        <w:tab/>
-        <w:t>2,474.01</w:t>
-      </w:r>
-    </w:p>
-    <w:p>
-      <w:pPr>
-        <w:pStyle w:val="t1"/>
-        <w:numPr>
-          <w:ilvl w:val="1"/>
-          <w:numId w:val="10"/>
-        </w:numPr>
-        <w:tabs>
-          <w:tab w:val="left" w:pos="720"/>
-          <w:tab w:val="left" w:pos="3240"/>
-          <w:tab w:val="left" w:pos="7200"/>
-          <w:tab w:val="left" w:pos="8280"/>
-          <w:tab w:val="left" w:pos="9780"/>
-        </w:tabs>
-        <w:spacing w:line="264" w:lineRule="auto"/>
-        <w:ind w:left="630"/>
-        <w:rPr>
-          <w:szCs w:val="24"/>
-        </w:rPr>
-      </w:pPr>
-      <w:r>
-        <w:rPr>
-          <w:szCs w:val="24"/>
-        </w:rPr>
-        <w:t xml:space="preserve">(*) </w:t>
-      </w:r>
-      <w:r>
-        <w:rPr>
-          <w:szCs w:val="24"/>
-        </w:rPr>
-        <w:t>The property Insurance and Property Tax values are correct for the contract year only and will adjust annually.</w:t>
-      </w:r>
-    </w:p>
-    <w:p>
-      <w:pPr>
-        <w:pStyle w:val="t1"/>
-        <w:tabs>
-          <w:tab w:val="left" w:pos="720"/>
-          <w:tab w:val="left" w:pos="1890"/>
-          <w:tab w:val="left" w:pos="1980"/>
-          <w:tab w:val="left" w:pos="3870"/>
-          <w:tab w:val="left" w:pos="7200"/>
-          <w:tab w:val="left" w:pos="8280"/>
-          <w:tab w:val="left" w:pos="9780"/>
-        </w:tabs>
-        <w:spacing w:line="264" w:lineRule="auto"/>
-        <w:ind w:left="1260"/>
-        <w:rPr>
-          <w:szCs w:val="24"/>
-        </w:rPr>
-      </w:pPr>
-    </w:p>
-    <w:p>
-      <w:pPr>
-        <w:pStyle w:val="t1"/>
-        <w:numPr>
-          <w:ilvl w:val="1"/>
-          <w:numId w:val="10"/>
-        </w:numPr>
-        <w:tabs>
-          <w:tab w:val="left" w:pos="720"/>
-          <w:tab w:val="left" w:pos="3240"/>
-          <w:tab w:val="left" w:pos="7200"/>
-          <w:tab w:val="left" w:pos="8280"/>
-          <w:tab w:val="left" w:pos="9780"/>
-        </w:tabs>
-        <w:spacing w:line="264" w:lineRule="auto"/>
-        <w:ind w:left="630"/>
-        <w:rPr>
-          <w:szCs w:val="24"/>
-        </w:rPr>
-      </w:pPr>
-      <w:r>
-        <w:rPr>
-          <w:szCs w:val="24"/>
-        </w:rPr>
-        <w:t>Total Number of Installment Payments:</w:t>
-      </w:r>
-      <w:r>
-        <w:rPr>
-          <w:szCs w:val="24"/>
-        </w:rPr>
-        <w:tab/>
-        <w:t>360</w:t>
-      </w:r>
-    </w:p>
-    <w:p>
-      <w:pPr>
-        <w:pStyle w:val="ListParagraph"/>
-      </w:pPr>
-    </w:p>
-    <w:p>
-      <w:pPr>
-        <w:pStyle w:val="t1"/>
-        <w:numPr>
-          <w:ilvl w:val="1"/>
-          <w:numId w:val="10"/>
-        </w:numPr>
-        <w:tabs>
-          <w:tab w:val="left" w:pos="720"/>
-          <w:tab w:val="left" w:pos="3240"/>
-          <w:tab w:val="left" w:pos="7200"/>
-          <w:tab w:val="left" w:pos="8280"/>
-          <w:tab w:val="left" w:pos="9780"/>
-        </w:tabs>
-        <w:spacing w:line="264" w:lineRule="auto"/>
-        <w:ind w:left="630"/>
-        <w:rPr>
-          <w:szCs w:val="24"/>
-        </w:rPr>
-      </w:pPr>
-      <w:r>
-        <w:t>ACH DRAFT PAYMENTS: Purchaser shall make each monthly payment by automatic ACH draft. Seller shall set up the ACH draft using the bank account and routing information provided by Purchaser on the signature page.</w:t>
-      </w:r>
-    </w:p>
-    <w:p>
-      <w:pPr>
-        <w:pStyle w:val="t1"/>
-        <w:tabs>
-          <w:tab w:val="left" w:pos="720"/>
-          <w:tab w:val="left" w:pos="1620"/>
-          <w:tab w:val="left" w:pos="1980"/>
-          <w:tab w:val="left" w:pos="3240"/>
-          <w:tab w:val="left" w:pos="5040"/>
-          <w:tab w:val="left" w:pos="7200"/>
-          <w:tab w:val="left" w:pos="8280"/>
-          <w:tab w:val="left" w:pos="9780"/>
-        </w:tabs>
-        <w:spacing w:line="264" w:lineRule="auto"/>
         <w:ind w:left="990"/>
         <w:rPr>
           <w:szCs w:val="24"/>
@@ -2879,11 +2557,48 @@
     </w:p>
     <w:p>
       <w:pPr>
-        <w:jc w:val="both"/>
-        <w:rPr>
-          <w:szCs w:val="28"/>
-        </w:rPr>
-      </w:pPr>
+        <w:jc w:val="center"/>
+        <w:rPr>
+          <w:b/>
+          <w:bCs/>
+          <w:szCs w:val="28"/>
+        </w:rPr>
+      </w:pPr>
+      <w:r>
+        <w:rPr>
+          <w:b/>
+          <w:bCs/>
+        </w:rPr>
+        <w:t>1st mortgage to Shellpoint of 122,713.02</w:t>
+        <w:br/>
+        <w:t>Deferred Balance of 54,532.00</w:t>
+        <w:br/>
+        <w:t>A lien of 100,000.00</w:t>
+      </w:r>
+      <w:r>
+        <w:rPr>
+          <w:b/>
+          <w:bCs/>
+        </w:rPr>
+      </w:r>
+      <w:r>
+        <w:rPr>
+          <w:b/>
+          <w:bCs/>
+        </w:rPr>
+      </w:r>
+      <w:r>
+        <w:rPr>
+          <w:b/>
+          <w:bCs/>
+        </w:rPr>
+      </w:r>
+      <w:r>
+        <w:rPr>
+          <w:b/>
+          <w:bCs/>
+        </w:rPr>
+      </w:r>
     </w:p>
     <w:p>
       <w:pPr>
@@ -2917,28 +2632,14 @@
         <w:rPr>
           <w:szCs w:val="24"/>
         </w:rPr>
-        <w:t xml:space="preserve">A PURCHASER’S RIGHTS UNDER A CONTRACT FOR DEED SHALL NOT BE FORFEITED EXCEPT AS PROVIDED IN N.C. GEN. STAT. CHAPTER 47H. A CONTRACT FOR DEED CANNOT BE FORFEITED UNLESS A BREACH HAS OCCURRED IN ONE OR MORE OF </w:t>
-      </w:r>
-      <w:proofErr w:type="gramStart"/>
-      <w:r>
-        <w:rPr>
-          <w:szCs w:val="24"/>
-        </w:rPr>
-        <w:t>THE PURCHASER’S</w:t>
-      </w:r>
-      <w:proofErr w:type="gramEnd"/>
-      <w:r>
-        <w:rPr>
-          <w:szCs w:val="24"/>
-        </w:rPr>
-        <w:t xml:space="preserve"> EXPRESS OBLIGATIONS UNDER THE CONTRACT AND THE CONTRACT PROVIDES THAT AS A RESULT OF SUCH BREACH THE SELLER IS ENTITLED TO FORFEIT THE CONTRACT. EXAMPLES OF BREACH OF CONTRACT INCLUDE LACK OF PAYMENT EXTENDING BEYOND 15 DAYS OF DUE DATE, PROHIBITED USE OF PROPERTY, FRAUDULENT IDENTIFICATION, AND FRAUDULENT PAYMENTS. </w:t>
+        <w:t xml:space="preserve">A PURCHASER’S RIGHTS UNDER A CONTRACT FOR DEED SHALL NOT BE FORFEITED EXCEPT AS PROVIDED IN N.C. GEN. STAT. CHAPTER 47H. A CONTRACT FOR DEED CANNOT BE FORFEITED UNLESS A BREACH HAS OCCURRED IN ONE OR MORE OF THE PURCHASER’S EXPRESS OBLIGATIONS UNDER THE CONTRACT AND THE CONTRACT PROVIDES THAT AS A RESULT OF SUCH BREACH THE SELLER IS ENTITLED TO FORFEIT THE CONTRACT. EXAMPLES OF BREACH OF CONTRACT INCLUDE LACK OF PAYMENT EXTENDING BEYOND 15 DAYS OF DUE DATE, PROHIBITED USE OF </w:t>
       </w:r>
       <w:r>
         <w:rPr>
           <w:szCs w:val="24"/>
         </w:rPr>
         <w:lastRenderedPageBreak/>
-        <w:t>FURTHERMORE, THE PURCHASER’S RIGHTS SHALL NOT BE FORFEITED UNTIL THE PURCHASER HAS BEEN NOTIFIED OF THE INTENT TO FORFEIT IN ACCORDANCE WITH N.C. GEN. STAT. 47H-4 AND BEEN GIVEN A RIGHT TO CURE THE DEFAULT AND HAS FAILED TO DO SO WITHIN THE TIME PERIOD ALLOWED. A TIMELY TENDER OF CURE SHALL REINSTATE THE CONTRACT FOR DEED.</w:t>
+        <w:t>PROPERTY, FRAUDULENT IDENTIFICATION, AND FRAUDULENT PAYMENTS. FURTHERMORE, THE PURCHASER’S RIGHTS SHALL NOT BE FORFEITED UNTIL THE PURCHASER HAS BEEN NOTIFIED OF THE INTENT TO FORFEIT IN ACCORDANCE WITH N.C. GEN. STAT. 47H-4 AND BEEN GIVEN A RIGHT TO CURE THE DEFAULT AND HAS FAILED TO DO SO WITHIN THE TIME PERIOD ALLOWED. A TIMELY TENDER OF CURE SHALL REINSTATE THE CONTRACT FOR DEED.</w:t>
       </w:r>
     </w:p>
     <w:p>
@@ -2983,21 +2684,7 @@
         <w:rPr>
           <w:szCs w:val="24"/>
         </w:rPr>
-        <w:t xml:space="preserve">Any unauthorized or unpermitted construction, improvements, excavation (to include clearing, logging, and planting), or otherwise altering the property from its original condition at the time this contract is executed is prohibited.  Authorization may be given by the Seller for certain improvements if Purchaser </w:t>
-      </w:r>
-      <w:proofErr w:type="gramStart"/>
-      <w:r>
-        <w:rPr>
-          <w:szCs w:val="24"/>
-        </w:rPr>
-        <w:t>submits an application</w:t>
-      </w:r>
-      <w:proofErr w:type="gramEnd"/>
-      <w:r>
-        <w:rPr>
-          <w:szCs w:val="24"/>
-        </w:rPr>
-        <w:t xml:space="preserve"> in writing to make changes and receives authorization in writing from Seller.  Authorization will be withheld or granted solely at the discretion of the Seller. Additionally, any use not permitted by local, state, and federal laws and ordinances is prohibited. </w:t>
+        <w:t xml:space="preserve">Any unauthorized or unpermitted construction, improvements, excavation (to include clearing, logging, and planting), or otherwise altering the property from its original condition at the time this contract is executed is prohibited.  Authorization may be given by the Seller for certain improvements if Purchaser submits an application in writing to make changes and receives authorization in writing from Seller.  Authorization will be withheld or granted solely at the discretion of the Seller. Additionally, any use not permitted by local, state, and federal laws and ordinances is prohibited. </w:t>
       </w:r>
     </w:p>
     <w:p>
@@ -3032,21 +2719,7 @@
         <w:rPr>
           <w:szCs w:val="24"/>
         </w:rPr>
-        <w:t xml:space="preserve"> Purchaser may prepay some or </w:t>
-      </w:r>
-      <w:proofErr w:type="gramStart"/>
-      <w:r>
-        <w:rPr>
-          <w:szCs w:val="24"/>
-        </w:rPr>
-        <w:t>all of</w:t>
-      </w:r>
-      <w:proofErr w:type="gramEnd"/>
-      <w:r>
-        <w:rPr>
-          <w:szCs w:val="24"/>
-        </w:rPr>
-        <w:t xml:space="preserve"> the remaining Balance Owed on this contract at any time.</w:t>
+        <w:t xml:space="preserve"> Purchaser may prepay some or all of the remaining Balance Owed on this contract at any time.</w:t>
       </w:r>
     </w:p>
     <w:p>
@@ -3135,19 +2808,7 @@
         <w:rPr>
           <w:szCs w:val="24"/>
         </w:rPr>
-        <w:t xml:space="preserve">for payment to Seller of those escrow items listed in paragraph 7. </w:t>
-      </w:r>
-      <w:r>
-        <w:rPr>
-          <w:szCs w:val="24"/>
-        </w:rPr>
-        <w:t xml:space="preserve">Purchaser </w:t>
-      </w:r>
-      <w:r>
-        <w:rPr>
-          <w:szCs w:val="24"/>
-        </w:rPr>
-        <w:t xml:space="preserve">shall be responsible for all </w:t>
+        <w:t xml:space="preserve">for payment to Seller of those escrow items listed in paragraph 7. Purchaser shall be responsible for all </w:t>
       </w:r>
       <w:r>
         <w:rPr>
@@ -3217,13 +2878,7 @@
         <w:rPr>
           <w:szCs w:val="28"/>
         </w:rPr>
-        <w:t>in its PRESENT AS IS CONDITION except as otherwise specified herein. Seller does hereby certify and represent that Seller has legal authority and capacity to convey the property with all improvements. Seller further certifies and represents that Seller knows of no latent defects to the property and knows of no facts materially affecting the value of the property except the following: Description of problems</w:t>
-      </w:r>
-      <w:r>
-        <w:rPr>
-          <w:szCs w:val="28"/>
-        </w:rPr>
-        <w:t xml:space="preserve">: </w:t>
+        <w:t xml:space="preserve">in its PRESENT AS IS CONDITION except as otherwise specified herein. Seller does hereby certify and represent that Seller has legal authority and capacity to convey the property with all improvements. Seller further certifies and represents that Seller knows of no latent defects to the property and knows of no facts materially affecting the value of the property except the following: Description of problems: </w:t>
       </w:r>
       <w:r>
         <w:rPr>
@@ -3441,21 +3096,7 @@
         <w:rPr>
           <w:szCs w:val="28"/>
         </w:rPr>
-        <w:t xml:space="preserve"> has </w:t>
-      </w:r>
-      <w:proofErr w:type="gramStart"/>
-      <w:r>
-        <w:rPr>
-          <w:szCs w:val="28"/>
-        </w:rPr>
-        <w:t>[  ]</w:t>
-      </w:r>
-      <w:proofErr w:type="gramEnd"/>
-      <w:r>
-        <w:rPr>
-          <w:szCs w:val="28"/>
-        </w:rPr>
-        <w:t xml:space="preserve"> has not inspected the property and HAS NOT RELIED UPON ANY REPRESENTATIONS MADE BY ANY REAL ESTATE AGENT in describing the property, and Purchaser accepts the property in its PRESENT AS IS CONDITION, except as otherwise specified herein.</w:t>
+        <w:t xml:space="preserve"> has [  ] has not inspected the property and HAS NOT RELIED UPON ANY REPRESENTATIONS MADE BY ANY REAL ESTATE AGENT in describing the property, and Purchaser accepts the property in its PRESENT AS IS CONDITION, except as otherwise specified herein.</w:t>
       </w:r>
     </w:p>
     <w:p>
@@ -3605,25 +3246,7 @@
           <w:bCs/>
           <w:szCs w:val="28"/>
         </w:rPr>
-        <w:t xml:space="preserve">[ </w:t>
-      </w:r>
-      <w:proofErr w:type="gramStart"/>
-      <w:r>
-        <w:rPr>
-          <w:b/>
-          <w:bCs/>
-          <w:szCs w:val="28"/>
-        </w:rPr>
-        <w:t xml:space="preserve">  ]</w:t>
-      </w:r>
-      <w:proofErr w:type="gramEnd"/>
-      <w:r>
-        <w:rPr>
-          <w:b/>
-          <w:bCs/>
-          <w:szCs w:val="28"/>
-        </w:rPr>
-        <w:t xml:space="preserve"> _____________days after date of satisfaction of all conditions in paragraph 19 unless extended by other conditions of this Agreement or this agreement is cancelled by the Purchaser.</w:t>
+        <w:t>[   ] _____________days after date of satisfaction of all conditions in paragraph 19 unless extended by other conditions of this Agreement or this agreement is cancelled by the Purchaser.</w:t>
       </w:r>
       <w:r>
         <w:rPr>
@@ -3709,37 +3332,35 @@
         <w:rPr>
           <w:szCs w:val="28"/>
         </w:rPr>
-        <w:t xml:space="preserve">Additional Terms, Conditions or Addenda (lettered </w:t>
-      </w:r>
-      <w:proofErr w:type="spellStart"/>
-      <w:proofErr w:type="gramStart"/>
-      <w:r>
-        <w:rPr>
-          <w:szCs w:val="28"/>
-        </w:rPr>
-        <w:t>a,b</w:t>
-      </w:r>
-      <w:proofErr w:type="gramEnd"/>
-      <w:r>
-        <w:rPr>
-          <w:szCs w:val="28"/>
-        </w:rPr>
-        <w:t>,</w:t>
-      </w:r>
-      <w:proofErr w:type="gramStart"/>
-      <w:r>
-        <w:rPr>
-          <w:szCs w:val="28"/>
-        </w:rPr>
-        <w:t>c,d</w:t>
-      </w:r>
-      <w:proofErr w:type="spellEnd"/>
-      <w:proofErr w:type="gramEnd"/>
-      <w:r>
-        <w:rPr>
-          <w:szCs w:val="28"/>
-        </w:rPr>
-        <w:t>, etc.)</w:t>
+        <w:t>Additional Terms, Conditions or Addenda (lettered a,b,c,d, etc.)</w:t>
+      </w:r>
+    </w:p>
+    <w:p>
+      <w:r>
+        <w:rPr>
+          <w:b/>
+          <w:color w:val="0000FF"/>
+        </w:rPr>
+        <w:t>ATTORNEY REVIEW NOTE: Please review the attorney-change contingency language, including Seller's option to proceed under the previously signed Contract if material attorney-required changes cause Purchaser not to proceed, and confirm whether the due diligence/earnest money return language is clear and enforceable.</w:t>
+      </w:r>
+    </w:p>
+    <w:p>
+      <w:pPr>
+        <w:spacing w:line="264" w:lineRule="auto"/>
+        <w:rPr>
+          <w:b/>
+        </w:rPr>
+      </w:pPr>
+      <w:r>
+        <w:rPr>
+          <w:bCs/>
+        </w:rPr>
+        <w:t>This Contract is signed subject to any changes Seller's attorney may make or require. The parties shall sign the Contract again at closing, or execute any required amendment, with any such attorney-required alterations incorporated. If such changes are material and Purchaser does not agree to proceed, Seller may elect to proceed under the previously signed Contract. If Seller does not so elect, Purchaser's due diligence funds shall be returned to Purchaser.</w:t>
+      </w:r>
+      <w:r>
+        <w:rPr>
+          <w:b/>
+        </w:rPr>
       </w:r>
     </w:p>
     <w:p>
@@ -3750,14 +3371,14 @@
         </w:numPr>
         <w:spacing w:line="264" w:lineRule="auto"/>
         <w:rPr>
-          <w:b/>
+          <w:bCs/>
           <w:sz w:val="22"/>
           <w:szCs w:val="22"/>
         </w:rPr>
       </w:pPr>
       <w:r>
         <w:rPr>
-          <w:b/>
+          <w:bCs/>
           <w:sz w:val="22"/>
           <w:szCs w:val="22"/>
         </w:rPr>
@@ -3772,14 +3393,14 @@
         </w:numPr>
         <w:spacing w:line="264" w:lineRule="auto"/>
         <w:rPr>
-          <w:b/>
+          <w:bCs/>
           <w:sz w:val="22"/>
           <w:szCs w:val="22"/>
         </w:rPr>
       </w:pPr>
       <w:r>
         <w:rPr>
-          <w:b/>
+          <w:bCs/>
           <w:sz w:val="22"/>
           <w:szCs w:val="22"/>
         </w:rPr>
@@ -3794,14 +3415,14 @@
         </w:numPr>
         <w:spacing w:line="264" w:lineRule="auto"/>
         <w:rPr>
-          <w:b/>
+          <w:bCs/>
           <w:sz w:val="22"/>
           <w:szCs w:val="22"/>
         </w:rPr>
       </w:pPr>
       <w:r>
         <w:rPr>
-          <w:b/>
+          <w:bCs/>
           <w:sz w:val="22"/>
           <w:szCs w:val="22"/>
         </w:rPr>
@@ -3816,14 +3437,14 @@
         </w:numPr>
         <w:spacing w:line="264" w:lineRule="auto"/>
         <w:rPr>
-          <w:b/>
+          <w:bCs/>
           <w:sz w:val="22"/>
           <w:szCs w:val="22"/>
         </w:rPr>
       </w:pPr>
       <w:r>
         <w:rPr>
-          <w:b/>
+          <w:bCs/>
           <w:sz w:val="22"/>
           <w:szCs w:val="22"/>
         </w:rPr>
@@ -3838,14 +3459,14 @@
         </w:numPr>
         <w:spacing w:line="264" w:lineRule="auto"/>
         <w:rPr>
-          <w:b/>
+          <w:bCs/>
           <w:sz w:val="22"/>
           <w:szCs w:val="22"/>
         </w:rPr>
       </w:pPr>
       <w:r>
         <w:rPr>
-          <w:b/>
+          <w:bCs/>
           <w:sz w:val="22"/>
           <w:szCs w:val="22"/>
         </w:rPr>
@@ -3885,7 +3506,14 @@
         <w:rPr>
           <w:szCs w:val="28"/>
         </w:rPr>
-        <w:t xml:space="preserve">Personal Property: included in the purchase price are all fixed equipment including ceiling fans, drapery hardware, attached lighting fixtures, mailbox, fence, plants and shrubbery as now installed on the property. </w:t>
+        <w:t xml:space="preserve">Personal Property: included in the purchase price are all fixed equipment including ceiling </w:t>
+      </w:r>
+      <w:r>
+        <w:rPr>
+          <w:szCs w:val="28"/>
+        </w:rPr>
+        <w:lastRenderedPageBreak/>
+        <w:t xml:space="preserve">fans, drapery hardware, attached lighting fixtures, mailbox, fence, plants and shrubbery as now installed on the property. </w:t>
       </w:r>
     </w:p>
     <w:p>
@@ -3972,28 +3600,13 @@
           <w:szCs w:val="28"/>
           <w:u w:val="single"/>
         </w:rPr>
-        <w:t xml:space="preserve">     </w:t>
-      </w:r>
-      <w:proofErr w:type="gramStart"/>
-      <w:r>
-        <w:rPr>
-          <w:szCs w:val="28"/>
-          <w:u w:val="single"/>
-        </w:rPr>
-        <w:t xml:space="preserve">  </w:t>
-      </w:r>
-      <w:r>
-        <w:rPr>
-          <w:szCs w:val="28"/>
-        </w:rPr>
-        <w:t>.</w:t>
-      </w:r>
-      <w:proofErr w:type="gramEnd"/>
-      <w:r>
-        <w:rPr>
-          <w:szCs w:val="28"/>
-        </w:rPr>
-        <w:t xml:space="preserve"> </w:t>
+        <w:t xml:space="preserve">       </w:t>
+      </w:r>
+      <w:r>
+        <w:rPr>
+          <w:szCs w:val="28"/>
+        </w:rPr>
+        <w:t xml:space="preserve">. </w:t>
       </w:r>
     </w:p>
     <w:p>
@@ -4101,21 +3714,7 @@
           <w:u w:val="single"/>
         </w:rPr>
         <w:tab/>
-      </w:r>
-      <w:r>
-        <w:rPr>
-          <w:szCs w:val="28"/>
-          <w:u w:val="single"/>
-        </w:rPr>
-        <w:t xml:space="preserve">     </w:t>
-      </w:r>
-      <w:proofErr w:type="gramStart"/>
-      <w:r>
-        <w:rPr>
-          <w:szCs w:val="28"/>
-          <w:u w:val="single"/>
-        </w:rPr>
-        <w:t xml:space="preserve">  </w:t>
+        <w:t xml:space="preserve">       </w:t>
       </w:r>
       <w:r>
         <w:rPr>
@@ -4123,7 +3722,6 @@
         </w:rPr>
         <w:t>.</w:t>
       </w:r>
-      <w:proofErr w:type="gramEnd"/>
     </w:p>
     <w:p>
       <w:pPr>
@@ -4688,27 +4286,16 @@
         </w:rPr>
       </w:pPr>
       <w:r>
-        <w:t>STATE</w:t>
-      </w:r>
-      <w:proofErr w:type="gramStart"/>
-      <w:r>
-        <w:t xml:space="preserve">:   </w:t>
-      </w:r>
-      <w:r>
-        <w:tab/>
-      </w:r>
-      <w:r>
-        <w:rPr>
-          <w:u w:val="single"/>
-        </w:rPr>
-        <w:t>North</w:t>
-      </w:r>
-      <w:proofErr w:type="gramEnd"/>
-      <w:r>
-        <w:rPr>
-          <w:u w:val="single"/>
-        </w:rPr>
-        <w:t xml:space="preserve"> Carolina</w:t>
+        <w:t xml:space="preserve">STATE:   </w:t>
+      </w:r>
+      <w:r>
+        <w:tab/>
+      </w:r>
+      <w:r>
+        <w:rPr>
+          <w:u w:val="single"/>
+        </w:rPr>
+        <w:t>North Carolina</w:t>
       </w:r>
     </w:p>
     <w:p>
@@ -4718,13 +4305,8 @@
         </w:tabs>
       </w:pPr>
       <w:r>
-        <w:t>COUNTY</w:t>
-      </w:r>
-      <w:proofErr w:type="gramStart"/>
-      <w:r>
-        <w:t>:  Wake</w:t>
-      </w:r>
-      <w:proofErr w:type="gramEnd"/>
+        <w:t>COUNTY:  Wake</w:t>
+      </w:r>
     </w:p>
     <w:p>
       <w:pPr>
@@ -4734,13 +4316,11 @@
         <w:textAlignment w:val="baseline"/>
         <w:rPr>
           <w:rStyle w:val="normaltextrun"/>
-          <w:color w:val="000000"/>
         </w:rPr>
       </w:pPr>
       <w:r>
         <w:rPr>
           <w:rStyle w:val="normaltextrun"/>
-          <w:color w:val="000000"/>
         </w:rPr>
         <w:t xml:space="preserve">I, </w:t>
       </w:r>
@@ -4748,34 +4328,46 @@
         <w:rPr>
           <w:u w:val="single"/>
         </w:rPr>
-        <w:tab/>
-      </w:r>
-      <w:r>
-        <w:rPr>
-          <w:u w:val="single"/>
-        </w:rPr>
-        <w:tab/>
-      </w:r>
-      <w:r>
-        <w:rPr>
-          <w:u w:val="single"/>
-        </w:rPr>
-        <w:tab/>
-      </w:r>
-      <w:r>
-        <w:rPr>
-          <w:u w:val="single"/>
-        </w:rPr>
-        <w:tab/>
-      </w:r>
-      <w:r>
-        <w:rPr>
-          <w:u w:val="single"/>
-        </w:rPr>
-        <w:tab/>
-      </w:r>
-      <w:r>
-        <w:t>, a Notary Public of the County and State aforesaid, do hereby certify that Ever Cardoza and Maria Sarmjento personally appeared before me this day and acknowledged the execution of the foregoing instrument.  Witness my hand and notarial seal,</w:t>
+      </w:r>
+      <w:r>
+        <w:rPr>
+          <w:u w:val="single"/>
+        </w:rPr>
+      </w:r>
+      <w:r>
+        <w:rPr>
+          <w:u w:val="single"/>
+        </w:rPr>
+      </w:r>
+      <w:r>
+        <w:rPr>
+          <w:u w:val="single"/>
+        </w:rPr>
+      </w:r>
+      <w:r>
+        <w:rPr>
+          <w:u w:val="single"/>
+        </w:rPr>
+      </w:r>
+      <w:r/>
+      <w:r>
+        <w:rPr>
+          <w:u w:val="single"/>
+        </w:rPr>
+        <w:tab/>
+        <w:tab/>
+        <w:tab/>
+        <w:tab/>
+        <w:tab/>
+      </w:r>
+      <w:r>
+        <w:t xml:space="preserve">, a Notary Public of the County and State aforesaid, do hereby certify that </w:t>
+      </w:r>
+      <w:r>
+        <w:t>Ever Cardoza and Maria Sarmjento</w:t>
+      </w:r>
+      <w:r>
+        <w:t xml:space="preserve"> personally appeared before me this day and acknowledged the execution of the foregoing instrument.  Witness my hand and notarial seal,</w:t>
       </w:r>
     </w:p>
     <w:p>
@@ -4786,20 +4378,17 @@
         <w:textAlignment w:val="baseline"/>
         <w:rPr>
           <w:rFonts w:ascii="Segoe UI" w:hAnsi="Segoe UI" w:cs="Segoe UI"/>
-          <w:color w:val="000000"/>
         </w:rPr>
       </w:pPr>
       <w:r>
         <w:rPr>
           <w:rStyle w:val="normaltextrun"/>
-          <w:color w:val="000000"/>
         </w:rPr>
         <w:t>this the ____day of _________________, 2026.  </w:t>
       </w:r>
       <w:r>
         <w:rPr>
           <w:rStyle w:val="normaltextrun"/>
-          <w:color w:val="000000"/>
         </w:rPr>
         <w:tab/>
         <w:t>Notary Signature</w:t>
@@ -4807,49 +4396,42 @@
       <w:r>
         <w:rPr>
           <w:rStyle w:val="normaltextrun"/>
-          <w:color w:val="000000"/>
         </w:rPr>
         <w:tab/>
       </w:r>
       <w:r>
         <w:rPr>
           <w:rStyle w:val="normaltextrun"/>
-          <w:color w:val="000000"/>
         </w:rPr>
         <w:tab/>
       </w:r>
       <w:r>
         <w:rPr>
           <w:rStyle w:val="normaltextrun"/>
-          <w:color w:val="000000"/>
         </w:rPr>
         <w:tab/>
       </w:r>
       <w:r>
         <w:rPr>
           <w:rStyle w:val="normaltextrun"/>
-          <w:color w:val="000000"/>
         </w:rPr>
         <w:tab/>
       </w:r>
       <w:r>
         <w:rPr>
           <w:rStyle w:val="normaltextrun"/>
-          <w:color w:val="000000"/>
         </w:rPr>
         <w:tab/>
       </w:r>
       <w:r>
         <w:rPr>
           <w:rStyle w:val="normaltextrun"/>
-          <w:color w:val="000000"/>
         </w:rPr>
         <w:tab/>
       </w:r>
       <w:r>
         <w:rPr>
           <w:rStyle w:val="normaltextrun"/>
-          <w:color w:val="000000"/>
         </w:rPr>
         <w:tab/>
         <w:t xml:space="preserve"> </w:t>
@@ -4863,27 +4445,23 @@
         <w:textAlignment w:val="baseline"/>
         <w:rPr>
           <w:rFonts w:ascii="Segoe UI" w:hAnsi="Segoe UI" w:cs="Segoe UI"/>
-          <w:color w:val="000000"/>
         </w:rPr>
       </w:pPr>
       <w:r>
         <w:rPr>
           <w:rStyle w:val="normaltextrun"/>
-          <w:color w:val="000000"/>
         </w:rPr>
         <w:t>            </w:t>
       </w:r>
       <w:r>
         <w:rPr>
           <w:rStyle w:val="eop"/>
-          <w:color w:val="000000"/>
         </w:rPr>
         <w:t> </w:t>
       </w:r>
       <w:r>
         <w:rPr>
           <w:rStyle w:val="eop"/>
-          <w:color w:val="000000"/>
         </w:rPr>
         <w:tab/>
       </w:r>
@@ -4901,58 +4479,50 @@
         <w:textAlignment w:val="baseline"/>
         <w:rPr>
           <w:rStyle w:val="normaltextrun"/>
-          <w:color w:val="000000"/>
           <w:u w:val="single"/>
         </w:rPr>
       </w:pPr>
       <w:r>
         <w:rPr>
           <w:rStyle w:val="normaltextrun"/>
-          <w:color w:val="000000"/>
-        </w:rPr>
-        <w:t xml:space="preserve">Notary </w:t>
-      </w:r>
-      <w:proofErr w:type="gramStart"/>
+        </w:rPr>
+        <w:t>Notary Public </w:t>
+      </w:r>
+      <w:r>
+        <w:rPr>
+          <w:rStyle w:val="eop"/>
+        </w:rPr>
+        <w:t> </w:t>
+      </w:r>
       <w:r>
         <w:rPr>
           <w:rStyle w:val="normaltextrun"/>
-          <w:color w:val="000000"/>
-        </w:rPr>
-        <w:t>Public </w:t>
-      </w:r>
-      <w:r>
-        <w:rPr>
-          <w:rStyle w:val="eop"/>
-          <w:color w:val="000000"/>
-        </w:rPr>
-        <w:t> </w:t>
+        </w:rPr>
+        <w:t>My Commission expires:</w:t>
       </w:r>
       <w:r>
         <w:rPr>
           <w:rStyle w:val="normaltextrun"/>
-          <w:color w:val="000000"/>
-        </w:rPr>
-        <w:t>My</w:t>
-      </w:r>
-      <w:proofErr w:type="gramEnd"/>
+        </w:rPr>
+        <w:tab/>
+      </w:r>
       <w:r>
         <w:rPr>
           <w:rStyle w:val="normaltextrun"/>
-          <w:color w:val="000000"/>
-        </w:rPr>
-        <w:t xml:space="preserve"> Commission expires:</w:t>
+          <w:u w:val="single"/>
+        </w:rPr>
+        <w:tab/>
       </w:r>
       <w:r>
         <w:rPr>
           <w:rStyle w:val="normaltextrun"/>
-          <w:color w:val="000000"/>
+          <w:u w:val="single"/>
         </w:rPr>
         <w:tab/>
       </w:r>
       <w:r>
         <w:rPr>
           <w:rStyle w:val="normaltextrun"/>
-          <w:color w:val="000000"/>
           <w:u w:val="single"/>
         </w:rPr>
         <w:tab/>
@@ -4960,7 +4530,6 @@
       <w:r>
         <w:rPr>
           <w:rStyle w:val="normaltextrun"/>
-          <w:color w:val="000000"/>
           <w:u w:val="single"/>
         </w:rPr>
         <w:tab/>
@@ -4968,23 +4537,6 @@
       <w:r>
         <w:rPr>
           <w:rStyle w:val="normaltextrun"/>
-          <w:color w:val="000000"/>
-          <w:u w:val="single"/>
-        </w:rPr>
-        <w:tab/>
-      </w:r>
-      <w:r>
-        <w:rPr>
-          <w:rStyle w:val="normaltextrun"/>
-          <w:color w:val="000000"/>
-          <w:u w:val="single"/>
-        </w:rPr>
-        <w:tab/>
-      </w:r>
-      <w:r>
-        <w:rPr>
-          <w:rStyle w:val="normaltextrun"/>
-          <w:color w:val="000000"/>
           <w:u w:val="single"/>
         </w:rPr>
         <w:tab/>
@@ -5003,7 +4555,6 @@
       <w:r>
         <w:rPr>
           <w:rStyle w:val="normaltextrun"/>
-          <w:color w:val="000000"/>
           <w:u w:val="single"/>
         </w:rPr>
         <w:br w:type="page"/>
@@ -5141,91 +4692,69 @@
         <w:spacing w:line="264" w:lineRule="auto"/>
         <w:jc w:val="both"/>
         <w:rPr>
-          <w:color w:val="C00000"/>
-          <w:szCs w:val="28"/>
-          <w:u w:val="single"/>
-        </w:rPr>
-      </w:pPr>
-      <w:r>
-        <w:rPr>
-          <w:szCs w:val="28"/>
-        </w:rPr>
-        <w:t>Seller’s Signature</w:t>
-      </w:r>
-      <w:r>
-        <w:rPr>
-          <w:color w:val="C00000"/>
-          <w:szCs w:val="28"/>
-        </w:rPr>
-        <w:t xml:space="preserve"> </w:t>
-      </w:r>
-      <w:r>
-        <w:rPr>
-          <w:color w:val="C00000"/>
-          <w:szCs w:val="28"/>
-        </w:rPr>
-        <w:tab/>
-      </w:r>
-      <w:r>
-        <w:rPr>
-          <w:color w:val="C00000"/>
-          <w:szCs w:val="28"/>
-        </w:rPr>
-        <w:tab/>
-      </w:r>
-      <w:r>
-        <w:rPr>
-          <w:color w:val="C00000"/>
-          <w:szCs w:val="28"/>
-        </w:rPr>
-        <w:tab/>
-      </w:r>
-      <w:r>
-        <w:rPr>
-          <w:color w:val="C00000"/>
-          <w:szCs w:val="28"/>
-        </w:rPr>
-        <w:tab/>
-      </w:r>
-      <w:r>
-        <w:rPr>
-          <w:color w:val="C00000"/>
-          <w:szCs w:val="28"/>
-        </w:rPr>
-        <w:tab/>
-      </w:r>
-      <w:r>
-        <w:rPr>
-          <w:color w:val="C00000"/>
-          <w:szCs w:val="28"/>
-        </w:rPr>
-        <w:tab/>
-      </w:r>
-      <w:r>
-        <w:rPr>
-          <w:color w:val="C00000"/>
-          <w:szCs w:val="28"/>
-        </w:rPr>
-        <w:tab/>
-      </w:r>
-      <w:r>
-        <w:rPr>
-          <w:color w:val="C00000"/>
-          <w:szCs w:val="28"/>
-        </w:rPr>
-        <w:tab/>
-      </w:r>
-      <w:r>
-        <w:rPr>
-          <w:color w:val="C00000"/>
-          <w:szCs w:val="28"/>
-        </w:rPr>
-        <w:tab/>
-      </w:r>
-      <w:r>
-        <w:rPr>
-          <w:szCs w:val="28"/>
-        </w:rPr>
+          <w:szCs w:val="28"/>
+          <w:u w:val="single"/>
+        </w:rPr>
+      </w:pPr>
+      <w:r>
+        <w:rPr>
+          <w:szCs w:val="28"/>
+        </w:rPr>
+        <w:t xml:space="preserve">Seller’s Signature </w:t>
+      </w:r>
+      <w:r>
+        <w:rPr>
+          <w:szCs w:val="28"/>
+        </w:rPr>
+        <w:tab/>
+      </w:r>
+      <w:r>
+        <w:rPr>
+          <w:szCs w:val="28"/>
+        </w:rPr>
+        <w:tab/>
+      </w:r>
+      <w:r>
+        <w:rPr>
+          <w:szCs w:val="28"/>
+        </w:rPr>
+        <w:tab/>
+      </w:r>
+      <w:r>
+        <w:rPr>
+          <w:szCs w:val="28"/>
+        </w:rPr>
+        <w:tab/>
+      </w:r>
+      <w:r>
+        <w:rPr>
+          <w:szCs w:val="28"/>
+        </w:rPr>
+        <w:tab/>
+      </w:r>
+      <w:r>
+        <w:rPr>
+          <w:szCs w:val="28"/>
+        </w:rPr>
+        <w:tab/>
+      </w:r>
+      <w:r>
+        <w:rPr>
+          <w:szCs w:val="28"/>
+        </w:rPr>
+        <w:tab/>
+      </w:r>
+      <w:r>
+        <w:rPr>
+          <w:szCs w:val="28"/>
+        </w:rPr>
+        <w:tab/>
+      </w:r>
+      <w:r>
+        <w:rPr>
+          <w:szCs w:val="28"/>
+        </w:rPr>
+        <w:tab/>
         <w:t>Date of Offer</w:t>
       </w:r>
     </w:p>
@@ -5248,7 +4777,6 @@
       </w:pPr>
       <w:r>
         <w:rPr>
-          <w:color w:val="C00000"/>
           <w:szCs w:val="28"/>
           <w:u w:val="single"/>
         </w:rPr>
@@ -5268,7 +4796,6 @@
       <w:pPr>
         <w:rPr>
           <w:b/>
-          <w:color w:val="0000FF"/>
         </w:rPr>
       </w:pPr>
     </w:p>
@@ -5300,75 +4827,11 @@
           <w:szCs w:val="28"/>
         </w:rPr>
       </w:pPr>
-      <w:proofErr w:type="gramStart"/>
-      <w:r>
-        <w:rPr>
-          <w:szCs w:val="28"/>
-        </w:rPr>
-        <w:t>[ ]</w:t>
-      </w:r>
-      <w:proofErr w:type="gramEnd"/>
-      <w:r>
-        <w:rPr>
-          <w:szCs w:val="28"/>
-        </w:rPr>
-        <w:t xml:space="preserve"> Agent</w:t>
-      </w:r>
-      <w:proofErr w:type="gramStart"/>
-      <w:r>
-        <w:rPr>
-          <w:szCs w:val="28"/>
-        </w:rPr>
-        <w:t xml:space="preserve">   [</w:t>
-      </w:r>
-      <w:proofErr w:type="gramEnd"/>
-      <w:r>
-        <w:rPr>
-          <w:szCs w:val="28"/>
-        </w:rPr>
-        <w:t xml:space="preserve">X] Seller, by the signature below, acknowledge receipt of $20,790.00 </w:t>
-      </w:r>
-      <w:proofErr w:type="gramStart"/>
-      <w:r>
-        <w:rPr>
-          <w:szCs w:val="28"/>
-        </w:rPr>
-        <w:t>[  ]</w:t>
-      </w:r>
-      <w:proofErr w:type="gramEnd"/>
-      <w:r>
-        <w:rPr>
-          <w:szCs w:val="28"/>
-        </w:rPr>
-        <w:t xml:space="preserve"> Cash</w:t>
-      </w:r>
-      <w:proofErr w:type="gramStart"/>
-      <w:r>
-        <w:rPr>
-          <w:szCs w:val="28"/>
-        </w:rPr>
-        <w:t xml:space="preserve">   [</w:t>
-      </w:r>
-      <w:proofErr w:type="gramEnd"/>
-      <w:r>
-        <w:rPr>
-          <w:szCs w:val="28"/>
-        </w:rPr>
-        <w:t xml:space="preserve"> </w:t>
-      </w:r>
-      <w:proofErr w:type="gramStart"/>
-      <w:r>
-        <w:rPr>
-          <w:szCs w:val="28"/>
-        </w:rPr>
-        <w:t xml:space="preserve">  ]</w:t>
-      </w:r>
-      <w:proofErr w:type="gramEnd"/>
-      <w:r>
-        <w:rPr>
-          <w:szCs w:val="28"/>
-        </w:rPr>
-        <w:t xml:space="preserve"> Check, as binder deposit, which is the amount mentioned in paragraph 1A of this Agreement.</w:t>
+      <w:r>
+        <w:rPr>
+          <w:szCs w:val="28"/>
+        </w:rPr>
+        <w:t>[ ] Agent   [X] Seller, by the signature below, acknowledge receipt of $6,000.00 [  ] Cash   [   ] Check, as earnest money deposit, which is credited toward the total down payment mentioned in paragraph 1A of this Agreement. The remaining down payment balance of $14,790.00 shall be paid at closing.</w:t>
       </w:r>
     </w:p>
     <w:p>
@@ -5547,34 +5010,29 @@
         <w:textAlignment w:val="baseline"/>
         <w:rPr>
           <w:rFonts w:ascii="Segoe UI" w:hAnsi="Segoe UI" w:cs="Segoe UI"/>
-          <w:color w:val="000000"/>
         </w:rPr>
       </w:pPr>
       <w:r>
         <w:rPr>
           <w:rStyle w:val="normaltextrun"/>
-          <w:color w:val="000000"/>
         </w:rPr>
         <w:t xml:space="preserve">Under penalty of perjury, </w:t>
       </w:r>
       <w:r>
         <w:rPr>
           <w:rStyle w:val="normaltextrun"/>
-          <w:color w:val="000000"/>
         </w:rPr>
         <w:t>Seller/</w:t>
       </w:r>
       <w:r>
         <w:rPr>
           <w:rStyle w:val="normaltextrun"/>
-          <w:color w:val="000000"/>
         </w:rPr>
         <w:t>Affiant declares that he/she has examined this Affidavit and that to the best of his/his personal knowledge and belief, the contents of said Affidavit are true and correct. </w:t>
       </w:r>
       <w:r>
         <w:rPr>
           <w:rStyle w:val="eop"/>
-          <w:color w:val="000000"/>
         </w:rPr>
         <w:t> </w:t>
       </w:r>
@@ -5586,20 +5044,17 @@
         <w:textAlignment w:val="baseline"/>
         <w:rPr>
           <w:rFonts w:ascii="Segoe UI" w:hAnsi="Segoe UI" w:cs="Segoe UI"/>
-          <w:color w:val="000000"/>
         </w:rPr>
       </w:pPr>
       <w:r>
         <w:rPr>
           <w:rStyle w:val="normaltextrun"/>
-          <w:color w:val="000000"/>
         </w:rPr>
         <w:t xml:space="preserve">This _____ day of   </w:t>
       </w:r>
       <w:r>
         <w:rPr>
           <w:rStyle w:val="normaltextrun"/>
-          <w:color w:val="000000"/>
           <w:u w:val="single"/>
         </w:rPr>
         <w:tab/>
@@ -5607,7 +5062,6 @@
       <w:r>
         <w:rPr>
           <w:rStyle w:val="normaltextrun"/>
-          <w:color w:val="000000"/>
           <w:u w:val="single"/>
         </w:rPr>
         <w:tab/>
@@ -5615,7 +5069,6 @@
       <w:r>
         <w:rPr>
           <w:rStyle w:val="normaltextrun"/>
-          <w:color w:val="000000"/>
           <w:u w:val="single"/>
         </w:rPr>
         <w:tab/>
@@ -5623,21 +5076,18 @@
       <w:r>
         <w:rPr>
           <w:rStyle w:val="normaltextrun"/>
-          <w:color w:val="000000"/>
         </w:rPr>
         <w:t>,</w:t>
       </w:r>
       <w:r>
         <w:rPr>
           <w:rStyle w:val="normaltextrun"/>
-          <w:color w:val="000000"/>
         </w:rPr>
         <w:t xml:space="preserve"> 2026.</w:t>
       </w:r>
       <w:r>
         <w:rPr>
           <w:rStyle w:val="normaltextrun"/>
-          <w:color w:val="000000"/>
         </w:rPr>
         <w:tab/>
       </w:r>
@@ -5649,34 +5099,29 @@
         <w:textAlignment w:val="baseline"/>
         <w:rPr>
           <w:rFonts w:ascii="Segoe UI" w:hAnsi="Segoe UI" w:cs="Segoe UI"/>
-          <w:color w:val="000000"/>
         </w:rPr>
       </w:pPr>
       <w:r>
         <w:rPr>
           <w:rStyle w:val="normaltextrun"/>
-          <w:color w:val="000000"/>
         </w:rPr>
         <w:t> </w:t>
       </w:r>
       <w:r>
         <w:rPr>
           <w:rStyle w:val="eop"/>
-          <w:color w:val="000000"/>
         </w:rPr>
         <w:t> </w:t>
       </w:r>
       <w:r>
         <w:rPr>
           <w:rStyle w:val="normaltextrun"/>
-          <w:color w:val="000000"/>
         </w:rPr>
         <w:t> </w:t>
       </w:r>
       <w:r>
         <w:rPr>
           <w:rStyle w:val="eop"/>
-          <w:color w:val="000000"/>
         </w:rPr>
         <w:t> </w:t>
       </w:r>
@@ -5688,34 +5133,29 @@
         <w:textAlignment w:val="baseline"/>
         <w:rPr>
           <w:rStyle w:val="normaltextrun"/>
-          <w:color w:val="000000"/>
         </w:rPr>
       </w:pPr>
       <w:r>
         <w:rPr>
           <w:rStyle w:val="normaltextrun"/>
-          <w:color w:val="000000"/>
         </w:rPr>
         <w:t> </w:t>
       </w:r>
       <w:r>
         <w:rPr>
           <w:rStyle w:val="normaltextrun"/>
-          <w:color w:val="000000"/>
         </w:rPr>
         <w:softHyphen/>
       </w:r>
       <w:r>
         <w:rPr>
           <w:rStyle w:val="normaltextrun"/>
-          <w:color w:val="000000"/>
         </w:rPr>
         <w:softHyphen/>
       </w:r>
       <w:r>
         <w:rPr>
           <w:rStyle w:val="normaltextrun"/>
-          <w:color w:val="000000"/>
           <w:u w:val="single"/>
         </w:rPr>
         <w:softHyphen/>
@@ -5723,7 +5163,6 @@
       <w:r>
         <w:rPr>
           <w:rStyle w:val="normaltextrun"/>
-          <w:color w:val="000000"/>
           <w:u w:val="single"/>
         </w:rPr>
         <w:tab/>
@@ -5731,7 +5170,6 @@
       <w:r>
         <w:rPr>
           <w:rStyle w:val="normaltextrun"/>
-          <w:color w:val="000000"/>
           <w:u w:val="single"/>
         </w:rPr>
         <w:tab/>
@@ -5739,7 +5177,6 @@
       <w:r>
         <w:rPr>
           <w:rStyle w:val="normaltextrun"/>
-          <w:color w:val="000000"/>
           <w:u w:val="single"/>
         </w:rPr>
         <w:tab/>
@@ -5747,7 +5184,6 @@
       <w:r>
         <w:rPr>
           <w:rStyle w:val="normaltextrun"/>
-          <w:color w:val="000000"/>
           <w:u w:val="single"/>
         </w:rPr>
         <w:tab/>
@@ -5755,7 +5191,6 @@
       <w:r>
         <w:rPr>
           <w:rStyle w:val="normaltextrun"/>
-          <w:color w:val="000000"/>
           <w:u w:val="single"/>
         </w:rPr>
         <w:tab/>
@@ -5764,14 +5199,12 @@
       <w:r>
         <w:rPr>
           <w:rStyle w:val="normaltextrun"/>
-          <w:color w:val="000000"/>
         </w:rPr>
         <w:t xml:space="preserve"> </w:t>
       </w:r>
       <w:r>
         <w:rPr>
           <w:rStyle w:val="normaltextrun"/>
-          <w:color w:val="000000"/>
         </w:rPr>
         <w:tab/>
         <w:t>(Affiant) </w:t>
@@ -5787,27 +5220,16 @@
         </w:rPr>
       </w:pPr>
       <w:r>
-        <w:t>STATE</w:t>
-      </w:r>
-      <w:proofErr w:type="gramStart"/>
-      <w:r>
-        <w:t xml:space="preserve">:   </w:t>
-      </w:r>
-      <w:r>
-        <w:tab/>
-      </w:r>
-      <w:r>
-        <w:rPr>
-          <w:u w:val="single"/>
-        </w:rPr>
-        <w:t>North</w:t>
-      </w:r>
-      <w:proofErr w:type="gramEnd"/>
-      <w:r>
-        <w:rPr>
-          <w:u w:val="single"/>
-        </w:rPr>
-        <w:t xml:space="preserve"> Carolina</w:t>
+        <w:t xml:space="preserve">STATE:   </w:t>
+      </w:r>
+      <w:r>
+        <w:tab/>
+      </w:r>
+      <w:r>
+        <w:rPr>
+          <w:u w:val="single"/>
+        </w:rPr>
+        <w:t>North Carolina</w:t>
       </w:r>
       <w:r>
         <w:rPr>
@@ -5826,13 +5248,8 @@
         </w:rPr>
       </w:pPr>
       <w:r>
-        <w:t>COUNTY</w:t>
-      </w:r>
-      <w:proofErr w:type="gramStart"/>
-      <w:r>
-        <w:t>:  Wake</w:t>
-      </w:r>
-      <w:proofErr w:type="gramEnd"/>
+        <w:t>COUNTY:  Wake</w:t>
+      </w:r>
     </w:p>
     <w:p>
       <w:pPr>
@@ -5848,13 +5265,11 @@
         <w:textAlignment w:val="baseline"/>
         <w:rPr>
           <w:rFonts w:ascii="Segoe UI" w:hAnsi="Segoe UI" w:cs="Segoe UI"/>
-          <w:color w:val="000000"/>
         </w:rPr>
       </w:pPr>
       <w:r>
         <w:rPr>
           <w:rStyle w:val="eop"/>
-          <w:color w:val="000000"/>
         </w:rPr>
         <w:t> </w:t>
       </w:r>
@@ -5866,13 +5281,11 @@
         <w:textAlignment w:val="baseline"/>
         <w:rPr>
           <w:rStyle w:val="normaltextrun"/>
-          <w:color w:val="000000"/>
         </w:rPr>
       </w:pPr>
       <w:r>
         <w:rPr>
           <w:rStyle w:val="normaltextrun"/>
-          <w:color w:val="000000"/>
         </w:rPr>
         <w:t xml:space="preserve">I, </w:t>
       </w:r>
@@ -5880,34 +5293,40 @@
         <w:rPr>
           <w:u w:val="single"/>
         </w:rPr>
-        <w:tab/>
-      </w:r>
-      <w:r>
-        <w:rPr>
-          <w:u w:val="single"/>
-        </w:rPr>
-        <w:tab/>
-      </w:r>
-      <w:r>
-        <w:rPr>
-          <w:u w:val="single"/>
-        </w:rPr>
-        <w:tab/>
-      </w:r>
-      <w:r>
-        <w:rPr>
-          <w:u w:val="single"/>
-        </w:rPr>
-        <w:tab/>
-      </w:r>
-      <w:r>
-        <w:rPr>
-          <w:u w:val="single"/>
-        </w:rPr>
-        <w:tab/>
-      </w:r>
-      <w:r>
-        <w:t>, a Notary Public of the County and State aforesaid, do hereby certify that </w:t>
+      </w:r>
+      <w:r>
+        <w:rPr>
+          <w:u w:val="single"/>
+        </w:rPr>
+      </w:r>
+      <w:r>
+        <w:rPr>
+          <w:u w:val="single"/>
+        </w:rPr>
+      </w:r>
+      <w:r>
+        <w:rPr>
+          <w:u w:val="single"/>
+        </w:rPr>
+      </w:r>
+      <w:r>
+        <w:rPr>
+          <w:u w:val="single"/>
+        </w:rPr>
+      </w:r>
+      <w:r/>
+      <w:r>
+        <w:rPr>
+          <w:u w:val="single"/>
+        </w:rPr>
+        <w:tab/>
+        <w:tab/>
+        <w:tab/>
+        <w:tab/>
+        <w:tab/>
+      </w:r>
+      <w:r>
+        <w:t xml:space="preserve">, a Notary Public of the County and State aforesaid, do hereby certify that </w:t>
       </w:r>
     </w:p>
     <w:p>
@@ -5917,7 +5336,6 @@
         <w:textAlignment w:val="baseline"/>
         <w:rPr>
           <w:rStyle w:val="normaltextrun"/>
-          <w:color w:val="000000"/>
         </w:rPr>
       </w:pPr>
     </w:p>
@@ -5928,18 +5346,17 @@
         <w:textAlignment w:val="baseline"/>
         <w:rPr>
           <w:noProof/>
-          <w:color w:val="C00000"/>
           <w:u w:val="single"/>
         </w:rPr>
       </w:pPr>
       <w:r>
         <w:rPr>
           <w:noProof/>
-          <w:color w:val="C00000"/>
           <w:u w:val="single"/>
         </w:rPr>
         <w:t>Wes Browning, Manager of Investment Services LLC, Trustee of 320 Rose Pl Real Estate Trust dated March, 5 2025,</w:t>
       </w:r>
+      <w:r/>
       <w:r>
         <w:t xml:space="preserve"> personally appeared before me this day and acknowledged the execution of the foregoing instrument.  Witness my hand and notarial seal,</w:t>
       </w:r>
@@ -5951,7 +5368,6 @@
         <w:textAlignment w:val="baseline"/>
         <w:rPr>
           <w:rStyle w:val="normaltextrun"/>
-          <w:color w:val="000000"/>
         </w:rPr>
       </w:pPr>
     </w:p>
@@ -5962,20 +5378,17 @@
         <w:textAlignment w:val="baseline"/>
         <w:rPr>
           <w:rStyle w:val="eop"/>
-          <w:color w:val="000000"/>
         </w:rPr>
       </w:pPr>
       <w:r>
         <w:rPr>
           <w:rStyle w:val="normaltextrun"/>
-          <w:color w:val="000000"/>
         </w:rPr>
         <w:t>this the ____day of _________________, 2026.  </w:t>
       </w:r>
       <w:r>
         <w:rPr>
           <w:rStyle w:val="normaltextrun"/>
-          <w:color w:val="000000"/>
         </w:rPr>
         <w:tab/>
       </w:r>
@@ -5987,7 +5400,6 @@
         <w:textAlignment w:val="baseline"/>
         <w:rPr>
           <w:rStyle w:val="eop"/>
-          <w:color w:val="000000"/>
         </w:rPr>
       </w:pPr>
     </w:p>
@@ -5998,20 +5410,17 @@
         <w:textAlignment w:val="baseline"/>
         <w:rPr>
           <w:rFonts w:ascii="Segoe UI" w:hAnsi="Segoe UI" w:cs="Segoe UI"/>
-          <w:color w:val="000000"/>
         </w:rPr>
       </w:pPr>
       <w:r>
         <w:rPr>
           <w:rStyle w:val="eop"/>
-          <w:color w:val="000000"/>
         </w:rPr>
         <w:t>Notary Signature</w:t>
       </w:r>
       <w:r>
         <w:rPr>
           <w:rStyle w:val="eop"/>
-          <w:color w:val="000000"/>
           <w:u w:val="single"/>
         </w:rPr>
         <w:tab/>
@@ -6019,7 +5428,6 @@
       <w:r>
         <w:rPr>
           <w:rStyle w:val="eop"/>
-          <w:color w:val="000000"/>
           <w:u w:val="single"/>
         </w:rPr>
         <w:tab/>
@@ -6027,7 +5435,6 @@
       <w:r>
         <w:rPr>
           <w:rStyle w:val="eop"/>
-          <w:color w:val="000000"/>
           <w:u w:val="single"/>
         </w:rPr>
         <w:tab/>
@@ -6035,7 +5442,6 @@
       <w:r>
         <w:rPr>
           <w:rStyle w:val="eop"/>
-          <w:color w:val="000000"/>
           <w:u w:val="single"/>
         </w:rPr>
         <w:tab/>
@@ -6043,7 +5449,6 @@
       <w:r>
         <w:rPr>
           <w:rStyle w:val="eop"/>
-          <w:color w:val="000000"/>
           <w:u w:val="single"/>
         </w:rPr>
         <w:tab/>
@@ -6051,7 +5456,6 @@
       <w:r>
         <w:rPr>
           <w:rStyle w:val="eop"/>
-          <w:color w:val="000000"/>
           <w:u w:val="single"/>
         </w:rPr>
         <w:tab/>
@@ -6059,7 +5463,6 @@
       <w:r>
         <w:rPr>
           <w:rStyle w:val="eop"/>
-          <w:color w:val="000000"/>
           <w:u w:val="single"/>
         </w:rPr>
         <w:tab/>
@@ -6067,7 +5470,6 @@
       <w:r>
         <w:rPr>
           <w:rStyle w:val="eop"/>
-          <w:color w:val="000000"/>
           <w:u w:val="single"/>
         </w:rPr>
         <w:tab/>
@@ -6075,7 +5477,6 @@
       <w:r>
         <w:rPr>
           <w:rStyle w:val="eop"/>
-          <w:color w:val="000000"/>
           <w:u w:val="single"/>
         </w:rPr>
         <w:tab/>
@@ -6083,7 +5484,6 @@
       <w:r>
         <w:rPr>
           <w:rStyle w:val="eop"/>
-          <w:color w:val="000000"/>
           <w:u w:val="single"/>
         </w:rPr>
         <w:tab/>
@@ -6097,27 +5497,23 @@
         <w:textAlignment w:val="baseline"/>
         <w:rPr>
           <w:rFonts w:ascii="Segoe UI" w:hAnsi="Segoe UI" w:cs="Segoe UI"/>
-          <w:color w:val="000000"/>
         </w:rPr>
       </w:pPr>
       <w:r>
         <w:rPr>
           <w:rStyle w:val="normaltextrun"/>
-          <w:color w:val="000000"/>
         </w:rPr>
         <w:t>            </w:t>
       </w:r>
       <w:r>
         <w:rPr>
           <w:rStyle w:val="eop"/>
-          <w:color w:val="000000"/>
         </w:rPr>
         <w:t> </w:t>
       </w:r>
       <w:r>
         <w:rPr>
           <w:rStyle w:val="eop"/>
-          <w:color w:val="000000"/>
         </w:rPr>
         <w:tab/>
       </w:r>
@@ -6134,57 +5530,49 @@
         <w:textAlignment w:val="baseline"/>
         <w:rPr>
           <w:rStyle w:val="normaltextrun"/>
-          <w:color w:val="000000"/>
         </w:rPr>
       </w:pPr>
       <w:r>
         <w:rPr>
           <w:rStyle w:val="normaltextrun"/>
-          <w:color w:val="000000"/>
-        </w:rPr>
-        <w:t xml:space="preserve">Notary </w:t>
-      </w:r>
-      <w:proofErr w:type="gramStart"/>
+        </w:rPr>
+        <w:t>Notary Public </w:t>
+      </w:r>
+      <w:r>
+        <w:rPr>
+          <w:rStyle w:val="eop"/>
+        </w:rPr>
+        <w:t> </w:t>
+      </w:r>
       <w:r>
         <w:rPr>
           <w:rStyle w:val="normaltextrun"/>
-          <w:color w:val="000000"/>
-        </w:rPr>
-        <w:t>Public </w:t>
-      </w:r>
-      <w:r>
-        <w:rPr>
-          <w:rStyle w:val="eop"/>
-          <w:color w:val="000000"/>
-        </w:rPr>
-        <w:t> </w:t>
+        </w:rPr>
+        <w:t>My Commission expires:</w:t>
       </w:r>
       <w:r>
         <w:rPr>
           <w:rStyle w:val="normaltextrun"/>
-          <w:color w:val="000000"/>
-        </w:rPr>
-        <w:t>My</w:t>
-      </w:r>
-      <w:proofErr w:type="gramEnd"/>
+        </w:rPr>
+        <w:tab/>
+      </w:r>
       <w:r>
         <w:rPr>
           <w:rStyle w:val="normaltextrun"/>
-          <w:color w:val="000000"/>
-        </w:rPr>
-        <w:t xml:space="preserve"> Commission expires:</w:t>
+          <w:u w:val="single"/>
+        </w:rPr>
+        <w:tab/>
       </w:r>
       <w:r>
         <w:rPr>
           <w:rStyle w:val="normaltextrun"/>
-          <w:color w:val="000000"/>
+          <w:u w:val="single"/>
         </w:rPr>
         <w:tab/>
       </w:r>
       <w:r>
         <w:rPr>
           <w:rStyle w:val="normaltextrun"/>
-          <w:color w:val="000000"/>
           <w:u w:val="single"/>
         </w:rPr>
         <w:tab/>
@@ -6192,7 +5580,6 @@
       <w:r>
         <w:rPr>
           <w:rStyle w:val="normaltextrun"/>
-          <w:color w:val="000000"/>
           <w:u w:val="single"/>
         </w:rPr>
         <w:tab/>
@@ -6200,23 +5587,6 @@
       <w:r>
         <w:rPr>
           <w:rStyle w:val="normaltextrun"/>
-          <w:color w:val="000000"/>
-          <w:u w:val="single"/>
-        </w:rPr>
-        <w:tab/>
-      </w:r>
-      <w:r>
-        <w:rPr>
-          <w:rStyle w:val="normaltextrun"/>
-          <w:color w:val="000000"/>
-          <w:u w:val="single"/>
-        </w:rPr>
-        <w:tab/>
-      </w:r>
-      <w:r>
-        <w:rPr>
-          <w:rStyle w:val="normaltextrun"/>
-          <w:color w:val="000000"/>
           <w:u w:val="single"/>
         </w:rPr>
         <w:tab/>

</xml_diff>

<commit_message>
Include full seller address in contract
</commit_message>
<xml_diff>
--- a/Project Rooms/Contract for Deed/output/320 Rose - Contract for Deed Agreement - ATTORNEY REVIEW PACKAGE.docx
+++ b/Project Rooms/Contract for Deed/output/320 Rose - Contract for Deed Agreement - ATTORNEY REVIEW PACKAGE.docx
@@ -159,7 +159,7 @@
         <w:rPr>
           <w:szCs w:val="28"/>
         </w:rPr>
-        <w:t>STE 1200, Sheridan</w:t>
+        <w:t>STE 1200, Sheridan, Wyoming 82801</w:t>
       </w:r>
     </w:p>
     <w:p>
@@ -4354,6 +4354,14 @@
         <w:rPr>
           <w:u w:val="single"/>
         </w:rPr>
+      </w:r>
+      <w:r/>
+      <w:r/>
+      <w:r/>
+      <w:r>
+        <w:rPr>
+          <w:u w:val="single"/>
+        </w:rPr>
         <w:tab/>
         <w:tab/>
         <w:tab/>
@@ -5319,6 +5327,12 @@
         <w:rPr>
           <w:u w:val="single"/>
         </w:rPr>
+      </w:r>
+      <w:r/>
+      <w:r>
+        <w:rPr>
+          <w:u w:val="single"/>
+        </w:rPr>
         <w:tab/>
         <w:tab/>
         <w:tab/>
@@ -5356,6 +5370,7 @@
         </w:rPr>
         <w:t>Wes Browning, Manager of Investment Services LLC, Trustee of 320 Rose Pl Real Estate Trust dated March, 5 2025,</w:t>
       </w:r>
+      <w:r/>
       <w:r/>
       <w:r>
         <w:t xml:space="preserve"> personally appeared before me this day and acknowledged the execution of the foregoing instrument.  Witness my hand and notarial seal,</w:t>

</xml_diff>

<commit_message>
Update adverse condition responsibility language
</commit_message>
<xml_diff>
--- a/Project Rooms/Contract for Deed/output/320 Rose - Contract for Deed Agreement - ATTORNEY REVIEW PACKAGE.docx
+++ b/Project Rooms/Contract for Deed/output/320 Rose - Contract for Deed Agreement - ATTORNEY REVIEW PACKAGE.docx
@@ -2158,10 +2158,7 @@
               <w:t>Property Tax</w:t>
             </w:r>
             <w:r>
-              <w:t>-</w:t>
-            </w:r>
-            <w:r>
-              <w:t>paid into escrow</w:t>
+              <w:t>-paid into escrow</w:t>
             </w:r>
             <w:r>
               <w:t xml:space="preserve"> *:</w:t>
@@ -2557,6 +2554,40 @@
     </w:p>
     <w:p>
       <w:pPr>
+        <w:pStyle w:val="t1"/>
+        <w:ind w:left="360"/>
+        <w:rPr>
+          <w:szCs w:val="28"/>
+        </w:rPr>
+      </w:pPr>
+    </w:p>
+    <w:p>
+      <w:pPr>
+        <w:pStyle w:val="t1"/>
+        <w:ind w:left="360"/>
+        <w:rPr>
+          <w:szCs w:val="28"/>
+        </w:rPr>
+      </w:pPr>
+      <w:r>
+        <w:rPr>
+          <w:szCs w:val="28"/>
+        </w:rPr>
+        <w:t>Seller shall remain responsible for the pending orders or adverse conditions listed below. These matters may remain in place during the term of this Contract. To the extent any such matter must be released, satisfied, or otherwise resolved to convey marketable title, Seller shall cause it to be released, satisfied, or otherwise resolved before or at the closing of Purchaser's future sale of the Property, unless resolved earlier or otherwise agreed in writing.</w:t>
+      </w:r>
+      <w:r>
+        <w:rPr>
+          <w:szCs w:val="28"/>
+        </w:rPr>
+      </w:r>
+      <w:r>
+        <w:rPr>
+          <w:szCs w:val="28"/>
+        </w:rPr>
+      </w:r>
+    </w:p>
+    <w:p>
+      <w:pPr>
         <w:jc w:val="center"/>
         <w:rPr>
           <w:b/>
@@ -2587,18 +2618,6 @@
           <w:bCs/>
         </w:rPr>
       </w:r>
-      <w:r>
-        <w:rPr>
-          <w:b/>
-          <w:bCs/>
-        </w:rPr>
-      </w:r>
-      <w:r>
-        <w:rPr>
-          <w:b/>
-          <w:bCs/>
-        </w:rPr>
-      </w:r>
     </w:p>
     <w:p>
       <w:pPr>
@@ -2632,14 +2651,14 @@
         <w:rPr>
           <w:szCs w:val="24"/>
         </w:rPr>
-        <w:t xml:space="preserve">A PURCHASER’S RIGHTS UNDER A CONTRACT FOR DEED SHALL NOT BE FORFEITED EXCEPT AS PROVIDED IN N.C. GEN. STAT. CHAPTER 47H. A CONTRACT FOR DEED CANNOT BE FORFEITED UNLESS A BREACH HAS OCCURRED IN ONE OR MORE OF THE PURCHASER’S EXPRESS OBLIGATIONS UNDER THE CONTRACT AND THE CONTRACT PROVIDES THAT AS A RESULT OF SUCH BREACH THE SELLER IS ENTITLED TO FORFEIT THE CONTRACT. EXAMPLES OF BREACH OF CONTRACT INCLUDE LACK OF PAYMENT EXTENDING BEYOND 15 DAYS OF DUE DATE, PROHIBITED USE OF </w:t>
+        <w:t xml:space="preserve">A PURCHASER’S RIGHTS UNDER A CONTRACT FOR DEED SHALL NOT BE FORFEITED EXCEPT AS PROVIDED IN N.C. GEN. STAT. CHAPTER 47H. A CONTRACT FOR DEED CANNOT BE FORFEITED UNLESS A BREACH HAS OCCURRED IN ONE OR MORE OF THE PURCHASER’S EXPRESS OBLIGATIONS UNDER THE CONTRACT AND THE CONTRACT PROVIDES THAT </w:t>
       </w:r>
       <w:r>
         <w:rPr>
           <w:szCs w:val="24"/>
         </w:rPr>
         <w:lastRenderedPageBreak/>
-        <w:t>PROPERTY, FRAUDULENT IDENTIFICATION, AND FRAUDULENT PAYMENTS. FURTHERMORE, THE PURCHASER’S RIGHTS SHALL NOT BE FORFEITED UNTIL THE PURCHASER HAS BEEN NOTIFIED OF THE INTENT TO FORFEIT IN ACCORDANCE WITH N.C. GEN. STAT. 47H-4 AND BEEN GIVEN A RIGHT TO CURE THE DEFAULT AND HAS FAILED TO DO SO WITHIN THE TIME PERIOD ALLOWED. A TIMELY TENDER OF CURE SHALL REINSTATE THE CONTRACT FOR DEED.</w:t>
+        <w:t>AS A RESULT OF SUCH BREACH THE SELLER IS ENTITLED TO FORFEIT THE CONTRACT. EXAMPLES OF BREACH OF CONTRACT INCLUDE LACK OF PAYMENT EXTENDING BEYOND 15 DAYS OF DUE DATE, PROHIBITED USE OF PROPERTY, FRAUDULENT IDENTIFICATION, AND FRAUDULENT PAYMENTS. FURTHERMORE, THE PURCHASER’S RIGHTS SHALL NOT BE FORFEITED UNTIL THE PURCHASER HAS BEEN NOTIFIED OF THE INTENT TO FORFEIT IN ACCORDANCE WITH N.C. GEN. STAT. 47H-4 AND BEEN GIVEN A RIGHT TO CURE THE DEFAULT AND HAS FAILED TO DO SO WITHIN THE TIME PERIOD ALLOWED. A TIMELY TENDER OF CURE SHALL REINSTATE THE CONTRACT FOR DEED.</w:t>
       </w:r>
     </w:p>
     <w:p>
@@ -3332,7 +3351,21 @@
         <w:rPr>
           <w:szCs w:val="28"/>
         </w:rPr>
-        <w:t>Additional Terms, Conditions or Addenda (lettered a,b,c,d, etc.)</w:t>
+        <w:t xml:space="preserve">Additional Terms, Conditions or Addenda (lettered </w:t>
+      </w:r>
+      <w:proofErr w:type="spellStart"/>
+      <w:r>
+        <w:rPr>
+          <w:szCs w:val="28"/>
+        </w:rPr>
+        <w:t>a,b,c,d</w:t>
+      </w:r>
+      <w:proofErr w:type="spellEnd"/>
+      <w:r>
+        <w:rPr>
+          <w:szCs w:val="28"/>
+        </w:rPr>
+        <w:t>, etc.)</w:t>
       </w:r>
     </w:p>
     <w:p>
@@ -3356,11 +3389,6 @@
           <w:bCs/>
         </w:rPr>
         <w:t>This Contract is signed subject to any changes Seller's attorney may make or require. The parties shall sign the Contract again at closing, or execute any required amendment, with any such attorney-required alterations incorporated. If such changes are material and Purchaser does not agree to proceed, Seller may elect to proceed under the previously signed Contract. If Seller does not so elect, Purchaser's due diligence funds shall be returned to Purchaser.</w:t>
-      </w:r>
-      <w:r>
-        <w:rPr>
-          <w:b/>
-        </w:rPr>
       </w:r>
     </w:p>
     <w:p>
@@ -4354,14 +4382,6 @@
         <w:rPr>
           <w:u w:val="single"/>
         </w:rPr>
-      </w:r>
-      <w:r/>
-      <w:r/>
-      <w:r/>
-      <w:r>
-        <w:rPr>
-          <w:u w:val="single"/>
-        </w:rPr>
         <w:tab/>
         <w:tab/>
         <w:tab/>
@@ -5327,12 +5347,6 @@
         <w:rPr>
           <w:u w:val="single"/>
         </w:rPr>
-      </w:r>
-      <w:r/>
-      <w:r>
-        <w:rPr>
-          <w:u w:val="single"/>
-        </w:rPr>
         <w:tab/>
         <w:tab/>
         <w:tab/>
@@ -5370,7 +5384,6 @@
         </w:rPr>
         <w:t>Wes Browning, Manager of Investment Services LLC, Trustee of 320 Rose Pl Real Estate Trust dated March, 5 2025,</w:t>
       </w:r>
-      <w:r/>
       <w:r/>
       <w:r>
         <w:t xml:space="preserve"> personally appeared before me this day and acknowledged the execution of the foregoing instrument.  Witness my hand and notarial seal,</w:t>
@@ -7139,7 +7152,6 @@
   <w:style w:type="character" w:default="1" w:styleId="DefaultParagraphFont">
     <w:name w:val="Default Paragraph Font"/>
     <w:uiPriority w:val="1"/>
-    <w:semiHidden/>
     <w:unhideWhenUsed/>
   </w:style>
   <w:style w:type="table" w:default="1" w:styleId="TableNormal">
@@ -7886,15 +7898,7 @@
 </file>
 
 <file path=customXml/item2.xml><?xml version="1.0" encoding="utf-8"?>
-<p:properties xmlns:p="http://schemas.microsoft.com/office/2006/metadata/properties" xmlns:xsi="http://www.w3.org/2001/XMLSchema-instance" xmlns:pc="http://schemas.microsoft.com/office/infopath/2007/PartnerControls">
-  <documentManagement>
-    <TaxCatchAll xmlns="42cc25d9-27fe-4f07-accb-ded05ec47eee" xsi:nil="true"/>
-    <lcf76f155ced4ddcb4097134ff3c332f xmlns="ab9fedca-001d-4cc9-b244-d9c3be5a27d3">
-      <Terms xmlns="http://schemas.microsoft.com/office/infopath/2007/PartnerControls"/>
-    </lcf76f155ced4ddcb4097134ff3c332f>
-    <_Flow_SignoffStatus xmlns="ab9fedca-001d-4cc9-b244-d9c3be5a27d3" xsi:nil="true"/>
-  </documentManagement>
-</p:properties>
+<b:Sources xmlns:b="http://schemas.openxmlformats.org/officeDocument/2006/bibliography" xmlns="http://schemas.openxmlformats.org/officeDocument/2006/bibliography" SelectedStyle="\APASixthEditionOfficeOnline.xsl" StyleName="APA" Version="6"/>
 </file>
 
 <file path=customXml/item3.xml><?xml version="1.0" encoding="utf-8"?>
@@ -8159,7 +8163,15 @@
 </file>
 
 <file path=customXml/item4.xml><?xml version="1.0" encoding="utf-8"?>
-<b:Sources xmlns:b="http://schemas.openxmlformats.org/officeDocument/2006/bibliography" xmlns="http://schemas.openxmlformats.org/officeDocument/2006/bibliography" SelectedStyle="\APASixthEditionOfficeOnline.xsl" StyleName="APA" Version="6"/>
+<p:properties xmlns:p="http://schemas.microsoft.com/office/2006/metadata/properties" xmlns:xsi="http://www.w3.org/2001/XMLSchema-instance" xmlns:pc="http://schemas.microsoft.com/office/infopath/2007/PartnerControls">
+  <documentManagement>
+    <TaxCatchAll xmlns="42cc25d9-27fe-4f07-accb-ded05ec47eee" xsi:nil="true"/>
+    <lcf76f155ced4ddcb4097134ff3c332f xmlns="ab9fedca-001d-4cc9-b244-d9c3be5a27d3">
+      <Terms xmlns="http://schemas.microsoft.com/office/infopath/2007/PartnerControls"/>
+    </lcf76f155ced4ddcb4097134ff3c332f>
+    <_Flow_SignoffStatus xmlns="ab9fedca-001d-4cc9-b244-d9c3be5a27d3" xsi:nil="true"/>
+  </documentManagement>
+</p:properties>
 </file>
 
 <file path=customXml/itemProps1.xml><?xml version="1.0" encoding="utf-8"?>
@@ -8171,12 +8183,9 @@
 </file>
 
 <file path=customXml/itemProps2.xml><?xml version="1.0" encoding="utf-8"?>
-<ds:datastoreItem xmlns:ds="http://schemas.openxmlformats.org/officeDocument/2006/customXml" ds:itemID="{1A4736DD-7889-4919-A280-9BE82A810A58}">
+<ds:datastoreItem xmlns:ds="http://schemas.openxmlformats.org/officeDocument/2006/customXml" ds:itemID="{3679C442-D341-425F-8964-A65FCEFD3D9B}">
   <ds:schemaRefs>
-    <ds:schemaRef ds:uri="http://schemas.microsoft.com/office/2006/metadata/properties"/>
-    <ds:schemaRef ds:uri="http://schemas.microsoft.com/office/infopath/2007/PartnerControls"/>
-    <ds:schemaRef ds:uri="42cc25d9-27fe-4f07-accb-ded05ec47eee"/>
-    <ds:schemaRef ds:uri="ab9fedca-001d-4cc9-b244-d9c3be5a27d3"/>
+    <ds:schemaRef ds:uri="http://schemas.openxmlformats.org/officeDocument/2006/bibliography"/>
   </ds:schemaRefs>
 </ds:datastoreItem>
 </file>
@@ -8201,9 +8210,12 @@
 </file>
 
 <file path=customXml/itemProps4.xml><?xml version="1.0" encoding="utf-8"?>
-<ds:datastoreItem xmlns:ds="http://schemas.openxmlformats.org/officeDocument/2006/customXml" ds:itemID="{3679C442-D341-425F-8964-A65FCEFD3D9B}">
+<ds:datastoreItem xmlns:ds="http://schemas.openxmlformats.org/officeDocument/2006/customXml" ds:itemID="{1A4736DD-7889-4919-A280-9BE82A810A58}">
   <ds:schemaRefs>
-    <ds:schemaRef ds:uri="http://schemas.openxmlformats.org/officeDocument/2006/bibliography"/>
+    <ds:schemaRef ds:uri="http://schemas.microsoft.com/office/2006/metadata/properties"/>
+    <ds:schemaRef ds:uri="http://schemas.microsoft.com/office/infopath/2007/PartnerControls"/>
+    <ds:schemaRef ds:uri="42cc25d9-27fe-4f07-accb-ded05ec47eee"/>
+    <ds:schemaRef ds:uri="ab9fedca-001d-4cc9-b244-d9c3be5a27d3"/>
   </ds:schemaRefs>
 </ds:datastoreItem>
 </file>
</xml_diff>

<commit_message>
Add purchaser independent counsel notice
</commit_message>
<xml_diff>
--- a/Project Rooms/Contract for Deed/output/320 Rose - Contract for Deed Agreement - ATTORNEY REVIEW PACKAGE.docx
+++ b/Project Rooms/Contract for Deed/output/320 Rose - Contract for Deed Agreement - ATTORNEY REVIEW PACKAGE.docx
@@ -3393,6 +3393,14 @@
     </w:p>
     <w:p>
       <w:pPr>
+        <w:spacing w:line="264" w:lineRule="auto"/>
+      </w:pPr>
+      <w:r>
+        <w:t>Purchaser acknowledges that Seller is not providing legal advice to Purchaser. Purchaser has been advised that Purchaser may, at Purchaser's own expense, consult with an attorney of Purchaser's choice before signing this Contract and before closing.</w:t>
+      </w:r>
+    </w:p>
+    <w:p>
+      <w:pPr>
         <w:numPr>
           <w:ilvl w:val="1"/>
           <w:numId w:val="10"/>
@@ -4382,6 +4390,14 @@
         <w:rPr>
           <w:u w:val="single"/>
         </w:rPr>
+      </w:r>
+      <w:r/>
+      <w:r/>
+      <w:r/>
+      <w:r>
+        <w:rPr>
+          <w:u w:val="single"/>
+        </w:rPr>
         <w:tab/>
         <w:tab/>
         <w:tab/>
@@ -5347,6 +5363,12 @@
         <w:rPr>
           <w:u w:val="single"/>
         </w:rPr>
+      </w:r>
+      <w:r/>
+      <w:r>
+        <w:rPr>
+          <w:u w:val="single"/>
+        </w:rPr>
         <w:tab/>
         <w:tab/>
         <w:tab/>
@@ -5384,6 +5406,7 @@
         </w:rPr>
         <w:t>Wes Browning, Manager of Investment Services LLC, Trustee of 320 Rose Pl Real Estate Trust dated March, 5 2025,</w:t>
       </w:r>
+      <w:r/>
       <w:r/>
       <w:r>
         <w:t xml:space="preserve"> personally appeared before me this day and acknowledged the execution of the foregoing instrument.  Witness my hand and notarial seal,</w:t>

</xml_diff>

<commit_message>
Preserve contract formatting and page breaks
</commit_message>
<xml_diff>
--- a/Project Rooms/Contract for Deed/output/320 Rose - Contract for Deed Agreement - ATTORNEY REVIEW PACKAGE.docx
+++ b/Project Rooms/Contract for Deed/output/320 Rose - Contract for Deed Agreement - ATTORNEY REVIEW PACKAGE.docx
@@ -113,7 +113,20 @@
           <w:szCs w:val="28"/>
         </w:rPr>
         <w:tab/>
-        <w:t>Whose principal address is:</w:t>
+      </w:r>
+      <w:proofErr w:type="gramStart"/>
+      <w:r>
+        <w:rPr>
+          <w:szCs w:val="28"/>
+        </w:rPr>
+        <w:t>Whose</w:t>
+      </w:r>
+      <w:proofErr w:type="gramEnd"/>
+      <w:r>
+        <w:rPr>
+          <w:szCs w:val="28"/>
+        </w:rPr>
+        <w:t xml:space="preserve"> principal address is:</w:t>
       </w:r>
     </w:p>
     <w:p>
@@ -1317,7 +1330,21 @@
         <w:rPr>
           <w:szCs w:val="24"/>
         </w:rPr>
-        <w:t xml:space="preserve">Existing mortgage balance encumbering the Property to be taken subject to by Purchaser (approximately).                     </w:t>
+        <w:t xml:space="preserve">Existing mortgage balance encumbering the Property to </w:t>
+      </w:r>
+      <w:proofErr w:type="gramStart"/>
+      <w:r>
+        <w:rPr>
+          <w:szCs w:val="24"/>
+        </w:rPr>
+        <w:t>be taken</w:t>
+      </w:r>
+      <w:proofErr w:type="gramEnd"/>
+      <w:r>
+        <w:rPr>
+          <w:szCs w:val="24"/>
+        </w:rPr>
+        <w:t xml:space="preserve"> subject to by Purchaser (approximately).                     </w:t>
       </w:r>
       <w:r>
         <w:rPr>
@@ -1351,7 +1378,21 @@
         <w:rPr>
           <w:szCs w:val="24"/>
         </w:rPr>
-        <w:t>Total Purchase Price  - exactly</w:t>
+        <w:t xml:space="preserve">Total Purchase </w:t>
+      </w:r>
+      <w:proofErr w:type="gramStart"/>
+      <w:r>
+        <w:rPr>
+          <w:szCs w:val="24"/>
+        </w:rPr>
+        <w:t>Price  -</w:t>
+      </w:r>
+      <w:proofErr w:type="gramEnd"/>
+      <w:r>
+        <w:rPr>
+          <w:szCs w:val="24"/>
+        </w:rPr>
+        <w:t xml:space="preserve"> exactly</w:t>
       </w:r>
       <w:r>
         <w:rPr>
@@ -1411,7 +1452,21 @@
         <w:rPr>
           <w:szCs w:val="28"/>
         </w:rPr>
-        <w:t>Purchaser agrees to provide an additional charges and fees associated with the recording of a Memorandum of (this) Contract for Deed and administrative costs of the Seller</w:t>
+        <w:t xml:space="preserve">Purchaser agrees to provide </w:t>
+      </w:r>
+      <w:proofErr w:type="gramStart"/>
+      <w:r>
+        <w:rPr>
+          <w:szCs w:val="28"/>
+        </w:rPr>
+        <w:t>an additional</w:t>
+      </w:r>
+      <w:proofErr w:type="gramEnd"/>
+      <w:r>
+        <w:rPr>
+          <w:szCs w:val="28"/>
+        </w:rPr>
+        <w:t xml:space="preserve"> charges and fees associated with the recording of a Memorandum of (this) Contract for Deed and administrative costs of the Seller</w:t>
       </w:r>
       <w:r>
         <w:rPr>
@@ -1540,27 +1595,59 @@
         <w:rPr>
           <w:szCs w:val="28"/>
         </w:rPr>
-        <w:t xml:space="preserve"> Wood Destroying Organism Report </w:t>
-      </w:r>
-      <w:r>
-        <w:rPr>
-          <w:szCs w:val="28"/>
-        </w:rPr>
-        <w:tab/>
-      </w:r>
-      <w:r>
-        <w:rPr>
-          <w:b/>
-          <w:bCs/>
-          <w:szCs w:val="28"/>
-        </w:rPr>
-        <w:t>[X]</w:t>
-      </w:r>
-      <w:r>
-        <w:rPr>
-          <w:szCs w:val="28"/>
-        </w:rPr>
-        <w:t xml:space="preserve">  Real estate brokerage fee</w:t>
+        <w:t xml:space="preserve"> Wood Destroying Organism </w:t>
+      </w:r>
+      <w:proofErr w:type="gramStart"/>
+      <w:r>
+        <w:rPr>
+          <w:szCs w:val="28"/>
+        </w:rPr>
+        <w:t xml:space="preserve">Report </w:t>
+      </w:r>
+      <w:r>
+        <w:rPr>
+          <w:szCs w:val="28"/>
+        </w:rPr>
+        <w:tab/>
+      </w:r>
+      <w:r>
+        <w:rPr>
+          <w:b/>
+          <w:bCs/>
+          <w:szCs w:val="28"/>
+        </w:rPr>
+        <w:t>[</w:t>
+      </w:r>
+      <w:proofErr w:type="gramEnd"/>
+      <w:r>
+        <w:rPr>
+          <w:b/>
+          <w:bCs/>
+          <w:szCs w:val="28"/>
+        </w:rPr>
+        <w:t>X</w:t>
+      </w:r>
+      <w:proofErr w:type="gramStart"/>
+      <w:r>
+        <w:rPr>
+          <w:b/>
+          <w:bCs/>
+          <w:szCs w:val="28"/>
+        </w:rPr>
+        <w:t>]</w:t>
+      </w:r>
+      <w:r>
+        <w:rPr>
+          <w:szCs w:val="28"/>
+        </w:rPr>
+        <w:t xml:space="preserve">  Real</w:t>
+      </w:r>
+      <w:proofErr w:type="gramEnd"/>
+      <w:r>
+        <w:rPr>
+          <w:szCs w:val="28"/>
+        </w:rPr>
+        <w:t xml:space="preserve"> estate brokerage fee</w:t>
       </w:r>
     </w:p>
     <w:p>
@@ -1620,7 +1707,21 @@
         <w:rPr>
           <w:szCs w:val="28"/>
         </w:rPr>
-        <w:t>[   ] Other______________________________________</w:t>
+        <w:t xml:space="preserve">[ </w:t>
+      </w:r>
+      <w:proofErr w:type="gramStart"/>
+      <w:r>
+        <w:rPr>
+          <w:szCs w:val="28"/>
+        </w:rPr>
+        <w:t xml:space="preserve">  ]</w:t>
+      </w:r>
+      <w:proofErr w:type="gramEnd"/>
+      <w:r>
+        <w:rPr>
+          <w:szCs w:val="28"/>
+        </w:rPr>
+        <w:t xml:space="preserve"> Other______________________________________</w:t>
       </w:r>
     </w:p>
     <w:p>
@@ -1710,16 +1811,34 @@
           <w:bCs/>
           <w:szCs w:val="28"/>
         </w:rPr>
-        <w:t xml:space="preserve">[X]Title insurance policy   </w:t>
-      </w:r>
-      <w:r>
-        <w:rPr>
-          <w:b/>
-          <w:bCs/>
-          <w:szCs w:val="28"/>
-        </w:rPr>
-        <w:tab/>
-        <w:t xml:space="preserve">[X] Attorney's fee </w:t>
+        <w:t xml:space="preserve">[X]Title insurance </w:t>
+      </w:r>
+      <w:proofErr w:type="gramStart"/>
+      <w:r>
+        <w:rPr>
+          <w:b/>
+          <w:bCs/>
+          <w:szCs w:val="28"/>
+        </w:rPr>
+        <w:t xml:space="preserve">policy   </w:t>
+      </w:r>
+      <w:r>
+        <w:rPr>
+          <w:b/>
+          <w:bCs/>
+          <w:szCs w:val="28"/>
+        </w:rPr>
+        <w:tab/>
+        <w:t>[</w:t>
+      </w:r>
+      <w:proofErr w:type="gramEnd"/>
+      <w:r>
+        <w:rPr>
+          <w:b/>
+          <w:bCs/>
+          <w:szCs w:val="28"/>
+        </w:rPr>
+        <w:t xml:space="preserve">X] Attorney's fee </w:t>
       </w:r>
     </w:p>
     <w:p>
@@ -1744,16 +1863,34 @@
           <w:bCs/>
           <w:szCs w:val="28"/>
         </w:rPr>
-        <w:t xml:space="preserve">[X] Closing Costs   </w:t>
-      </w:r>
-      <w:r>
-        <w:rPr>
-          <w:b/>
-          <w:bCs/>
-          <w:szCs w:val="28"/>
-        </w:rPr>
-        <w:tab/>
-        <w:t xml:space="preserve">[X] Recording fees   </w:t>
+        <w:t xml:space="preserve">[X] Closing </w:t>
+      </w:r>
+      <w:proofErr w:type="gramStart"/>
+      <w:r>
+        <w:rPr>
+          <w:b/>
+          <w:bCs/>
+          <w:szCs w:val="28"/>
+        </w:rPr>
+        <w:t xml:space="preserve">Costs   </w:t>
+      </w:r>
+      <w:r>
+        <w:rPr>
+          <w:b/>
+          <w:bCs/>
+          <w:szCs w:val="28"/>
+        </w:rPr>
+        <w:tab/>
+        <w:t>[</w:t>
+      </w:r>
+      <w:proofErr w:type="gramEnd"/>
+      <w:r>
+        <w:rPr>
+          <w:b/>
+          <w:bCs/>
+          <w:szCs w:val="28"/>
+        </w:rPr>
+        <w:t xml:space="preserve">X] Recording fees   </w:t>
       </w:r>
     </w:p>
     <w:p>
@@ -1778,16 +1915,34 @@
           <w:bCs/>
           <w:szCs w:val="28"/>
         </w:rPr>
-        <w:t xml:space="preserve">[X] Note stamps   </w:t>
-      </w:r>
-      <w:r>
-        <w:rPr>
-          <w:b/>
-          <w:bCs/>
-          <w:szCs w:val="28"/>
-        </w:rPr>
-        <w:tab/>
-        <w:t xml:space="preserve">[X] Intangible tax    </w:t>
+        <w:t xml:space="preserve">[X] Note </w:t>
+      </w:r>
+      <w:proofErr w:type="gramStart"/>
+      <w:r>
+        <w:rPr>
+          <w:b/>
+          <w:bCs/>
+          <w:szCs w:val="28"/>
+        </w:rPr>
+        <w:t xml:space="preserve">stamps   </w:t>
+      </w:r>
+      <w:r>
+        <w:rPr>
+          <w:b/>
+          <w:bCs/>
+          <w:szCs w:val="28"/>
+        </w:rPr>
+        <w:tab/>
+        <w:t>[</w:t>
+      </w:r>
+      <w:proofErr w:type="gramEnd"/>
+      <w:r>
+        <w:rPr>
+          <w:b/>
+          <w:bCs/>
+          <w:szCs w:val="28"/>
+        </w:rPr>
+        <w:t xml:space="preserve">X] Intangible tax    </w:t>
       </w:r>
     </w:p>
     <w:p>
@@ -1831,14 +1986,42 @@
         <w:rPr>
           <w:szCs w:val="28"/>
         </w:rPr>
-        <w:t xml:space="preserve">[   ] Credit reports   </w:t>
-      </w:r>
-      <w:r>
-        <w:rPr>
-          <w:szCs w:val="28"/>
-        </w:rPr>
-        <w:tab/>
-        <w:t xml:space="preserve">[   ] Loan origination fee   </w:t>
+        <w:t xml:space="preserve">[ </w:t>
+      </w:r>
+      <w:proofErr w:type="gramStart"/>
+      <w:r>
+        <w:rPr>
+          <w:szCs w:val="28"/>
+        </w:rPr>
+        <w:t xml:space="preserve">  ]</w:t>
+      </w:r>
+      <w:proofErr w:type="gramEnd"/>
+      <w:r>
+        <w:rPr>
+          <w:szCs w:val="28"/>
+        </w:rPr>
+        <w:t xml:space="preserve"> Credit reports   </w:t>
+      </w:r>
+      <w:r>
+        <w:rPr>
+          <w:szCs w:val="28"/>
+        </w:rPr>
+        <w:tab/>
+        <w:t xml:space="preserve">[ </w:t>
+      </w:r>
+      <w:proofErr w:type="gramStart"/>
+      <w:r>
+        <w:rPr>
+          <w:szCs w:val="28"/>
+        </w:rPr>
+        <w:t xml:space="preserve">  ]</w:t>
+      </w:r>
+      <w:proofErr w:type="gramEnd"/>
+      <w:r>
+        <w:rPr>
+          <w:szCs w:val="28"/>
+        </w:rPr>
+        <w:t xml:space="preserve"> Loan origination fee   </w:t>
       </w:r>
     </w:p>
     <w:p>
@@ -1859,14 +2042,42 @@
         <w:rPr>
           <w:szCs w:val="28"/>
         </w:rPr>
-        <w:t xml:space="preserve">[   ] Loan insurance premium   </w:t>
-      </w:r>
-      <w:r>
-        <w:rPr>
-          <w:szCs w:val="28"/>
-        </w:rPr>
-        <w:tab/>
-        <w:t>[   ] Other_________________________________</w:t>
+        <w:t xml:space="preserve">[ </w:t>
+      </w:r>
+      <w:proofErr w:type="gramStart"/>
+      <w:r>
+        <w:rPr>
+          <w:szCs w:val="28"/>
+        </w:rPr>
+        <w:t xml:space="preserve">  ]</w:t>
+      </w:r>
+      <w:proofErr w:type="gramEnd"/>
+      <w:r>
+        <w:rPr>
+          <w:szCs w:val="28"/>
+        </w:rPr>
+        <w:t xml:space="preserve"> Loan insurance premium   </w:t>
+      </w:r>
+      <w:r>
+        <w:rPr>
+          <w:szCs w:val="28"/>
+        </w:rPr>
+        <w:tab/>
+        <w:t xml:space="preserve">[ </w:t>
+      </w:r>
+      <w:proofErr w:type="gramStart"/>
+      <w:r>
+        <w:rPr>
+          <w:szCs w:val="28"/>
+        </w:rPr>
+        <w:t xml:space="preserve">  ]</w:t>
+      </w:r>
+      <w:proofErr w:type="gramEnd"/>
+      <w:r>
+        <w:rPr>
+          <w:szCs w:val="28"/>
+        </w:rPr>
+        <w:t xml:space="preserve"> Other_________________________________</w:t>
       </w:r>
     </w:p>
     <w:p>
@@ -1883,11 +2094,19 @@
           <w:szCs w:val="28"/>
         </w:rPr>
       </w:pPr>
-      <w:r>
-        <w:rPr>
-          <w:szCs w:val="28"/>
-        </w:rPr>
-        <w:t>[  ] All other charges required by lender which Purchaser is prohibited from paying by law or regulation.</w:t>
+      <w:proofErr w:type="gramStart"/>
+      <w:r>
+        <w:rPr>
+          <w:szCs w:val="28"/>
+        </w:rPr>
+        <w:t>[  ]</w:t>
+      </w:r>
+      <w:proofErr w:type="gramEnd"/>
+      <w:r>
+        <w:rPr>
+          <w:szCs w:val="28"/>
+        </w:rPr>
+        <w:t xml:space="preserve"> All other charges required by lender which Purchaser is prohibited from paying by law or regulation.</w:t>
       </w:r>
     </w:p>
     <w:p>
@@ -1903,7 +2122,21 @@
         <w:rPr>
           <w:szCs w:val="28"/>
         </w:rPr>
-        <w:t>[   ] Repairs or replacements, in addition to those in paragraph 9, not to exceed $_________________________</w:t>
+        <w:t xml:space="preserve">[ </w:t>
+      </w:r>
+      <w:proofErr w:type="gramStart"/>
+      <w:r>
+        <w:rPr>
+          <w:szCs w:val="28"/>
+        </w:rPr>
+        <w:t xml:space="preserve">  ]</w:t>
+      </w:r>
+      <w:proofErr w:type="gramEnd"/>
+      <w:r>
+        <w:rPr>
+          <w:szCs w:val="28"/>
+        </w:rPr>
+        <w:t xml:space="preserve"> Repairs or replacements, in addition to those in paragraph 9, not to exceed $_________________________</w:t>
       </w:r>
     </w:p>
     <w:p>
@@ -1919,7 +2152,21 @@
         <w:rPr>
           <w:szCs w:val="28"/>
         </w:rPr>
-        <w:t xml:space="preserve">[   ] All mortgage payments or condominium and association fees will be </w:t>
+        <w:t xml:space="preserve">[ </w:t>
+      </w:r>
+      <w:proofErr w:type="gramStart"/>
+      <w:r>
+        <w:rPr>
+          <w:szCs w:val="28"/>
+        </w:rPr>
+        <w:t xml:space="preserve">  ]</w:t>
+      </w:r>
+      <w:proofErr w:type="gramEnd"/>
+      <w:r>
+        <w:rPr>
+          <w:szCs w:val="28"/>
+        </w:rPr>
+        <w:t xml:space="preserve"> All mortgage payments or condominium and association fees will be </w:t>
       </w:r>
       <w:r>
         <w:rPr>
@@ -2352,14 +2599,13 @@
           <w:numId w:val="10"/>
         </w:numPr>
         <w:tabs>
-          <w:tab w:val="left" w:pos="720"/>
-          <w:tab w:val="left" w:pos="3240"/>
+          <w:tab w:val="left" w:pos="990"/>
           <w:tab w:val="left" w:pos="7200"/>
           <w:tab w:val="left" w:pos="8280"/>
           <w:tab w:val="left" w:pos="9780"/>
         </w:tabs>
         <w:spacing w:line="264" w:lineRule="auto"/>
-        <w:ind w:left="630"/>
+        <w:ind w:left="630" w:firstLine="0"/>
         <w:jc w:val="both"/>
         <w:rPr>
           <w:szCs w:val="24"/>
@@ -2575,16 +2821,6 @@
         </w:rPr>
         <w:t>Seller shall remain responsible for the pending orders or adverse conditions listed below. These matters may remain in place during the term of this Contract. To the extent any such matter must be released, satisfied, or otherwise resolved to convey marketable title, Seller shall cause it to be released, satisfied, or otherwise resolved before or at the closing of Purchaser's future sale of the Property, unless resolved earlier or otherwise agreed in writing.</w:t>
       </w:r>
-      <w:r>
-        <w:rPr>
-          <w:szCs w:val="28"/>
-        </w:rPr>
-      </w:r>
-      <w:r>
-        <w:rPr>
-          <w:szCs w:val="28"/>
-        </w:rPr>
-      </w:r>
     </w:p>
     <w:p>
       <w:pPr>
@@ -2618,6 +2854,20 @@
           <w:bCs/>
         </w:rPr>
       </w:r>
+      <w:proofErr w:type="gramStart"/>
+      <w:r>
+        <w:rPr>
+          <w:b/>
+          <w:bCs/>
+        </w:rPr>
+      </w:r>
+      <w:proofErr w:type="gramEnd"/>
+      <w:r>
+        <w:rPr>
+          <w:b/>
+          <w:bCs/>
+        </w:rPr>
+      </w:r>
     </w:p>
     <w:p>
       <w:pPr>
@@ -2651,14 +2901,28 @@
         <w:rPr>
           <w:szCs w:val="24"/>
         </w:rPr>
-        <w:t xml:space="preserve">A PURCHASER’S RIGHTS UNDER A CONTRACT FOR DEED SHALL NOT BE FORFEITED EXCEPT AS PROVIDED IN N.C. GEN. STAT. CHAPTER 47H. A CONTRACT FOR DEED CANNOT BE FORFEITED UNLESS A BREACH HAS OCCURRED IN ONE OR MORE OF THE PURCHASER’S EXPRESS OBLIGATIONS UNDER THE CONTRACT AND THE CONTRACT PROVIDES THAT </w:t>
+        <w:t xml:space="preserve">A PURCHASER’S RIGHTS UNDER A CONTRACT FOR DEED SHALL NOT BE FORFEITED EXCEPT AS PROVIDED IN N.C. GEN. </w:t>
       </w:r>
       <w:r>
         <w:rPr>
           <w:szCs w:val="24"/>
         </w:rPr>
         <w:lastRenderedPageBreak/>
-        <w:t>AS A RESULT OF SUCH BREACH THE SELLER IS ENTITLED TO FORFEIT THE CONTRACT. EXAMPLES OF BREACH OF CONTRACT INCLUDE LACK OF PAYMENT EXTENDING BEYOND 15 DAYS OF DUE DATE, PROHIBITED USE OF PROPERTY, FRAUDULENT IDENTIFICATION, AND FRAUDULENT PAYMENTS. FURTHERMORE, THE PURCHASER’S RIGHTS SHALL NOT BE FORFEITED UNTIL THE PURCHASER HAS BEEN NOTIFIED OF THE INTENT TO FORFEIT IN ACCORDANCE WITH N.C. GEN. STAT. 47H-4 AND BEEN GIVEN A RIGHT TO CURE THE DEFAULT AND HAS FAILED TO DO SO WITHIN THE TIME PERIOD ALLOWED. A TIMELY TENDER OF CURE SHALL REINSTATE THE CONTRACT FOR DEED.</w:t>
+        <w:t xml:space="preserve">STAT. CHAPTER 47H. A CONTRACT FOR DEED CANNOT BE FORFEITED UNLESS A BREACH HAS OCCURRED IN ONE OR MORE OF </w:t>
+      </w:r>
+      <w:proofErr w:type="gramStart"/>
+      <w:r>
+        <w:rPr>
+          <w:szCs w:val="24"/>
+        </w:rPr>
+        <w:t>THE PURCHASER’S</w:t>
+      </w:r>
+      <w:proofErr w:type="gramEnd"/>
+      <w:r>
+        <w:rPr>
+          <w:szCs w:val="24"/>
+        </w:rPr>
+        <w:t xml:space="preserve"> EXPRESS OBLIGATIONS UNDER THE CONTRACT AND THE CONTRACT PROVIDES THAT AS A RESULT OF SUCH BREACH THE SELLER IS ENTITLED TO FORFEIT THE CONTRACT. EXAMPLES OF BREACH OF CONTRACT INCLUDE LACK OF PAYMENT EXTENDING BEYOND 15 DAYS OF DUE DATE, PROHIBITED USE OF PROPERTY, FRAUDULENT IDENTIFICATION, AND FRAUDULENT PAYMENTS. FURTHERMORE, THE PURCHASER’S RIGHTS SHALL NOT BE FORFEITED UNTIL THE PURCHASER HAS BEEN NOTIFIED OF THE INTENT TO FORFEIT IN ACCORDANCE WITH N.C. GEN. STAT. 47H-4 AND BEEN GIVEN A RIGHT TO CURE THE DEFAULT AND HAS FAILED TO DO SO WITHIN THE TIME PERIOD ALLOWED. A TIMELY TENDER OF CURE SHALL REINSTATE THE CONTRACT FOR DEED.</w:t>
       </w:r>
     </w:p>
     <w:p>
@@ -2703,7 +2967,21 @@
         <w:rPr>
           <w:szCs w:val="24"/>
         </w:rPr>
-        <w:t xml:space="preserve">Any unauthorized or unpermitted construction, improvements, excavation (to include clearing, logging, and planting), or otherwise altering the property from its original condition at the time this contract is executed is prohibited.  Authorization may be given by the Seller for certain improvements if Purchaser submits an application in writing to make changes and receives authorization in writing from Seller.  Authorization will be withheld or granted solely at the discretion of the Seller. Additionally, any use not permitted by local, state, and federal laws and ordinances is prohibited. </w:t>
+        <w:t xml:space="preserve">Any unauthorized or unpermitted construction, improvements, excavation (to include clearing, logging, and planting), or otherwise altering the property from its original condition at the time this contract is executed is prohibited.  Authorization may be given by the Seller for certain improvements if Purchaser </w:t>
+      </w:r>
+      <w:proofErr w:type="gramStart"/>
+      <w:r>
+        <w:rPr>
+          <w:szCs w:val="24"/>
+        </w:rPr>
+        <w:t>submits an application</w:t>
+      </w:r>
+      <w:proofErr w:type="gramEnd"/>
+      <w:r>
+        <w:rPr>
+          <w:szCs w:val="24"/>
+        </w:rPr>
+        <w:t xml:space="preserve"> in writing to make changes and receives authorization in writing from Seller.  Authorization will be withheld or granted solely at the discretion of the Seller. Additionally, any use not permitted by local, state, and federal laws and ordinances is prohibited. </w:t>
       </w:r>
     </w:p>
     <w:p>
@@ -2738,7 +3016,21 @@
         <w:rPr>
           <w:szCs w:val="24"/>
         </w:rPr>
-        <w:t xml:space="preserve"> Purchaser may prepay some or all of the remaining Balance Owed on this contract at any time.</w:t>
+        <w:t xml:space="preserve"> Purchaser may prepay some or </w:t>
+      </w:r>
+      <w:proofErr w:type="gramStart"/>
+      <w:r>
+        <w:rPr>
+          <w:szCs w:val="24"/>
+        </w:rPr>
+        <w:t>all of</w:t>
+      </w:r>
+      <w:proofErr w:type="gramEnd"/>
+      <w:r>
+        <w:rPr>
+          <w:szCs w:val="24"/>
+        </w:rPr>
+        <w:t xml:space="preserve"> the remaining Balance Owed on this contract at any time.</w:t>
       </w:r>
     </w:p>
     <w:p>
@@ -3115,7 +3407,28 @@
         <w:rPr>
           <w:szCs w:val="28"/>
         </w:rPr>
-        <w:t xml:space="preserve"> has [  ] has not inspected the property and HAS NOT RELIED UPON ANY REPRESENTATIONS MADE BY ANY REAL ESTATE AGENT in describing the property, and Purchaser accepts the property in its PRESENT AS IS CONDITION, except as otherwise specified herein.</w:t>
+        <w:t xml:space="preserve"> has </w:t>
+      </w:r>
+      <w:proofErr w:type="gramStart"/>
+      <w:r>
+        <w:rPr>
+          <w:szCs w:val="28"/>
+        </w:rPr>
+        <w:t>[  ]</w:t>
+      </w:r>
+      <w:proofErr w:type="gramEnd"/>
+      <w:r>
+        <w:rPr>
+          <w:szCs w:val="28"/>
+        </w:rPr>
+        <w:t xml:space="preserve"> has not inspected the property and HAS NOT RELIED UPON ANY REPRESENTATIONS MADE BY ANY REAL ESTATE AGENT in describing the property, and Purchaser accepts the property in its PRESENT AS IS CONDITION, except as </w:t>
+      </w:r>
+      <w:r>
+        <w:rPr>
+          <w:szCs w:val="28"/>
+        </w:rPr>
+        <w:lastRenderedPageBreak/>
+        <w:t>otherwise specified herein.</w:t>
       </w:r>
     </w:p>
     <w:p>
@@ -3133,13 +3446,6 @@
         <w:rPr>
           <w:szCs w:val="28"/>
         </w:rPr>
-        <w:br w:type="page"/>
-      </w:r>
-      <w:r>
-        <w:rPr>
-          <w:szCs w:val="28"/>
-        </w:rPr>
-        <w:lastRenderedPageBreak/>
         <w:t>Title Examination and Time for Closing:</w:t>
       </w:r>
     </w:p>
@@ -3265,7 +3571,25 @@
           <w:bCs/>
           <w:szCs w:val="28"/>
         </w:rPr>
-        <w:t>[   ] _____________days after date of satisfaction of all conditions in paragraph 19 unless extended by other conditions of this Agreement or this agreement is cancelled by the Purchaser.</w:t>
+        <w:t xml:space="preserve">[ </w:t>
+      </w:r>
+      <w:proofErr w:type="gramStart"/>
+      <w:r>
+        <w:rPr>
+          <w:b/>
+          <w:bCs/>
+          <w:szCs w:val="28"/>
+        </w:rPr>
+        <w:t xml:space="preserve">  ]</w:t>
+      </w:r>
+      <w:proofErr w:type="gramEnd"/>
+      <w:r>
+        <w:rPr>
+          <w:b/>
+          <w:bCs/>
+          <w:szCs w:val="28"/>
+        </w:rPr>
+        <w:t xml:space="preserve"> _____________days after date of satisfaction of all conditions in paragraph 19 unless extended by other conditions of this Agreement or this agreement is cancelled by the Purchaser.</w:t>
       </w:r>
       <w:r>
         <w:rPr>
@@ -3354,13 +3678,29 @@
         <w:t xml:space="preserve">Additional Terms, Conditions or Addenda (lettered </w:t>
       </w:r>
       <w:proofErr w:type="spellStart"/>
-      <w:r>
-        <w:rPr>
-          <w:szCs w:val="28"/>
-        </w:rPr>
-        <w:t>a,b,c,d</w:t>
+      <w:proofErr w:type="gramStart"/>
+      <w:r>
+        <w:rPr>
+          <w:szCs w:val="28"/>
+        </w:rPr>
+        <w:t>a,b</w:t>
+      </w:r>
+      <w:proofErr w:type="gramEnd"/>
+      <w:r>
+        <w:rPr>
+          <w:szCs w:val="28"/>
+        </w:rPr>
+        <w:t>,</w:t>
+      </w:r>
+      <w:proofErr w:type="gramStart"/>
+      <w:r>
+        <w:rPr>
+          <w:szCs w:val="28"/>
+        </w:rPr>
+        <w:t>c,d</w:t>
       </w:r>
       <w:proofErr w:type="spellEnd"/>
+      <w:proofErr w:type="gramEnd"/>
       <w:r>
         <w:rPr>
           <w:szCs w:val="28"/>
@@ -3375,28 +3715,6 @@
           <w:color w:val="0000FF"/>
         </w:rPr>
         <w:t>ATTORNEY REVIEW NOTE: Please review the attorney-change contingency language, including Seller's option to proceed under the previously signed Contract if material attorney-required changes cause Purchaser not to proceed, and confirm whether the due diligence/earnest money return language is clear and enforceable.</w:t>
-      </w:r>
-    </w:p>
-    <w:p>
-      <w:pPr>
-        <w:spacing w:line="264" w:lineRule="auto"/>
-        <w:rPr>
-          <w:b/>
-        </w:rPr>
-      </w:pPr>
-      <w:r>
-        <w:rPr>
-          <w:bCs/>
-        </w:rPr>
-        <w:t>This Contract is signed subject to any changes Seller's attorney may make or require. The parties shall sign the Contract again at closing, or execute any required amendment, with any such attorney-required alterations incorporated. If such changes are material and Purchaser does not agree to proceed, Seller may elect to proceed under the previously signed Contract. If Seller does not so elect, Purchaser's due diligence funds shall be returned to Purchaser.</w:t>
-      </w:r>
-    </w:p>
-    <w:p>
-      <w:pPr>
-        <w:spacing w:line="264" w:lineRule="auto"/>
-      </w:pPr>
-      <w:r>
-        <w:t>Purchaser acknowledges that Seller is not providing legal advice to Purchaser. Purchaser has been advised that Purchaser may, at Purchaser's own expense, consult with an attorney of Purchaser's choice before signing this Contract and before closing.</w:t>
       </w:r>
     </w:p>
     <w:p>
@@ -3408,17 +3726,25 @@
         <w:spacing w:line="264" w:lineRule="auto"/>
         <w:rPr>
           <w:bCs/>
-          <w:sz w:val="22"/>
-          <w:szCs w:val="22"/>
-        </w:rPr>
-      </w:pPr>
-      <w:r>
-        <w:rPr>
-          <w:bCs/>
-          <w:sz w:val="22"/>
-          <w:szCs w:val="22"/>
-        </w:rPr>
-        <w:t xml:space="preserve">Seller will provide an Amortization Schedule, annually, indicating the complete payments required, with its components. </w:t>
+        </w:rPr>
+      </w:pPr>
+      <w:r>
+        <w:rPr>
+          <w:bCs/>
+        </w:rPr>
+        <w:t>This Contract is signed subject to any changes Seller's attorney may make or require. The parties shall sign the Contract again at closing, or execute any required amendment, with any such attorney-required alterations incorporated. If such changes are material and Purchaser does not agree to proceed, Seller may elect to proceed under the previously signed Contract. If Seller does not so elect, Purchaser's due diligence funds shall be returned to Purchaser.</w:t>
+      </w:r>
+      <w:proofErr w:type="gramStart"/>
+      <w:r>
+        <w:rPr>
+          <w:bCs/>
+        </w:rPr>
+      </w:r>
+      <w:proofErr w:type="gramEnd"/>
+      <w:r>
+        <w:rPr>
+          <w:bCs/>
+        </w:rPr>
       </w:r>
     </w:p>
     <w:p>
@@ -3428,19 +3754,9 @@
           <w:numId w:val="10"/>
         </w:numPr>
         <w:spacing w:line="264" w:lineRule="auto"/>
-        <w:rPr>
-          <w:bCs/>
-          <w:sz w:val="22"/>
-          <w:szCs w:val="22"/>
-        </w:rPr>
-      </w:pPr>
-      <w:r>
-        <w:rPr>
-          <w:bCs/>
-          <w:sz w:val="22"/>
-          <w:szCs w:val="22"/>
-        </w:rPr>
-        <w:t>Seller agrees to email copies of the bills validating these amounts.</w:t>
+      </w:pPr>
+      <w:r>
+        <w:t>Purchaser acknowledges that Seller is not providing legal advice to Purchaser. Purchaser has been advised that Purchaser may, at Purchaser's own expense, consult with an attorney of Purchaser's choice before signing this Contract and before closing.</w:t>
       </w:r>
     </w:p>
     <w:p>
@@ -3462,7 +3778,7 @@
           <w:sz w:val="22"/>
           <w:szCs w:val="22"/>
         </w:rPr>
-        <w:t>This is explicitly a Contract for Deed. No transfer of deed will be done until the terms of the purchase are satisfied. See the Promissory Note for details.</w:t>
+        <w:t xml:space="preserve">Seller will provide an Amortization Schedule, annually, indicating the complete payments required, with its components. </w:t>
       </w:r>
     </w:p>
     <w:p>
@@ -3484,6 +3800,51 @@
           <w:sz w:val="22"/>
           <w:szCs w:val="22"/>
         </w:rPr>
+        <w:t>Seller agrees to email copies of the bills validating these amounts.</w:t>
+      </w:r>
+    </w:p>
+    <w:p>
+      <w:pPr>
+        <w:numPr>
+          <w:ilvl w:val="1"/>
+          <w:numId w:val="10"/>
+        </w:numPr>
+        <w:spacing w:line="264" w:lineRule="auto"/>
+        <w:rPr>
+          <w:bCs/>
+          <w:sz w:val="22"/>
+          <w:szCs w:val="22"/>
+        </w:rPr>
+      </w:pPr>
+      <w:r>
+        <w:rPr>
+          <w:bCs/>
+          <w:sz w:val="22"/>
+          <w:szCs w:val="22"/>
+        </w:rPr>
+        <w:t>This is explicitly a Contract for Deed. No transfer of deed will be done until the terms of the purchase are satisfied. See the Promissory Note for details.</w:t>
+      </w:r>
+    </w:p>
+    <w:p>
+      <w:pPr>
+        <w:numPr>
+          <w:ilvl w:val="1"/>
+          <w:numId w:val="10"/>
+        </w:numPr>
+        <w:spacing w:line="264" w:lineRule="auto"/>
+        <w:rPr>
+          <w:bCs/>
+          <w:sz w:val="22"/>
+          <w:szCs w:val="22"/>
+        </w:rPr>
+      </w:pPr>
+      <w:r>
+        <w:rPr>
+          <w:bCs/>
+          <w:sz w:val="22"/>
+          <w:szCs w:val="22"/>
+        </w:rPr>
+        <w:lastRenderedPageBreak/>
         <w:t>If the Purchaser defaults on terms of this contract or the promissory note, the remedy for the Seller is eviction, not foreclosure.</w:t>
       </w:r>
     </w:p>
@@ -3542,14 +3903,7 @@
         <w:rPr>
           <w:szCs w:val="28"/>
         </w:rPr>
-        <w:t xml:space="preserve">Personal Property: included in the purchase price are all fixed equipment including ceiling </w:t>
-      </w:r>
-      <w:r>
-        <w:rPr>
-          <w:szCs w:val="28"/>
-        </w:rPr>
-        <w:lastRenderedPageBreak/>
-        <w:t xml:space="preserve">fans, drapery hardware, attached lighting fixtures, mailbox, fence, plants and shrubbery as now installed on the property. </w:t>
+        <w:t xml:space="preserve">Personal Property: included in the purchase price are all fixed equipment including ceiling fans, drapery hardware, attached lighting fixtures, mailbox, fence, plants and shrubbery as now installed on the property. </w:t>
       </w:r>
     </w:p>
     <w:p>
@@ -3636,13 +3990,28 @@
           <w:szCs w:val="28"/>
           <w:u w:val="single"/>
         </w:rPr>
-        <w:t xml:space="preserve">       </w:t>
-      </w:r>
-      <w:r>
-        <w:rPr>
-          <w:szCs w:val="28"/>
-        </w:rPr>
-        <w:t xml:space="preserve">. </w:t>
+        <w:t xml:space="preserve">     </w:t>
+      </w:r>
+      <w:proofErr w:type="gramStart"/>
+      <w:r>
+        <w:rPr>
+          <w:szCs w:val="28"/>
+          <w:u w:val="single"/>
+        </w:rPr>
+        <w:t xml:space="preserve">  </w:t>
+      </w:r>
+      <w:r>
+        <w:rPr>
+          <w:szCs w:val="28"/>
+        </w:rPr>
+        <w:t>.</w:t>
+      </w:r>
+      <w:proofErr w:type="gramEnd"/>
+      <w:r>
+        <w:rPr>
+          <w:szCs w:val="28"/>
+        </w:rPr>
+        <w:t xml:space="preserve"> </w:t>
       </w:r>
     </w:p>
     <w:p>
@@ -3671,6 +4040,7 @@
           <w:tab w:val="left" w:pos="270"/>
         </w:tabs>
         <w:spacing w:line="264" w:lineRule="auto"/>
+        <w:jc w:val="both"/>
         <w:rPr>
           <w:b/>
           <w:bCs/>
@@ -3750,7 +4120,15 @@
           <w:u w:val="single"/>
         </w:rPr>
         <w:tab/>
-        <w:t xml:space="preserve">       </w:t>
+        <w:t xml:space="preserve">     </w:t>
+      </w:r>
+      <w:proofErr w:type="gramStart"/>
+      <w:r>
+        <w:rPr>
+          <w:szCs w:val="28"/>
+          <w:u w:val="single"/>
+        </w:rPr>
+        <w:t xml:space="preserve">  </w:t>
       </w:r>
       <w:r>
         <w:rPr>
@@ -3758,6 +4136,24 @@
         </w:rPr>
         <w:t>.</w:t>
       </w:r>
+      <w:proofErr w:type="gramEnd"/>
+    </w:p>
+    <w:p>
+      <w:pPr>
+        <w:pStyle w:val="p6"/>
+        <w:tabs>
+          <w:tab w:val="clear" w:pos="720"/>
+          <w:tab w:val="left" w:pos="270"/>
+        </w:tabs>
+        <w:spacing w:line="264" w:lineRule="auto"/>
+        <w:ind w:left="360"/>
+        <w:jc w:val="both"/>
+        <w:rPr>
+          <w:b/>
+          <w:bCs/>
+          <w:szCs w:val="24"/>
+        </w:rPr>
+      </w:pPr>
     </w:p>
     <w:p>
       <w:pPr>
@@ -3784,15 +4180,6 @@
           <w:bCs/>
           <w:szCs w:val="24"/>
         </w:rPr>
-        <w:br w:type="page"/>
-      </w:r>
-      <w:r>
-        <w:rPr>
-          <w:b/>
-          <w:bCs/>
-          <w:szCs w:val="24"/>
-        </w:rPr>
-        <w:lastRenderedPageBreak/>
         <w:t xml:space="preserve">RIGHT TO CANCEL: </w:t>
       </w:r>
       <w:r>
@@ -4322,16 +4709,27 @@
         </w:rPr>
       </w:pPr>
       <w:r>
-        <w:t xml:space="preserve">STATE:   </w:t>
-      </w:r>
-      <w:r>
-        <w:tab/>
-      </w:r>
-      <w:r>
-        <w:rPr>
-          <w:u w:val="single"/>
-        </w:rPr>
-        <w:t>North Carolina</w:t>
+        <w:t>STATE</w:t>
+      </w:r>
+      <w:proofErr w:type="gramStart"/>
+      <w:r>
+        <w:t xml:space="preserve">:   </w:t>
+      </w:r>
+      <w:r>
+        <w:tab/>
+      </w:r>
+      <w:r>
+        <w:rPr>
+          <w:u w:val="single"/>
+        </w:rPr>
+        <w:t>North</w:t>
+      </w:r>
+      <w:proofErr w:type="gramEnd"/>
+      <w:r>
+        <w:rPr>
+          <w:u w:val="single"/>
+        </w:rPr>
+        <w:t xml:space="preserve"> Carolina</w:t>
       </w:r>
     </w:p>
     <w:p>
@@ -4343,6 +4741,9 @@
       <w:r>
         <w:t>COUNTY:  Wake</w:t>
       </w:r>
+      <w:proofErr w:type="gramStart"/>
+      <w:r/>
+      <w:proofErr w:type="gramEnd"/>
     </w:p>
     <w:p>
       <w:pPr>
@@ -4390,14 +4791,6 @@
         <w:rPr>
           <w:u w:val="single"/>
         </w:rPr>
-      </w:r>
-      <w:r/>
-      <w:r/>
-      <w:r/>
-      <w:r>
-        <w:rPr>
-          <w:u w:val="single"/>
-        </w:rPr>
         <w:tab/>
         <w:tab/>
         <w:tab/>
@@ -4530,7 +4923,14 @@
         <w:rPr>
           <w:rStyle w:val="normaltextrun"/>
         </w:rPr>
-        <w:t>Notary Public </w:t>
+        <w:t xml:space="preserve">Notary </w:t>
+      </w:r>
+      <w:proofErr w:type="gramStart"/>
+      <w:r>
+        <w:rPr>
+          <w:rStyle w:val="normaltextrun"/>
+        </w:rPr>
+        <w:t>Public </w:t>
       </w:r>
       <w:r>
         <w:rPr>
@@ -4542,7 +4942,14 @@
         <w:rPr>
           <w:rStyle w:val="normaltextrun"/>
         </w:rPr>
-        <w:t>My Commission expires:</w:t>
+        <w:t>My</w:t>
+      </w:r>
+      <w:proofErr w:type="gramEnd"/>
+      <w:r>
+        <w:rPr>
+          <w:rStyle w:val="normaltextrun"/>
+        </w:rPr>
+        <w:t xml:space="preserve"> Commission expires:</w:t>
       </w:r>
       <w:r>
         <w:rPr>
@@ -4871,11 +5278,66 @@
           <w:szCs w:val="28"/>
         </w:rPr>
       </w:pPr>
+      <w:proofErr w:type="gramStart"/>
       <w:r>
         <w:rPr>
           <w:szCs w:val="28"/>
         </w:rPr>
         <w:t>[ ] Agent   [X] Seller, by the signature below, acknowledge receipt of $6,000.00 [  ] Cash   [   ] Check, as earnest money deposit, which is credited toward the total down payment mentioned in paragraph 1A of this Agreement. The remaining down payment balance of $14,790.00 shall be paid at closing.</w:t>
+      </w:r>
+      <w:proofErr w:type="gramEnd"/>
+      <w:r>
+        <w:rPr>
+          <w:szCs w:val="28"/>
+        </w:rPr>
+      </w:r>
+      <w:proofErr w:type="gramStart"/>
+      <w:r>
+        <w:rPr>
+          <w:szCs w:val="28"/>
+        </w:rPr>
+      </w:r>
+      <w:proofErr w:type="gramEnd"/>
+      <w:r>
+        <w:rPr>
+          <w:szCs w:val="28"/>
+        </w:rPr>
+      </w:r>
+      <w:proofErr w:type="gramStart"/>
+      <w:r>
+        <w:rPr>
+          <w:szCs w:val="28"/>
+        </w:rPr>
+      </w:r>
+      <w:proofErr w:type="gramEnd"/>
+      <w:r>
+        <w:rPr>
+          <w:szCs w:val="28"/>
+        </w:rPr>
+      </w:r>
+      <w:proofErr w:type="gramStart"/>
+      <w:r>
+        <w:rPr>
+          <w:szCs w:val="28"/>
+        </w:rPr>
+      </w:r>
+      <w:proofErr w:type="gramEnd"/>
+      <w:r>
+        <w:rPr>
+          <w:szCs w:val="28"/>
+        </w:rPr>
+      </w:r>
+      <w:proofErr w:type="gramStart"/>
+      <w:r>
+        <w:rPr>
+          <w:szCs w:val="28"/>
+        </w:rPr>
+      </w:r>
+      <w:proofErr w:type="gramEnd"/>
+      <w:r>
+        <w:rPr>
+          <w:szCs w:val="28"/>
+        </w:rPr>
       </w:r>
     </w:p>
     <w:p>
@@ -5264,16 +5726,27 @@
         </w:rPr>
       </w:pPr>
       <w:r>
-        <w:t xml:space="preserve">STATE:   </w:t>
-      </w:r>
-      <w:r>
-        <w:tab/>
-      </w:r>
-      <w:r>
-        <w:rPr>
-          <w:u w:val="single"/>
-        </w:rPr>
-        <w:t>North Carolina</w:t>
+        <w:t>STATE</w:t>
+      </w:r>
+      <w:proofErr w:type="gramStart"/>
+      <w:r>
+        <w:t xml:space="preserve">:   </w:t>
+      </w:r>
+      <w:r>
+        <w:tab/>
+      </w:r>
+      <w:r>
+        <w:rPr>
+          <w:u w:val="single"/>
+        </w:rPr>
+        <w:t>North</w:t>
+      </w:r>
+      <w:proofErr w:type="gramEnd"/>
+      <w:r>
+        <w:rPr>
+          <w:u w:val="single"/>
+        </w:rPr>
+        <w:t xml:space="preserve"> Carolina</w:t>
       </w:r>
       <w:r>
         <w:rPr>
@@ -5294,6 +5767,9 @@
       <w:r>
         <w:t>COUNTY:  Wake</w:t>
       </w:r>
+      <w:proofErr w:type="gramStart"/>
+      <w:r/>
+      <w:proofErr w:type="gramEnd"/>
     </w:p>
     <w:p>
       <w:pPr>
@@ -5363,12 +5839,6 @@
         <w:rPr>
           <w:u w:val="single"/>
         </w:rPr>
-      </w:r>
-      <w:r/>
-      <w:r>
-        <w:rPr>
-          <w:u w:val="single"/>
-        </w:rPr>
         <w:tab/>
         <w:tab/>
         <w:tab/>
@@ -5407,7 +5877,6 @@
         <w:t>Wes Browning, Manager of Investment Services LLC, Trustee of 320 Rose Pl Real Estate Trust dated March, 5 2025,</w:t>
       </w:r>
       <w:r/>
-      <w:r/>
       <w:r>
         <w:t xml:space="preserve"> personally appeared before me this day and acknowledged the execution of the foregoing instrument.  Witness my hand and notarial seal,</w:t>
       </w:r>
@@ -5587,7 +6056,14 @@
         <w:rPr>
           <w:rStyle w:val="normaltextrun"/>
         </w:rPr>
-        <w:t>Notary Public </w:t>
+        <w:t xml:space="preserve">Notary </w:t>
+      </w:r>
+      <w:proofErr w:type="gramStart"/>
+      <w:r>
+        <w:rPr>
+          <w:rStyle w:val="normaltextrun"/>
+        </w:rPr>
+        <w:t>Public </w:t>
       </w:r>
       <w:r>
         <w:rPr>
@@ -5599,7 +6075,14 @@
         <w:rPr>
           <w:rStyle w:val="normaltextrun"/>
         </w:rPr>
-        <w:t>My Commission expires:</w:t>
+        <w:t>My</w:t>
+      </w:r>
+      <w:proofErr w:type="gramEnd"/>
+      <w:r>
+        <w:rPr>
+          <w:rStyle w:val="normaltextrun"/>
+        </w:rPr>
+        <w:t xml:space="preserve"> Commission expires:</w:t>
       </w:r>
       <w:r>
         <w:rPr>
@@ -7175,6 +7658,7 @@
   <w:style w:type="character" w:default="1" w:styleId="DefaultParagraphFont">
     <w:name w:val="Default Paragraph Font"/>
     <w:uiPriority w:val="1"/>
+    <w:semiHidden/>
     <w:unhideWhenUsed/>
   </w:style>
   <w:style w:type="table" w:default="1" w:styleId="TableNormal">
@@ -7921,7 +8405,15 @@
 </file>
 
 <file path=customXml/item2.xml><?xml version="1.0" encoding="utf-8"?>
-<b:Sources xmlns:b="http://schemas.openxmlformats.org/officeDocument/2006/bibliography" xmlns="http://schemas.openxmlformats.org/officeDocument/2006/bibliography" SelectedStyle="\APASixthEditionOfficeOnline.xsl" StyleName="APA" Version="6"/>
+<p:properties xmlns:p="http://schemas.microsoft.com/office/2006/metadata/properties" xmlns:xsi="http://www.w3.org/2001/XMLSchema-instance" xmlns:pc="http://schemas.microsoft.com/office/infopath/2007/PartnerControls">
+  <documentManagement>
+    <TaxCatchAll xmlns="42cc25d9-27fe-4f07-accb-ded05ec47eee" xsi:nil="true"/>
+    <lcf76f155ced4ddcb4097134ff3c332f xmlns="ab9fedca-001d-4cc9-b244-d9c3be5a27d3">
+      <Terms xmlns="http://schemas.microsoft.com/office/infopath/2007/PartnerControls"/>
+    </lcf76f155ced4ddcb4097134ff3c332f>
+    <_Flow_SignoffStatus xmlns="ab9fedca-001d-4cc9-b244-d9c3be5a27d3" xsi:nil="true"/>
+  </documentManagement>
+</p:properties>
 </file>
 
 <file path=customXml/item3.xml><?xml version="1.0" encoding="utf-8"?>
@@ -8186,15 +8678,7 @@
 </file>
 
 <file path=customXml/item4.xml><?xml version="1.0" encoding="utf-8"?>
-<p:properties xmlns:p="http://schemas.microsoft.com/office/2006/metadata/properties" xmlns:xsi="http://www.w3.org/2001/XMLSchema-instance" xmlns:pc="http://schemas.microsoft.com/office/infopath/2007/PartnerControls">
-  <documentManagement>
-    <TaxCatchAll xmlns="42cc25d9-27fe-4f07-accb-ded05ec47eee" xsi:nil="true"/>
-    <lcf76f155ced4ddcb4097134ff3c332f xmlns="ab9fedca-001d-4cc9-b244-d9c3be5a27d3">
-      <Terms xmlns="http://schemas.microsoft.com/office/infopath/2007/PartnerControls"/>
-    </lcf76f155ced4ddcb4097134ff3c332f>
-    <_Flow_SignoffStatus xmlns="ab9fedca-001d-4cc9-b244-d9c3be5a27d3" xsi:nil="true"/>
-  </documentManagement>
-</p:properties>
+<b:Sources xmlns:b="http://schemas.openxmlformats.org/officeDocument/2006/bibliography" xmlns="http://schemas.openxmlformats.org/officeDocument/2006/bibliography" SelectedStyle="\APASixthEditionOfficeOnline.xsl" StyleName="APA" Version="6"/>
 </file>
 
 <file path=customXml/itemProps1.xml><?xml version="1.0" encoding="utf-8"?>
@@ -8206,9 +8690,12 @@
 </file>
 
 <file path=customXml/itemProps2.xml><?xml version="1.0" encoding="utf-8"?>
-<ds:datastoreItem xmlns:ds="http://schemas.openxmlformats.org/officeDocument/2006/customXml" ds:itemID="{3679C442-D341-425F-8964-A65FCEFD3D9B}">
+<ds:datastoreItem xmlns:ds="http://schemas.openxmlformats.org/officeDocument/2006/customXml" ds:itemID="{1A4736DD-7889-4919-A280-9BE82A810A58}">
   <ds:schemaRefs>
-    <ds:schemaRef ds:uri="http://schemas.openxmlformats.org/officeDocument/2006/bibliography"/>
+    <ds:schemaRef ds:uri="http://schemas.microsoft.com/office/2006/metadata/properties"/>
+    <ds:schemaRef ds:uri="http://schemas.microsoft.com/office/infopath/2007/PartnerControls"/>
+    <ds:schemaRef ds:uri="42cc25d9-27fe-4f07-accb-ded05ec47eee"/>
+    <ds:schemaRef ds:uri="ab9fedca-001d-4cc9-b244-d9c3be5a27d3"/>
   </ds:schemaRefs>
 </ds:datastoreItem>
 </file>
@@ -8233,12 +8720,9 @@
 </file>
 
 <file path=customXml/itemProps4.xml><?xml version="1.0" encoding="utf-8"?>
-<ds:datastoreItem xmlns:ds="http://schemas.openxmlformats.org/officeDocument/2006/customXml" ds:itemID="{1A4736DD-7889-4919-A280-9BE82A810A58}">
+<ds:datastoreItem xmlns:ds="http://schemas.openxmlformats.org/officeDocument/2006/customXml" ds:itemID="{3679C442-D341-425F-8964-A65FCEFD3D9B}">
   <ds:schemaRefs>
-    <ds:schemaRef ds:uri="http://schemas.microsoft.com/office/2006/metadata/properties"/>
-    <ds:schemaRef ds:uri="http://schemas.microsoft.com/office/infopath/2007/PartnerControls"/>
-    <ds:schemaRef ds:uri="42cc25d9-27fe-4f07-accb-ded05ec47eee"/>
-    <ds:schemaRef ds:uri="ab9fedca-001d-4cc9-b244-d9c3be5a27d3"/>
+    <ds:schemaRef ds:uri="http://schemas.openxmlformats.org/officeDocument/2006/bibliography"/>
   </ds:schemaRefs>
 </ds:datastoreItem>
 </file>
</xml_diff>

<commit_message>
Recreate Rose package from latest contract edits
</commit_message>
<xml_diff>
--- a/Project Rooms/Contract for Deed/output/320 Rose - Contract for Deed Agreement - ATTORNEY REVIEW PACKAGE.docx
+++ b/Project Rooms/Contract for Deed/output/320 Rose - Contract for Deed Agreement - ATTORNEY REVIEW PACKAGE.docx
@@ -113,20 +113,7 @@
           <w:szCs w:val="28"/>
         </w:rPr>
         <w:tab/>
-      </w:r>
-      <w:proofErr w:type="gramStart"/>
-      <w:r>
-        <w:rPr>
-          <w:szCs w:val="28"/>
-        </w:rPr>
-        <w:t>Whose</w:t>
-      </w:r>
-      <w:proofErr w:type="gramEnd"/>
-      <w:r>
-        <w:rPr>
-          <w:szCs w:val="28"/>
-        </w:rPr>
-        <w:t xml:space="preserve"> principal address is:</w:t>
+        <w:t>Whose principal address is:</w:t>
       </w:r>
     </w:p>
     <w:p>
@@ -1330,21 +1317,7 @@
         <w:rPr>
           <w:szCs w:val="24"/>
         </w:rPr>
-        <w:t xml:space="preserve">Existing mortgage balance encumbering the Property to </w:t>
-      </w:r>
-      <w:proofErr w:type="gramStart"/>
-      <w:r>
-        <w:rPr>
-          <w:szCs w:val="24"/>
-        </w:rPr>
-        <w:t>be taken</w:t>
-      </w:r>
-      <w:proofErr w:type="gramEnd"/>
-      <w:r>
-        <w:rPr>
-          <w:szCs w:val="24"/>
-        </w:rPr>
-        <w:t xml:space="preserve"> subject to by Purchaser (approximately).                     </w:t>
+        <w:t xml:space="preserve">Existing mortgage balance encumbering the Property to be taken subject to by Purchaser (approximately).                     </w:t>
       </w:r>
       <w:r>
         <w:rPr>
@@ -1378,21 +1351,7 @@
         <w:rPr>
           <w:szCs w:val="24"/>
         </w:rPr>
-        <w:t xml:space="preserve">Total Purchase </w:t>
-      </w:r>
-      <w:proofErr w:type="gramStart"/>
-      <w:r>
-        <w:rPr>
-          <w:szCs w:val="24"/>
-        </w:rPr>
-        <w:t>Price  -</w:t>
-      </w:r>
-      <w:proofErr w:type="gramEnd"/>
-      <w:r>
-        <w:rPr>
-          <w:szCs w:val="24"/>
-        </w:rPr>
-        <w:t xml:space="preserve"> exactly</w:t>
+        <w:t>Total Purchase Price  - exactly</w:t>
       </w:r>
       <w:r>
         <w:rPr>
@@ -1452,21 +1411,7 @@
         <w:rPr>
           <w:szCs w:val="28"/>
         </w:rPr>
-        <w:t xml:space="preserve">Purchaser agrees to provide </w:t>
-      </w:r>
-      <w:proofErr w:type="gramStart"/>
-      <w:r>
-        <w:rPr>
-          <w:szCs w:val="28"/>
-        </w:rPr>
-        <w:t>an additional</w:t>
-      </w:r>
-      <w:proofErr w:type="gramEnd"/>
-      <w:r>
-        <w:rPr>
-          <w:szCs w:val="28"/>
-        </w:rPr>
-        <w:t xml:space="preserve"> charges and fees associated with the recording of a Memorandum of (this) Contract for Deed and administrative costs of the Seller</w:t>
+        <w:t>Purchaser agrees to provide an additional charges and fees associated with the recording of a Memorandum of (this) Contract for Deed and administrative costs of the Seller</w:t>
       </w:r>
       <w:r>
         <w:rPr>
@@ -1595,59 +1540,27 @@
         <w:rPr>
           <w:szCs w:val="28"/>
         </w:rPr>
-        <w:t xml:space="preserve"> Wood Destroying Organism </w:t>
-      </w:r>
-      <w:proofErr w:type="gramStart"/>
-      <w:r>
-        <w:rPr>
-          <w:szCs w:val="28"/>
-        </w:rPr>
-        <w:t xml:space="preserve">Report </w:t>
-      </w:r>
-      <w:r>
-        <w:rPr>
-          <w:szCs w:val="28"/>
-        </w:rPr>
-        <w:tab/>
-      </w:r>
-      <w:r>
-        <w:rPr>
-          <w:b/>
-          <w:bCs/>
-          <w:szCs w:val="28"/>
-        </w:rPr>
-        <w:t>[</w:t>
-      </w:r>
-      <w:proofErr w:type="gramEnd"/>
-      <w:r>
-        <w:rPr>
-          <w:b/>
-          <w:bCs/>
-          <w:szCs w:val="28"/>
-        </w:rPr>
-        <w:t>X</w:t>
-      </w:r>
-      <w:proofErr w:type="gramStart"/>
-      <w:r>
-        <w:rPr>
-          <w:b/>
-          <w:bCs/>
-          <w:szCs w:val="28"/>
-        </w:rPr>
-        <w:t>]</w:t>
-      </w:r>
-      <w:r>
-        <w:rPr>
-          <w:szCs w:val="28"/>
-        </w:rPr>
-        <w:t xml:space="preserve">  Real</w:t>
-      </w:r>
-      <w:proofErr w:type="gramEnd"/>
-      <w:r>
-        <w:rPr>
-          <w:szCs w:val="28"/>
-        </w:rPr>
-        <w:t xml:space="preserve"> estate brokerage fee</w:t>
+        <w:t xml:space="preserve"> Wood Destroying Organism Report </w:t>
+      </w:r>
+      <w:r>
+        <w:rPr>
+          <w:szCs w:val="28"/>
+        </w:rPr>
+        <w:tab/>
+      </w:r>
+      <w:r>
+        <w:rPr>
+          <w:b/>
+          <w:bCs/>
+          <w:szCs w:val="28"/>
+        </w:rPr>
+        <w:t>[X]</w:t>
+      </w:r>
+      <w:r>
+        <w:rPr>
+          <w:szCs w:val="28"/>
+        </w:rPr>
+        <w:t xml:space="preserve">  Real estate brokerage fee</w:t>
       </w:r>
     </w:p>
     <w:p>
@@ -1707,21 +1620,7 @@
         <w:rPr>
           <w:szCs w:val="28"/>
         </w:rPr>
-        <w:t xml:space="preserve">[ </w:t>
-      </w:r>
-      <w:proofErr w:type="gramStart"/>
-      <w:r>
-        <w:rPr>
-          <w:szCs w:val="28"/>
-        </w:rPr>
-        <w:t xml:space="preserve">  ]</w:t>
-      </w:r>
-      <w:proofErr w:type="gramEnd"/>
-      <w:r>
-        <w:rPr>
-          <w:szCs w:val="28"/>
-        </w:rPr>
-        <w:t xml:space="preserve"> Other______________________________________</w:t>
+        <w:t>[   ] Other______________________________________</w:t>
       </w:r>
     </w:p>
     <w:p>
@@ -1811,34 +1710,16 @@
           <w:bCs/>
           <w:szCs w:val="28"/>
         </w:rPr>
-        <w:t xml:space="preserve">[X]Title insurance </w:t>
-      </w:r>
-      <w:proofErr w:type="gramStart"/>
-      <w:r>
-        <w:rPr>
-          <w:b/>
-          <w:bCs/>
-          <w:szCs w:val="28"/>
-        </w:rPr>
-        <w:t xml:space="preserve">policy   </w:t>
-      </w:r>
-      <w:r>
-        <w:rPr>
-          <w:b/>
-          <w:bCs/>
-          <w:szCs w:val="28"/>
-        </w:rPr>
-        <w:tab/>
-        <w:t>[</w:t>
-      </w:r>
-      <w:proofErr w:type="gramEnd"/>
-      <w:r>
-        <w:rPr>
-          <w:b/>
-          <w:bCs/>
-          <w:szCs w:val="28"/>
-        </w:rPr>
-        <w:t xml:space="preserve">X] Attorney's fee </w:t>
+        <w:t xml:space="preserve">[X]Title insurance policy   </w:t>
+      </w:r>
+      <w:r>
+        <w:rPr>
+          <w:b/>
+          <w:bCs/>
+          <w:szCs w:val="28"/>
+        </w:rPr>
+        <w:tab/>
+        <w:t xml:space="preserve">[X] Attorney's fee </w:t>
       </w:r>
     </w:p>
     <w:p>
@@ -1863,34 +1744,16 @@
           <w:bCs/>
           <w:szCs w:val="28"/>
         </w:rPr>
-        <w:t xml:space="preserve">[X] Closing </w:t>
-      </w:r>
-      <w:proofErr w:type="gramStart"/>
-      <w:r>
-        <w:rPr>
-          <w:b/>
-          <w:bCs/>
-          <w:szCs w:val="28"/>
-        </w:rPr>
-        <w:t xml:space="preserve">Costs   </w:t>
-      </w:r>
-      <w:r>
-        <w:rPr>
-          <w:b/>
-          <w:bCs/>
-          <w:szCs w:val="28"/>
-        </w:rPr>
-        <w:tab/>
-        <w:t>[</w:t>
-      </w:r>
-      <w:proofErr w:type="gramEnd"/>
-      <w:r>
-        <w:rPr>
-          <w:b/>
-          <w:bCs/>
-          <w:szCs w:val="28"/>
-        </w:rPr>
-        <w:t xml:space="preserve">X] Recording fees   </w:t>
+        <w:t xml:space="preserve">[X] Closing Costs   </w:t>
+      </w:r>
+      <w:r>
+        <w:rPr>
+          <w:b/>
+          <w:bCs/>
+          <w:szCs w:val="28"/>
+        </w:rPr>
+        <w:tab/>
+        <w:t xml:space="preserve">[X] Recording fees   </w:t>
       </w:r>
     </w:p>
     <w:p>
@@ -1915,34 +1778,16 @@
           <w:bCs/>
           <w:szCs w:val="28"/>
         </w:rPr>
-        <w:t xml:space="preserve">[X] Note </w:t>
-      </w:r>
-      <w:proofErr w:type="gramStart"/>
-      <w:r>
-        <w:rPr>
-          <w:b/>
-          <w:bCs/>
-          <w:szCs w:val="28"/>
-        </w:rPr>
-        <w:t xml:space="preserve">stamps   </w:t>
-      </w:r>
-      <w:r>
-        <w:rPr>
-          <w:b/>
-          <w:bCs/>
-          <w:szCs w:val="28"/>
-        </w:rPr>
-        <w:tab/>
-        <w:t>[</w:t>
-      </w:r>
-      <w:proofErr w:type="gramEnd"/>
-      <w:r>
-        <w:rPr>
-          <w:b/>
-          <w:bCs/>
-          <w:szCs w:val="28"/>
-        </w:rPr>
-        <w:t xml:space="preserve">X] Intangible tax    </w:t>
+        <w:t xml:space="preserve">[X] Note stamps   </w:t>
+      </w:r>
+      <w:r>
+        <w:rPr>
+          <w:b/>
+          <w:bCs/>
+          <w:szCs w:val="28"/>
+        </w:rPr>
+        <w:tab/>
+        <w:t xml:space="preserve">[X] Intangible tax    </w:t>
       </w:r>
     </w:p>
     <w:p>
@@ -1986,42 +1831,14 @@
         <w:rPr>
           <w:szCs w:val="28"/>
         </w:rPr>
-        <w:t xml:space="preserve">[ </w:t>
-      </w:r>
-      <w:proofErr w:type="gramStart"/>
-      <w:r>
-        <w:rPr>
-          <w:szCs w:val="28"/>
-        </w:rPr>
-        <w:t xml:space="preserve">  ]</w:t>
-      </w:r>
-      <w:proofErr w:type="gramEnd"/>
-      <w:r>
-        <w:rPr>
-          <w:szCs w:val="28"/>
-        </w:rPr>
-        <w:t xml:space="preserve"> Credit reports   </w:t>
-      </w:r>
-      <w:r>
-        <w:rPr>
-          <w:szCs w:val="28"/>
-        </w:rPr>
-        <w:tab/>
-        <w:t xml:space="preserve">[ </w:t>
-      </w:r>
-      <w:proofErr w:type="gramStart"/>
-      <w:r>
-        <w:rPr>
-          <w:szCs w:val="28"/>
-        </w:rPr>
-        <w:t xml:space="preserve">  ]</w:t>
-      </w:r>
-      <w:proofErr w:type="gramEnd"/>
-      <w:r>
-        <w:rPr>
-          <w:szCs w:val="28"/>
-        </w:rPr>
-        <w:t xml:space="preserve"> Loan origination fee   </w:t>
+        <w:t xml:space="preserve">[   ] Credit reports   </w:t>
+      </w:r>
+      <w:r>
+        <w:rPr>
+          <w:szCs w:val="28"/>
+        </w:rPr>
+        <w:tab/>
+        <w:t xml:space="preserve">[   ] Loan origination fee   </w:t>
       </w:r>
     </w:p>
     <w:p>
@@ -2042,42 +1859,14 @@
         <w:rPr>
           <w:szCs w:val="28"/>
         </w:rPr>
-        <w:t xml:space="preserve">[ </w:t>
-      </w:r>
-      <w:proofErr w:type="gramStart"/>
-      <w:r>
-        <w:rPr>
-          <w:szCs w:val="28"/>
-        </w:rPr>
-        <w:t xml:space="preserve">  ]</w:t>
-      </w:r>
-      <w:proofErr w:type="gramEnd"/>
-      <w:r>
-        <w:rPr>
-          <w:szCs w:val="28"/>
-        </w:rPr>
-        <w:t xml:space="preserve"> Loan insurance premium   </w:t>
-      </w:r>
-      <w:r>
-        <w:rPr>
-          <w:szCs w:val="28"/>
-        </w:rPr>
-        <w:tab/>
-        <w:t xml:space="preserve">[ </w:t>
-      </w:r>
-      <w:proofErr w:type="gramStart"/>
-      <w:r>
-        <w:rPr>
-          <w:szCs w:val="28"/>
-        </w:rPr>
-        <w:t xml:space="preserve">  ]</w:t>
-      </w:r>
-      <w:proofErr w:type="gramEnd"/>
-      <w:r>
-        <w:rPr>
-          <w:szCs w:val="28"/>
-        </w:rPr>
-        <w:t xml:space="preserve"> Other_________________________________</w:t>
+        <w:t xml:space="preserve">[   ] Loan insurance premium   </w:t>
+      </w:r>
+      <w:r>
+        <w:rPr>
+          <w:szCs w:val="28"/>
+        </w:rPr>
+        <w:tab/>
+        <w:t>[   ] Other_________________________________</w:t>
       </w:r>
     </w:p>
     <w:p>
@@ -2094,19 +1883,11 @@
           <w:szCs w:val="28"/>
         </w:rPr>
       </w:pPr>
-      <w:proofErr w:type="gramStart"/>
-      <w:r>
-        <w:rPr>
-          <w:szCs w:val="28"/>
-        </w:rPr>
-        <w:t>[  ]</w:t>
-      </w:r>
-      <w:proofErr w:type="gramEnd"/>
-      <w:r>
-        <w:rPr>
-          <w:szCs w:val="28"/>
-        </w:rPr>
-        <w:t xml:space="preserve"> All other charges required by lender which Purchaser is prohibited from paying by law or regulation.</w:t>
+      <w:r>
+        <w:rPr>
+          <w:szCs w:val="28"/>
+        </w:rPr>
+        <w:t>[  ] All other charges required by lender which Purchaser is prohibited from paying by law or regulation.</w:t>
       </w:r>
     </w:p>
     <w:p>
@@ -2122,21 +1903,7 @@
         <w:rPr>
           <w:szCs w:val="28"/>
         </w:rPr>
-        <w:t xml:space="preserve">[ </w:t>
-      </w:r>
-      <w:proofErr w:type="gramStart"/>
-      <w:r>
-        <w:rPr>
-          <w:szCs w:val="28"/>
-        </w:rPr>
-        <w:t xml:space="preserve">  ]</w:t>
-      </w:r>
-      <w:proofErr w:type="gramEnd"/>
-      <w:r>
-        <w:rPr>
-          <w:szCs w:val="28"/>
-        </w:rPr>
-        <w:t xml:space="preserve"> Repairs or replacements, in addition to those in paragraph 9, not to exceed $_________________________</w:t>
+        <w:t>[   ] Repairs or replacements, in addition to those in paragraph 9, not to exceed $_________________________</w:t>
       </w:r>
     </w:p>
     <w:p>
@@ -2152,21 +1919,7 @@
         <w:rPr>
           <w:szCs w:val="28"/>
         </w:rPr>
-        <w:t xml:space="preserve">[ </w:t>
-      </w:r>
-      <w:proofErr w:type="gramStart"/>
-      <w:r>
-        <w:rPr>
-          <w:szCs w:val="28"/>
-        </w:rPr>
-        <w:t xml:space="preserve">  ]</w:t>
-      </w:r>
-      <w:proofErr w:type="gramEnd"/>
-      <w:r>
-        <w:rPr>
-          <w:szCs w:val="28"/>
-        </w:rPr>
-        <w:t xml:space="preserve"> All mortgage payments or condominium and association fees will be </w:t>
+        <w:t xml:space="preserve">[   ] All mortgage payments or condominium and association fees will be </w:t>
       </w:r>
       <w:r>
         <w:rPr>
@@ -2854,20 +2607,6 @@
           <w:bCs/>
         </w:rPr>
       </w:r>
-      <w:proofErr w:type="gramStart"/>
-      <w:r>
-        <w:rPr>
-          <w:b/>
-          <w:bCs/>
-        </w:rPr>
-      </w:r>
-      <w:proofErr w:type="gramEnd"/>
-      <w:r>
-        <w:rPr>
-          <w:b/>
-          <w:bCs/>
-        </w:rPr>
-      </w:r>
     </w:p>
     <w:p>
       <w:pPr>
@@ -2908,21 +2647,7 @@
           <w:szCs w:val="24"/>
         </w:rPr>
         <w:lastRenderedPageBreak/>
-        <w:t xml:space="preserve">STAT. CHAPTER 47H. A CONTRACT FOR DEED CANNOT BE FORFEITED UNLESS A BREACH HAS OCCURRED IN ONE OR MORE OF </w:t>
-      </w:r>
-      <w:proofErr w:type="gramStart"/>
-      <w:r>
-        <w:rPr>
-          <w:szCs w:val="24"/>
-        </w:rPr>
-        <w:t>THE PURCHASER’S</w:t>
-      </w:r>
-      <w:proofErr w:type="gramEnd"/>
-      <w:r>
-        <w:rPr>
-          <w:szCs w:val="24"/>
-        </w:rPr>
-        <w:t xml:space="preserve"> EXPRESS OBLIGATIONS UNDER THE CONTRACT AND THE CONTRACT PROVIDES THAT AS A RESULT OF SUCH BREACH THE SELLER IS ENTITLED TO FORFEIT THE CONTRACT. EXAMPLES OF BREACH OF CONTRACT INCLUDE LACK OF PAYMENT EXTENDING BEYOND 15 DAYS OF DUE DATE, PROHIBITED USE OF PROPERTY, FRAUDULENT IDENTIFICATION, AND FRAUDULENT PAYMENTS. FURTHERMORE, THE PURCHASER’S RIGHTS SHALL NOT BE FORFEITED UNTIL THE PURCHASER HAS BEEN NOTIFIED OF THE INTENT TO FORFEIT IN ACCORDANCE WITH N.C. GEN. STAT. 47H-4 AND BEEN GIVEN A RIGHT TO CURE THE DEFAULT AND HAS FAILED TO DO SO WITHIN THE TIME PERIOD ALLOWED. A TIMELY TENDER OF CURE SHALL REINSTATE THE CONTRACT FOR DEED.</w:t>
+        <w:t>STAT. CHAPTER 47H. A CONTRACT FOR DEED CANNOT BE FORFEITED UNLESS A BREACH HAS OCCURRED IN ONE OR MORE OF THE PURCHASER’S EXPRESS OBLIGATIONS UNDER THE CONTRACT AND THE CONTRACT PROVIDES THAT AS A RESULT OF SUCH BREACH THE SELLER IS ENTITLED TO FORFEIT THE CONTRACT. EXAMPLES OF BREACH OF CONTRACT INCLUDE LACK OF PAYMENT EXTENDING BEYOND 15 DAYS OF DUE DATE, PROHIBITED USE OF PROPERTY, FRAUDULENT IDENTIFICATION, AND FRAUDULENT PAYMENTS. FURTHERMORE, THE PURCHASER’S RIGHTS SHALL NOT BE FORFEITED UNTIL THE PURCHASER HAS BEEN NOTIFIED OF THE INTENT TO FORFEIT IN ACCORDANCE WITH N.C. GEN. STAT. 47H-4 AND BEEN GIVEN A RIGHT TO CURE THE DEFAULT AND HAS FAILED TO DO SO WITHIN THE TIME PERIOD ALLOWED. A TIMELY TENDER OF CURE SHALL REINSTATE THE CONTRACT FOR DEED.</w:t>
       </w:r>
     </w:p>
     <w:p>
@@ -2967,21 +2692,7 @@
         <w:rPr>
           <w:szCs w:val="24"/>
         </w:rPr>
-        <w:t xml:space="preserve">Any unauthorized or unpermitted construction, improvements, excavation (to include clearing, logging, and planting), or otherwise altering the property from its original condition at the time this contract is executed is prohibited.  Authorization may be given by the Seller for certain improvements if Purchaser </w:t>
-      </w:r>
-      <w:proofErr w:type="gramStart"/>
-      <w:r>
-        <w:rPr>
-          <w:szCs w:val="24"/>
-        </w:rPr>
-        <w:t>submits an application</w:t>
-      </w:r>
-      <w:proofErr w:type="gramEnd"/>
-      <w:r>
-        <w:rPr>
-          <w:szCs w:val="24"/>
-        </w:rPr>
-        <w:t xml:space="preserve"> in writing to make changes and receives authorization in writing from Seller.  Authorization will be withheld or granted solely at the discretion of the Seller. Additionally, any use not permitted by local, state, and federal laws and ordinances is prohibited. </w:t>
+        <w:t xml:space="preserve">Any unauthorized or unpermitted construction, improvements, excavation (to include clearing, logging, and planting), or otherwise altering the property from its original condition at the time this contract is executed is prohibited.  Authorization may be given by the Seller for certain improvements if Purchaser submits an application in writing to make changes and receives authorization in writing from Seller.  Authorization will be withheld or granted solely at the discretion of the Seller. Additionally, any use not permitted by local, state, and federal laws and ordinances is prohibited. </w:t>
       </w:r>
     </w:p>
     <w:p>
@@ -3016,21 +2727,7 @@
         <w:rPr>
           <w:szCs w:val="24"/>
         </w:rPr>
-        <w:t xml:space="preserve"> Purchaser may prepay some or </w:t>
-      </w:r>
-      <w:proofErr w:type="gramStart"/>
-      <w:r>
-        <w:rPr>
-          <w:szCs w:val="24"/>
-        </w:rPr>
-        <w:t>all of</w:t>
-      </w:r>
-      <w:proofErr w:type="gramEnd"/>
-      <w:r>
-        <w:rPr>
-          <w:szCs w:val="24"/>
-        </w:rPr>
-        <w:t xml:space="preserve"> the remaining Balance Owed on this contract at any time.</w:t>
+        <w:t xml:space="preserve"> Purchaser may prepay some or all of the remaining Balance Owed on this contract at any time.</w:t>
       </w:r>
     </w:p>
     <w:p>
@@ -3407,21 +3104,7 @@
         <w:rPr>
           <w:szCs w:val="28"/>
         </w:rPr>
-        <w:t xml:space="preserve"> has </w:t>
-      </w:r>
-      <w:proofErr w:type="gramStart"/>
-      <w:r>
-        <w:rPr>
-          <w:szCs w:val="28"/>
-        </w:rPr>
-        <w:t>[  ]</w:t>
-      </w:r>
-      <w:proofErr w:type="gramEnd"/>
-      <w:r>
-        <w:rPr>
-          <w:szCs w:val="28"/>
-        </w:rPr>
-        <w:t xml:space="preserve"> has not inspected the property and HAS NOT RELIED UPON ANY REPRESENTATIONS MADE BY ANY REAL ESTATE AGENT in describing the property, and Purchaser accepts the property in its PRESENT AS IS CONDITION, except as </w:t>
+        <w:t xml:space="preserve"> has [  ] has not inspected the property and HAS NOT RELIED UPON ANY REPRESENTATIONS MADE BY ANY REAL ESTATE AGENT in describing the property, and Purchaser accepts the property in its PRESENT AS IS CONDITION, except as </w:t>
       </w:r>
       <w:r>
         <w:rPr>
@@ -3430,6 +3113,15 @@
         <w:lastRenderedPageBreak/>
         <w:t>otherwise specified herein.</w:t>
       </w:r>
+    </w:p>
+    <w:p>
+      <w:pPr>
+        <w:ind w:left="360"/>
+        <w:jc w:val="both"/>
+        <w:rPr>
+          <w:szCs w:val="28"/>
+        </w:rPr>
+      </w:pPr>
     </w:p>
     <w:p>
       <w:pPr>
@@ -3571,25 +3263,7 @@
           <w:bCs/>
           <w:szCs w:val="28"/>
         </w:rPr>
-        <w:t xml:space="preserve">[ </w:t>
-      </w:r>
-      <w:proofErr w:type="gramStart"/>
-      <w:r>
-        <w:rPr>
-          <w:b/>
-          <w:bCs/>
-          <w:szCs w:val="28"/>
-        </w:rPr>
-        <w:t xml:space="preserve">  ]</w:t>
-      </w:r>
-      <w:proofErr w:type="gramEnd"/>
-      <w:r>
-        <w:rPr>
-          <w:b/>
-          <w:bCs/>
-          <w:szCs w:val="28"/>
-        </w:rPr>
-        <w:t xml:space="preserve"> _____________days after date of satisfaction of all conditions in paragraph 19 unless extended by other conditions of this Agreement or this agreement is cancelled by the Purchaser.</w:t>
+        <w:t>[   ] _____________days after date of satisfaction of all conditions in paragraph 19 unless extended by other conditions of this Agreement or this agreement is cancelled by the Purchaser.</w:t>
       </w:r>
       <w:r>
         <w:rPr>
@@ -3678,29 +3352,13 @@
         <w:t xml:space="preserve">Additional Terms, Conditions or Addenda (lettered </w:t>
       </w:r>
       <w:proofErr w:type="spellStart"/>
-      <w:proofErr w:type="gramStart"/>
-      <w:r>
-        <w:rPr>
-          <w:szCs w:val="28"/>
-        </w:rPr>
-        <w:t>a,b</w:t>
-      </w:r>
-      <w:proofErr w:type="gramEnd"/>
-      <w:r>
-        <w:rPr>
-          <w:szCs w:val="28"/>
-        </w:rPr>
-        <w:t>,</w:t>
-      </w:r>
-      <w:proofErr w:type="gramStart"/>
-      <w:r>
-        <w:rPr>
-          <w:szCs w:val="28"/>
-        </w:rPr>
-        <w:t>c,d</w:t>
+      <w:r>
+        <w:rPr>
+          <w:szCs w:val="28"/>
+        </w:rPr>
+        <w:t>a,b,c,d</w:t>
       </w:r>
       <w:proofErr w:type="spellEnd"/>
-      <w:proofErr w:type="gramEnd"/>
       <w:r>
         <w:rPr>
           <w:szCs w:val="28"/>
@@ -3734,18 +3392,6 @@
         </w:rPr>
         <w:t>This Contract is signed subject to any changes Seller's attorney may make or require. The parties shall sign the Contract again at closing, or execute any required amendment, with any such attorney-required alterations incorporated. If such changes are material and Purchaser does not agree to proceed, Seller may elect to proceed under the previously signed Contract. If Seller does not so elect, Purchaser's due diligence funds shall be returned to Purchaser.</w:t>
       </w:r>
-      <w:proofErr w:type="gramStart"/>
-      <w:r>
-        <w:rPr>
-          <w:bCs/>
-        </w:rPr>
-      </w:r>
-      <w:proofErr w:type="gramEnd"/>
-      <w:r>
-        <w:rPr>
-          <w:bCs/>
-        </w:rPr>
-      </w:r>
     </w:p>
     <w:p>
       <w:pPr>
@@ -3822,7 +3468,16 @@
           <w:sz w:val="22"/>
           <w:szCs w:val="22"/>
         </w:rPr>
-        <w:t>This is explicitly a Contract for Deed. No transfer of deed will be done until the terms of the purchase are satisfied. See the Promissory Note for details.</w:t>
+        <w:t xml:space="preserve">This is explicitly a Contract for Deed. No transfer of deed will be done until the terms of the </w:t>
+      </w:r>
+      <w:r>
+        <w:rPr>
+          <w:bCs/>
+          <w:sz w:val="22"/>
+          <w:szCs w:val="22"/>
+        </w:rPr>
+        <w:lastRenderedPageBreak/>
+        <w:t>purchase are satisfied. See the Promissory Note for details.</w:t>
       </w:r>
     </w:p>
     <w:p>
@@ -3844,7 +3499,6 @@
           <w:sz w:val="22"/>
           <w:szCs w:val="22"/>
         </w:rPr>
-        <w:lastRenderedPageBreak/>
         <w:t>If the Purchaser defaults on terms of this contract or the promissory note, the remedy for the Seller is eviction, not foreclosure.</w:t>
       </w:r>
     </w:p>
@@ -3985,34 +3639,6 @@
         </w:rPr>
         <w:tab/>
       </w:r>
-      <w:r>
-        <w:rPr>
-          <w:szCs w:val="28"/>
-          <w:u w:val="single"/>
-        </w:rPr>
-        <w:t xml:space="preserve">     </w:t>
-      </w:r>
-      <w:proofErr w:type="gramStart"/>
-      <w:r>
-        <w:rPr>
-          <w:szCs w:val="28"/>
-          <w:u w:val="single"/>
-        </w:rPr>
-        <w:t xml:space="preserve">  </w:t>
-      </w:r>
-      <w:r>
-        <w:rPr>
-          <w:szCs w:val="28"/>
-        </w:rPr>
-        <w:t>.</w:t>
-      </w:r>
-      <w:proofErr w:type="gramEnd"/>
-      <w:r>
-        <w:rPr>
-          <w:szCs w:val="28"/>
-        </w:rPr>
-        <w:t xml:space="preserve"> </w:t>
-      </w:r>
     </w:p>
     <w:p>
       <w:pPr>
@@ -4025,6 +3651,111 @@
         <w:ind w:left="630"/>
         <w:rPr>
           <w:szCs w:val="28"/>
+        </w:rPr>
+      </w:pPr>
+    </w:p>
+    <w:p>
+      <w:pPr>
+        <w:pStyle w:val="p6"/>
+        <w:numPr>
+          <w:ilvl w:val="1"/>
+          <w:numId w:val="10"/>
+        </w:numPr>
+        <w:tabs>
+          <w:tab w:val="clear" w:pos="720"/>
+          <w:tab w:val="left" w:pos="270"/>
+        </w:tabs>
+        <w:spacing w:line="264" w:lineRule="auto"/>
+        <w:ind w:left="630"/>
+        <w:jc w:val="both"/>
+        <w:rPr>
+          <w:b/>
+          <w:bCs/>
+          <w:szCs w:val="24"/>
+        </w:rPr>
+      </w:pPr>
+      <w:r>
+        <w:rPr>
+          <w:szCs w:val="28"/>
+        </w:rPr>
+        <w:t>Items specifically excluded</w:t>
+      </w:r>
+      <w:r>
+        <w:rPr>
+          <w:szCs w:val="28"/>
+        </w:rPr>
+        <w:t xml:space="preserve"> f</w:t>
+      </w:r>
+      <w:r>
+        <w:rPr>
+          <w:szCs w:val="28"/>
+        </w:rPr>
+        <w:t>rom</w:t>
+      </w:r>
+      <w:r>
+        <w:rPr>
+          <w:szCs w:val="28"/>
+          <w:u w:val="single"/>
+        </w:rPr>
+        <w:tab/>
+      </w:r>
+      <w:r>
+        <w:rPr>
+          <w:szCs w:val="28"/>
+          <w:u w:val="single"/>
+        </w:rPr>
+        <w:tab/>
+      </w:r>
+      <w:r>
+        <w:rPr>
+          <w:szCs w:val="28"/>
+          <w:u w:val="single"/>
+        </w:rPr>
+        <w:tab/>
+      </w:r>
+      <w:r>
+        <w:rPr>
+          <w:szCs w:val="28"/>
+          <w:u w:val="single"/>
+        </w:rPr>
+        <w:tab/>
+      </w:r>
+      <w:r>
+        <w:rPr>
+          <w:szCs w:val="28"/>
+          <w:u w:val="single"/>
+        </w:rPr>
+        <w:tab/>
+      </w:r>
+      <w:r>
+        <w:rPr>
+          <w:szCs w:val="28"/>
+          <w:u w:val="single"/>
+        </w:rPr>
+        <w:tab/>
+      </w:r>
+      <w:r>
+        <w:rPr>
+          <w:szCs w:val="28"/>
+          <w:u w:val="single"/>
+        </w:rPr>
+        <w:tab/>
+      </w:r>
+    </w:p>
+    <w:p>
+      <w:pPr>
+        <w:pStyle w:val="p6"/>
+        <w:tabs>
+          <w:tab w:val="clear" w:pos="720"/>
+          <w:tab w:val="left" w:pos="270"/>
+        </w:tabs>
+        <w:spacing w:line="264" w:lineRule="auto"/>
+        <w:ind w:left="360"/>
+        <w:jc w:val="both"/>
+        <w:rPr>
+          <w:b/>
+          <w:bCs/>
+          <w:szCs w:val="24"/>
         </w:rPr>
       </w:pPr>
     </w:p>
@@ -4049,137 +3780,19 @@
       </w:pPr>
       <w:r>
         <w:rPr>
-          <w:szCs w:val="28"/>
-        </w:rPr>
-        <w:t>Items specifically excluded</w:t>
-      </w:r>
-      <w:r>
-        <w:rPr>
-          <w:szCs w:val="28"/>
-        </w:rPr>
-        <w:t xml:space="preserve"> f</w:t>
-      </w:r>
-      <w:r>
-        <w:rPr>
-          <w:szCs w:val="28"/>
-        </w:rPr>
-        <w:t>rom</w:t>
-      </w:r>
-      <w:r>
-        <w:rPr>
-          <w:szCs w:val="28"/>
-          <w:u w:val="single"/>
-        </w:rPr>
-        <w:tab/>
-      </w:r>
-      <w:r>
-        <w:rPr>
-          <w:szCs w:val="28"/>
-          <w:u w:val="single"/>
-        </w:rPr>
-        <w:tab/>
-      </w:r>
-      <w:r>
-        <w:rPr>
-          <w:szCs w:val="28"/>
-          <w:u w:val="single"/>
-        </w:rPr>
-        <w:tab/>
-      </w:r>
-      <w:r>
-        <w:rPr>
-          <w:szCs w:val="28"/>
-          <w:u w:val="single"/>
-        </w:rPr>
-        <w:tab/>
-      </w:r>
-      <w:r>
-        <w:rPr>
-          <w:szCs w:val="28"/>
-          <w:u w:val="single"/>
-        </w:rPr>
-        <w:tab/>
-      </w:r>
-      <w:r>
-        <w:rPr>
-          <w:szCs w:val="28"/>
-          <w:u w:val="single"/>
-        </w:rPr>
-        <w:tab/>
-      </w:r>
-      <w:r>
-        <w:rPr>
-          <w:szCs w:val="28"/>
-          <w:u w:val="single"/>
-        </w:rPr>
-        <w:tab/>
-      </w:r>
-      <w:r>
-        <w:rPr>
-          <w:szCs w:val="28"/>
-          <w:u w:val="single"/>
-        </w:rPr>
-        <w:tab/>
-        <w:t xml:space="preserve">     </w:t>
-      </w:r>
-      <w:proofErr w:type="gramStart"/>
-      <w:r>
-        <w:rPr>
-          <w:szCs w:val="28"/>
-          <w:u w:val="single"/>
-        </w:rPr>
-        <w:t xml:space="preserve">  </w:t>
-      </w:r>
-      <w:r>
-        <w:rPr>
-          <w:szCs w:val="28"/>
-        </w:rPr>
-        <w:t>.</w:t>
-      </w:r>
-      <w:proofErr w:type="gramEnd"/>
-    </w:p>
-    <w:p>
-      <w:pPr>
-        <w:pStyle w:val="p6"/>
-        <w:tabs>
-          <w:tab w:val="clear" w:pos="720"/>
-          <w:tab w:val="left" w:pos="270"/>
-        </w:tabs>
-        <w:spacing w:line="264" w:lineRule="auto"/>
-        <w:ind w:left="360"/>
-        <w:jc w:val="both"/>
-        <w:rPr>
-          <w:b/>
-          <w:bCs/>
-          <w:szCs w:val="24"/>
-        </w:rPr>
-      </w:pPr>
-    </w:p>
-    <w:p>
-      <w:pPr>
-        <w:pStyle w:val="p6"/>
-        <w:numPr>
-          <w:ilvl w:val="0"/>
-          <w:numId w:val="10"/>
-        </w:numPr>
-        <w:tabs>
-          <w:tab w:val="clear" w:pos="720"/>
-          <w:tab w:val="left" w:pos="270"/>
-        </w:tabs>
-        <w:spacing w:line="264" w:lineRule="auto"/>
-        <w:jc w:val="both"/>
-        <w:rPr>
-          <w:b/>
-          <w:bCs/>
-          <w:szCs w:val="24"/>
-        </w:rPr>
-      </w:pPr>
-      <w:r>
-        <w:rPr>
-          <w:b/>
-          <w:bCs/>
-          <w:szCs w:val="24"/>
-        </w:rPr>
+          <w:b/>
+          <w:bCs/>
+          <w:szCs w:val="24"/>
+        </w:rPr>
+        <w:br w:type="page"/>
+      </w:r>
+      <w:r>
+        <w:rPr>
+          <w:b/>
+          <w:bCs/>
+          <w:szCs w:val="24"/>
+        </w:rPr>
+        <w:lastRenderedPageBreak/>
         <w:t xml:space="preserve">RIGHT TO CANCEL: </w:t>
       </w:r>
       <w:r>
@@ -4709,27 +4322,16 @@
         </w:rPr>
       </w:pPr>
       <w:r>
-        <w:t>STATE</w:t>
-      </w:r>
-      <w:proofErr w:type="gramStart"/>
-      <w:r>
-        <w:t xml:space="preserve">:   </w:t>
-      </w:r>
-      <w:r>
-        <w:tab/>
-      </w:r>
-      <w:r>
-        <w:rPr>
-          <w:u w:val="single"/>
-        </w:rPr>
-        <w:t>North</w:t>
-      </w:r>
-      <w:proofErr w:type="gramEnd"/>
-      <w:r>
-        <w:rPr>
-          <w:u w:val="single"/>
-        </w:rPr>
-        <w:t xml:space="preserve"> Carolina</w:t>
+        <w:t xml:space="preserve">STATE:   </w:t>
+      </w:r>
+      <w:r>
+        <w:tab/>
+      </w:r>
+      <w:r>
+        <w:rPr>
+          <w:u w:val="single"/>
+        </w:rPr>
+        <w:t>North Carolina</w:t>
       </w:r>
     </w:p>
     <w:p>
@@ -4741,9 +4343,6 @@
       <w:r>
         <w:t>COUNTY:  Wake</w:t>
       </w:r>
-      <w:proofErr w:type="gramStart"/>
-      <w:r/>
-      <w:proofErr w:type="gramEnd"/>
     </w:p>
     <w:p>
       <w:pPr>
@@ -4814,13 +4413,13 @@
         <w:ind w:left="360"/>
         <w:textAlignment w:val="baseline"/>
         <w:rPr>
-          <w:rFonts w:ascii="Segoe UI" w:hAnsi="Segoe UI" w:cs="Segoe UI"/>
-        </w:rPr>
-      </w:pPr>
-      <w:r>
-        <w:rPr>
           <w:rStyle w:val="normaltextrun"/>
         </w:rPr>
+      </w:pPr>
+      <w:r>
+        <w:rPr>
+          <w:rStyle w:val="normaltextrun"/>
+        </w:rPr>
         <w:t>this the ____day of _________________, 2026.  </w:t>
       </w:r>
       <w:r>
@@ -4828,50 +4427,6 @@
           <w:rStyle w:val="normaltextrun"/>
         </w:rPr>
         <w:tab/>
-        <w:t>Notary Signature</w:t>
-      </w:r>
-      <w:r>
-        <w:rPr>
-          <w:rStyle w:val="normaltextrun"/>
-        </w:rPr>
-        <w:tab/>
-      </w:r>
-      <w:r>
-        <w:rPr>
-          <w:rStyle w:val="normaltextrun"/>
-        </w:rPr>
-        <w:tab/>
-      </w:r>
-      <w:r>
-        <w:rPr>
-          <w:rStyle w:val="normaltextrun"/>
-        </w:rPr>
-        <w:tab/>
-      </w:r>
-      <w:r>
-        <w:rPr>
-          <w:rStyle w:val="normaltextrun"/>
-        </w:rPr>
-        <w:tab/>
-      </w:r>
-      <w:r>
-        <w:rPr>
-          <w:rStyle w:val="normaltextrun"/>
-        </w:rPr>
-        <w:tab/>
-      </w:r>
-      <w:r>
-        <w:rPr>
-          <w:rStyle w:val="normaltextrun"/>
-        </w:rPr>
-        <w:tab/>
-      </w:r>
-      <w:r>
-        <w:rPr>
-          <w:rStyle w:val="normaltextrun"/>
-        </w:rPr>
-        <w:tab/>
-        <w:t xml:space="preserve"> </w:t>
       </w:r>
     </w:p>
     <w:p>
@@ -4881,32 +4436,9 @@
         <w:ind w:left="360"/>
         <w:textAlignment w:val="baseline"/>
         <w:rPr>
-          <w:rFonts w:ascii="Segoe UI" w:hAnsi="Segoe UI" w:cs="Segoe UI"/>
-        </w:rPr>
-      </w:pPr>
-      <w:r>
-        <w:rPr>
           <w:rStyle w:val="normaltextrun"/>
         </w:rPr>
-        <w:t>            </w:t>
-      </w:r>
-      <w:r>
-        <w:rPr>
-          <w:rStyle w:val="eop"/>
-        </w:rPr>
-        <w:t> </w:t>
-      </w:r>
-      <w:r>
-        <w:rPr>
-          <w:rStyle w:val="eop"/>
-        </w:rPr>
-        <w:tab/>
-      </w:r>
-    </w:p>
-    <w:p>
-      <w:r>
-        <w:t>____________________________________________</w:t>
-      </w:r>
+      </w:pPr>
     </w:p>
     <w:p>
       <w:pPr>
@@ -4915,22 +4447,56 @@
         <w:ind w:left="360"/>
         <w:textAlignment w:val="baseline"/>
         <w:rPr>
+          <w:rFonts w:ascii="Segoe UI" w:hAnsi="Segoe UI" w:cs="Segoe UI"/>
+        </w:rPr>
+      </w:pPr>
+      <w:r>
+        <w:rPr>
           <w:rStyle w:val="normaltextrun"/>
-          <w:u w:val="single"/>
-        </w:rPr>
-      </w:pPr>
+        </w:rPr>
+        <w:t>Notary Signature</w:t>
+      </w:r>
       <w:r>
         <w:rPr>
           <w:rStyle w:val="normaltextrun"/>
         </w:rPr>
-        <w:t xml:space="preserve">Notary </w:t>
-      </w:r>
-      <w:proofErr w:type="gramStart"/>
+        <w:tab/>
+        <w:t> </w:t>
+      </w:r>
       <w:r>
         <w:rPr>
           <w:rStyle w:val="normaltextrun"/>
         </w:rPr>
-        <w:t>Public </w:t>
+        <w:tab/>
+      </w:r>
+      <w:r>
+        <w:t>____________________________________________</w:t>
+      </w:r>
+    </w:p>
+    <w:p>
+      <w:r>
+        <w:rPr>
+          <w:u w:val="none"/>
+        </w:rPr>
+        <w:t>____________________________________________</w:t>
+      </w:r>
+    </w:p>
+    <w:p>
+      <w:pPr>
+        <w:pStyle w:val="paragraph"/>
+        <w:spacing w:before="0" w:beforeAutospacing="0" w:after="0" w:afterAutospacing="0"/>
+        <w:ind w:left="360"/>
+        <w:textAlignment w:val="baseline"/>
+        <w:rPr>
+          <w:rStyle w:val="normaltextrun"/>
+          <w:u w:val="single"/>
+        </w:rPr>
+      </w:pPr>
+      <w:r>
+        <w:rPr>
+          <w:rStyle w:val="normaltextrun"/>
+        </w:rPr>
+        <w:t>Notary Public </w:t>
       </w:r>
       <w:r>
         <w:rPr>
@@ -4942,14 +4508,7 @@
         <w:rPr>
           <w:rStyle w:val="normaltextrun"/>
         </w:rPr>
-        <w:t>My</w:t>
-      </w:r>
-      <w:proofErr w:type="gramEnd"/>
-      <w:r>
-        <w:rPr>
-          <w:rStyle w:val="normaltextrun"/>
-        </w:rPr>
-        <w:t xml:space="preserve"> Commission expires:</w:t>
+        <w:t>My Commission expires:</w:t>
       </w:r>
       <w:r>
         <w:rPr>
@@ -5278,66 +4837,11 @@
           <w:szCs w:val="28"/>
         </w:rPr>
       </w:pPr>
-      <w:proofErr w:type="gramStart"/>
       <w:r>
         <w:rPr>
           <w:szCs w:val="28"/>
         </w:rPr>
         <w:t>[ ] Agent   [X] Seller, by the signature below, acknowledge receipt of $6,000.00 [  ] Cash   [   ] Check, as earnest money deposit, which is credited toward the total down payment mentioned in paragraph 1A of this Agreement. The remaining down payment balance of $14,790.00 shall be paid at closing.</w:t>
-      </w:r>
-      <w:proofErr w:type="gramEnd"/>
-      <w:r>
-        <w:rPr>
-          <w:szCs w:val="28"/>
-        </w:rPr>
-      </w:r>
-      <w:proofErr w:type="gramStart"/>
-      <w:r>
-        <w:rPr>
-          <w:szCs w:val="28"/>
-        </w:rPr>
-      </w:r>
-      <w:proofErr w:type="gramEnd"/>
-      <w:r>
-        <w:rPr>
-          <w:szCs w:val="28"/>
-        </w:rPr>
-      </w:r>
-      <w:proofErr w:type="gramStart"/>
-      <w:r>
-        <w:rPr>
-          <w:szCs w:val="28"/>
-        </w:rPr>
-      </w:r>
-      <w:proofErr w:type="gramEnd"/>
-      <w:r>
-        <w:rPr>
-          <w:szCs w:val="28"/>
-        </w:rPr>
-      </w:r>
-      <w:proofErr w:type="gramStart"/>
-      <w:r>
-        <w:rPr>
-          <w:szCs w:val="28"/>
-        </w:rPr>
-      </w:r>
-      <w:proofErr w:type="gramEnd"/>
-      <w:r>
-        <w:rPr>
-          <w:szCs w:val="28"/>
-        </w:rPr>
-      </w:r>
-      <w:proofErr w:type="gramStart"/>
-      <w:r>
-        <w:rPr>
-          <w:szCs w:val="28"/>
-        </w:rPr>
-      </w:r>
-      <w:proofErr w:type="gramEnd"/>
-      <w:r>
-        <w:rPr>
-          <w:szCs w:val="28"/>
-        </w:rPr>
       </w:r>
     </w:p>
     <w:p>
@@ -5726,27 +5230,16 @@
         </w:rPr>
       </w:pPr>
       <w:r>
-        <w:t>STATE</w:t>
-      </w:r>
-      <w:proofErr w:type="gramStart"/>
-      <w:r>
-        <w:t xml:space="preserve">:   </w:t>
-      </w:r>
-      <w:r>
-        <w:tab/>
-      </w:r>
-      <w:r>
-        <w:rPr>
-          <w:u w:val="single"/>
-        </w:rPr>
-        <w:t>North</w:t>
-      </w:r>
-      <w:proofErr w:type="gramEnd"/>
-      <w:r>
-        <w:rPr>
-          <w:u w:val="single"/>
-        </w:rPr>
-        <w:t xml:space="preserve"> Carolina</w:t>
+        <w:t xml:space="preserve">STATE:   </w:t>
+      </w:r>
+      <w:r>
+        <w:tab/>
+      </w:r>
+      <w:r>
+        <w:rPr>
+          <w:u w:val="single"/>
+        </w:rPr>
+        <w:t>North Carolina</w:t>
       </w:r>
       <w:r>
         <w:rPr>
@@ -5767,9 +5260,6 @@
       <w:r>
         <w:t>COUNTY:  Wake</w:t>
       </w:r>
-      <w:proofErr w:type="gramStart"/>
-      <w:r/>
-      <w:proofErr w:type="gramEnd"/>
     </w:p>
     <w:p>
       <w:pPr>
@@ -6040,6 +5530,9 @@
     </w:p>
     <w:p>
       <w:r>
+        <w:rPr>
+          <w:u w:val="none"/>
+        </w:rPr>
         <w:t>____________________________________________</w:t>
       </w:r>
     </w:p>
@@ -6056,33 +5549,19 @@
         <w:rPr>
           <w:rStyle w:val="normaltextrun"/>
         </w:rPr>
-        <w:t xml:space="preserve">Notary </w:t>
-      </w:r>
-      <w:proofErr w:type="gramStart"/>
+        <w:t>Notary Public </w:t>
+      </w:r>
+      <w:r>
+        <w:rPr>
+          <w:rStyle w:val="eop"/>
+        </w:rPr>
+        <w:t> </w:t>
+      </w:r>
       <w:r>
         <w:rPr>
           <w:rStyle w:val="normaltextrun"/>
         </w:rPr>
-        <w:t>Public </w:t>
-      </w:r>
-      <w:r>
-        <w:rPr>
-          <w:rStyle w:val="eop"/>
-        </w:rPr>
-        <w:t> </w:t>
-      </w:r>
-      <w:r>
-        <w:rPr>
-          <w:rStyle w:val="normaltextrun"/>
-        </w:rPr>
-        <w:t>My</w:t>
-      </w:r>
-      <w:proofErr w:type="gramEnd"/>
-      <w:r>
-        <w:rPr>
-          <w:rStyle w:val="normaltextrun"/>
-        </w:rPr>
-        <w:t xml:space="preserve"> Commission expires:</w:t>
+        <w:t>My Commission expires:</w:t>
       </w:r>
       <w:r>
         <w:rPr>
@@ -8405,15 +7884,7 @@
 </file>
 
 <file path=customXml/item2.xml><?xml version="1.0" encoding="utf-8"?>
-<p:properties xmlns:p="http://schemas.microsoft.com/office/2006/metadata/properties" xmlns:xsi="http://www.w3.org/2001/XMLSchema-instance" xmlns:pc="http://schemas.microsoft.com/office/infopath/2007/PartnerControls">
-  <documentManagement>
-    <TaxCatchAll xmlns="42cc25d9-27fe-4f07-accb-ded05ec47eee" xsi:nil="true"/>
-    <lcf76f155ced4ddcb4097134ff3c332f xmlns="ab9fedca-001d-4cc9-b244-d9c3be5a27d3">
-      <Terms xmlns="http://schemas.microsoft.com/office/infopath/2007/PartnerControls"/>
-    </lcf76f155ced4ddcb4097134ff3c332f>
-    <_Flow_SignoffStatus xmlns="ab9fedca-001d-4cc9-b244-d9c3be5a27d3" xsi:nil="true"/>
-  </documentManagement>
-</p:properties>
+<b:Sources xmlns:b="http://schemas.openxmlformats.org/officeDocument/2006/bibliography" xmlns="http://schemas.openxmlformats.org/officeDocument/2006/bibliography" SelectedStyle="\APASixthEditionOfficeOnline.xsl" StyleName="APA" Version="6"/>
 </file>
 
 <file path=customXml/item3.xml><?xml version="1.0" encoding="utf-8"?>
@@ -8678,7 +8149,15 @@
 </file>
 
 <file path=customXml/item4.xml><?xml version="1.0" encoding="utf-8"?>
-<b:Sources xmlns:b="http://schemas.openxmlformats.org/officeDocument/2006/bibliography" xmlns="http://schemas.openxmlformats.org/officeDocument/2006/bibliography" SelectedStyle="\APASixthEditionOfficeOnline.xsl" StyleName="APA" Version="6"/>
+<p:properties xmlns:p="http://schemas.microsoft.com/office/2006/metadata/properties" xmlns:xsi="http://www.w3.org/2001/XMLSchema-instance" xmlns:pc="http://schemas.microsoft.com/office/infopath/2007/PartnerControls">
+  <documentManagement>
+    <TaxCatchAll xmlns="42cc25d9-27fe-4f07-accb-ded05ec47eee" xsi:nil="true"/>
+    <lcf76f155ced4ddcb4097134ff3c332f xmlns="ab9fedca-001d-4cc9-b244-d9c3be5a27d3">
+      <Terms xmlns="http://schemas.microsoft.com/office/infopath/2007/PartnerControls"/>
+    </lcf76f155ced4ddcb4097134ff3c332f>
+    <_Flow_SignoffStatus xmlns="ab9fedca-001d-4cc9-b244-d9c3be5a27d3" xsi:nil="true"/>
+  </documentManagement>
+</p:properties>
 </file>
 
 <file path=customXml/itemProps1.xml><?xml version="1.0" encoding="utf-8"?>
@@ -8690,12 +8169,9 @@
 </file>
 
 <file path=customXml/itemProps2.xml><?xml version="1.0" encoding="utf-8"?>
-<ds:datastoreItem xmlns:ds="http://schemas.openxmlformats.org/officeDocument/2006/customXml" ds:itemID="{1A4736DD-7889-4919-A280-9BE82A810A58}">
+<ds:datastoreItem xmlns:ds="http://schemas.openxmlformats.org/officeDocument/2006/customXml" ds:itemID="{3679C442-D341-425F-8964-A65FCEFD3D9B}">
   <ds:schemaRefs>
-    <ds:schemaRef ds:uri="http://schemas.microsoft.com/office/2006/metadata/properties"/>
-    <ds:schemaRef ds:uri="http://schemas.microsoft.com/office/infopath/2007/PartnerControls"/>
-    <ds:schemaRef ds:uri="42cc25d9-27fe-4f07-accb-ded05ec47eee"/>
-    <ds:schemaRef ds:uri="ab9fedca-001d-4cc9-b244-d9c3be5a27d3"/>
+    <ds:schemaRef ds:uri="http://schemas.openxmlformats.org/officeDocument/2006/bibliography"/>
   </ds:schemaRefs>
 </ds:datastoreItem>
 </file>
@@ -8720,9 +8196,12 @@
 </file>
 
 <file path=customXml/itemProps4.xml><?xml version="1.0" encoding="utf-8"?>
-<ds:datastoreItem xmlns:ds="http://schemas.openxmlformats.org/officeDocument/2006/customXml" ds:itemID="{3679C442-D341-425F-8964-A65FCEFD3D9B}">
+<ds:datastoreItem xmlns:ds="http://schemas.openxmlformats.org/officeDocument/2006/customXml" ds:itemID="{1A4736DD-7889-4919-A280-9BE82A810A58}">
   <ds:schemaRefs>
-    <ds:schemaRef ds:uri="http://schemas.openxmlformats.org/officeDocument/2006/bibliography"/>
+    <ds:schemaRef ds:uri="http://schemas.microsoft.com/office/2006/metadata/properties"/>
+    <ds:schemaRef ds:uri="http://schemas.microsoft.com/office/infopath/2007/PartnerControls"/>
+    <ds:schemaRef ds:uri="42cc25d9-27fe-4f07-accb-ded05ec47eee"/>
+    <ds:schemaRef ds:uri="ab9fedca-001d-4cc9-b244-d9c3be5a27d3"/>
   </ds:schemaRefs>
 </ds:datastoreItem>
 </file>
</xml_diff>

<commit_message>
Use title reference for additional terms condition
</commit_message>
<xml_diff>
--- a/Project Rooms/Contract for Deed/output/320 Rose - Contract for Deed Agreement - ATTORNEY REVIEW PACKAGE.docx
+++ b/Project Rooms/Contract for Deed/output/320 Rose - Contract for Deed Agreement - ATTORNEY REVIEW PACKAGE.docx
@@ -3263,13 +3263,35 @@
           <w:bCs/>
           <w:szCs w:val="28"/>
         </w:rPr>
-        <w:t>[   ] _____________days after date of satisfaction of all conditions in paragraph 19 unless extended by other conditions of this Agreement or this agreement is cancelled by the Purchaser.</w:t>
-      </w:r>
-      <w:r>
-        <w:rPr>
-          <w:szCs w:val="28"/>
-        </w:rPr>
-        <w:t xml:space="preserve"> </w:t>
+        <w:t xml:space="preserve">[   ] _____________days after date of satisfaction of all conditions in the Additional Terms, Conditions or Addenda section unless extended by other conditions of this Agreement or this agreement is cancelled by the Purchaser. </w:t>
+      </w:r>
+      <w:r>
+        <w:rPr>
+          <w:b/>
+          <w:bCs/>
+          <w:szCs w:val="28"/>
+        </w:rPr>
+      </w:r>
+      <w:r>
+        <w:rPr>
+          <w:b/>
+          <w:bCs/>
+          <w:szCs w:val="28"/>
+        </w:rPr>
+      </w:r>
+      <w:r>
+        <w:rPr>
+          <w:szCs w:val="28"/>
+        </w:rPr>
+      </w:r>
+    </w:p>
+    <w:p>
+      <w:r>
+        <w:rPr>
+          <w:b/>
+          <w:color w:val="0000FF"/>
+        </w:rPr>
+        <w:t>ATTORNEY REVIEW NOTE: Please review the attorney-change contingency language, including Seller's option to proceed under the previously signed Contract if material attorney-required changes cause Purchaser not to proceed, and confirm whether the due diligence/earnest money return language is clear and enforceable.</w:t>
       </w:r>
     </w:p>
     <w:p>
@@ -3349,30 +3371,14 @@
         <w:rPr>
           <w:szCs w:val="28"/>
         </w:rPr>
-        <w:t xml:space="preserve">Additional Terms, Conditions or Addenda (lettered </w:t>
-      </w:r>
-      <w:proofErr w:type="spellStart"/>
-      <w:r>
-        <w:rPr>
-          <w:szCs w:val="28"/>
-        </w:rPr>
-        <w:t>a,b,c,d</w:t>
-      </w:r>
-      <w:proofErr w:type="spellEnd"/>
-      <w:r>
-        <w:rPr>
-          <w:szCs w:val="28"/>
-        </w:rPr>
-        <w:t>, etc.)</w:t>
-      </w:r>
-    </w:p>
-    <w:p>
-      <w:r>
-        <w:rPr>
-          <w:b/>
-          <w:color w:val="0000FF"/>
-        </w:rPr>
-        <w:t>ATTORNEY REVIEW NOTE: Please review the attorney-change contingency language, including Seller's option to proceed under the previously signed Contract if material attorney-required changes cause Purchaser not to proceed, and confirm whether the due diligence/earnest money return language is clear and enforceable.</w:t>
+        <w:br w:type="page"/>
+      </w:r>
+      <w:r>
+        <w:rPr>
+          <w:szCs w:val="28"/>
+        </w:rPr>
+        <w:lastRenderedPageBreak/>
+        <w:t>Additional Terms, Conditions or Addenda (lettered a,b,c,d, etc.)</w:t>
       </w:r>
     </w:p>
     <w:p>
@@ -3468,16 +3474,7 @@
           <w:sz w:val="22"/>
           <w:szCs w:val="22"/>
         </w:rPr>
-        <w:t xml:space="preserve">This is explicitly a Contract for Deed. No transfer of deed will be done until the terms of the </w:t>
-      </w:r>
-      <w:r>
-        <w:rPr>
-          <w:bCs/>
-          <w:sz w:val="22"/>
-          <w:szCs w:val="22"/>
-        </w:rPr>
-        <w:lastRenderedPageBreak/>
-        <w:t>purchase are satisfied. See the Promissory Note for details.</w:t>
+        <w:t>This is explicitly a Contract for Deed. No transfer of deed will be done until the terms of the purchase are satisfied. See the Promissory Note for details.</w:t>
       </w:r>
     </w:p>
     <w:p>
@@ -4475,9 +4472,6 @@
     </w:p>
     <w:p>
       <w:r>
-        <w:rPr>
-          <w:u w:val="none"/>
-        </w:rPr>
         <w:t>____________________________________________</w:t>
       </w:r>
     </w:p>
@@ -5530,9 +5524,6 @@
     </w:p>
     <w:p>
       <w:r>
-        <w:rPr>
-          <w:u w:val="none"/>
-        </w:rPr>
         <w:t>____________________________________________</w:t>
       </w:r>
     </w:p>
@@ -7884,7 +7875,15 @@
 </file>
 
 <file path=customXml/item2.xml><?xml version="1.0" encoding="utf-8"?>
-<b:Sources xmlns:b="http://schemas.openxmlformats.org/officeDocument/2006/bibliography" xmlns="http://schemas.openxmlformats.org/officeDocument/2006/bibliography" SelectedStyle="\APASixthEditionOfficeOnline.xsl" StyleName="APA" Version="6"/>
+<p:properties xmlns:p="http://schemas.microsoft.com/office/2006/metadata/properties" xmlns:xsi="http://www.w3.org/2001/XMLSchema-instance" xmlns:pc="http://schemas.microsoft.com/office/infopath/2007/PartnerControls">
+  <documentManagement>
+    <TaxCatchAll xmlns="42cc25d9-27fe-4f07-accb-ded05ec47eee" xsi:nil="true"/>
+    <lcf76f155ced4ddcb4097134ff3c332f xmlns="ab9fedca-001d-4cc9-b244-d9c3be5a27d3">
+      <Terms xmlns="http://schemas.microsoft.com/office/infopath/2007/PartnerControls"/>
+    </lcf76f155ced4ddcb4097134ff3c332f>
+    <_Flow_SignoffStatus xmlns="ab9fedca-001d-4cc9-b244-d9c3be5a27d3" xsi:nil="true"/>
+  </documentManagement>
+</p:properties>
 </file>
 
 <file path=customXml/item3.xml><?xml version="1.0" encoding="utf-8"?>
@@ -8149,15 +8148,7 @@
 </file>
 
 <file path=customXml/item4.xml><?xml version="1.0" encoding="utf-8"?>
-<p:properties xmlns:p="http://schemas.microsoft.com/office/2006/metadata/properties" xmlns:xsi="http://www.w3.org/2001/XMLSchema-instance" xmlns:pc="http://schemas.microsoft.com/office/infopath/2007/PartnerControls">
-  <documentManagement>
-    <TaxCatchAll xmlns="42cc25d9-27fe-4f07-accb-ded05ec47eee" xsi:nil="true"/>
-    <lcf76f155ced4ddcb4097134ff3c332f xmlns="ab9fedca-001d-4cc9-b244-d9c3be5a27d3">
-      <Terms xmlns="http://schemas.microsoft.com/office/infopath/2007/PartnerControls"/>
-    </lcf76f155ced4ddcb4097134ff3c332f>
-    <_Flow_SignoffStatus xmlns="ab9fedca-001d-4cc9-b244-d9c3be5a27d3" xsi:nil="true"/>
-  </documentManagement>
-</p:properties>
+<b:Sources xmlns:b="http://schemas.openxmlformats.org/officeDocument/2006/bibliography" xmlns="http://schemas.openxmlformats.org/officeDocument/2006/bibliography" SelectedStyle="\APASixthEditionOfficeOnline.xsl" StyleName="APA" Version="6"/>
 </file>
 
 <file path=customXml/itemProps1.xml><?xml version="1.0" encoding="utf-8"?>
@@ -8169,9 +8160,12 @@
 </file>
 
 <file path=customXml/itemProps2.xml><?xml version="1.0" encoding="utf-8"?>
-<ds:datastoreItem xmlns:ds="http://schemas.openxmlformats.org/officeDocument/2006/customXml" ds:itemID="{3679C442-D341-425F-8964-A65FCEFD3D9B}">
+<ds:datastoreItem xmlns:ds="http://schemas.openxmlformats.org/officeDocument/2006/customXml" ds:itemID="{1A4736DD-7889-4919-A280-9BE82A810A58}">
   <ds:schemaRefs>
-    <ds:schemaRef ds:uri="http://schemas.openxmlformats.org/officeDocument/2006/bibliography"/>
+    <ds:schemaRef ds:uri="http://schemas.microsoft.com/office/2006/metadata/properties"/>
+    <ds:schemaRef ds:uri="http://schemas.microsoft.com/office/infopath/2007/PartnerControls"/>
+    <ds:schemaRef ds:uri="42cc25d9-27fe-4f07-accb-ded05ec47eee"/>
+    <ds:schemaRef ds:uri="ab9fedca-001d-4cc9-b244-d9c3be5a27d3"/>
   </ds:schemaRefs>
 </ds:datastoreItem>
 </file>
@@ -8196,12 +8190,9 @@
 </file>
 
 <file path=customXml/itemProps4.xml><?xml version="1.0" encoding="utf-8"?>
-<ds:datastoreItem xmlns:ds="http://schemas.openxmlformats.org/officeDocument/2006/customXml" ds:itemID="{1A4736DD-7889-4919-A280-9BE82A810A58}">
+<ds:datastoreItem xmlns:ds="http://schemas.openxmlformats.org/officeDocument/2006/customXml" ds:itemID="{3679C442-D341-425F-8964-A65FCEFD3D9B}">
   <ds:schemaRefs>
-    <ds:schemaRef ds:uri="http://schemas.microsoft.com/office/2006/metadata/properties"/>
-    <ds:schemaRef ds:uri="http://schemas.microsoft.com/office/infopath/2007/PartnerControls"/>
-    <ds:schemaRef ds:uri="42cc25d9-27fe-4f07-accb-ded05ec47eee"/>
-    <ds:schemaRef ds:uri="ab9fedca-001d-4cc9-b244-d9c3be5a27d3"/>
+    <ds:schemaRef ds:uri="http://schemas.openxmlformats.org/officeDocument/2006/bibliography"/>
   </ds:schemaRefs>
 </ds:datastoreItem>
 </file>
</xml_diff>

<commit_message>
Preserve contract boldness changes throughout
</commit_message>
<xml_diff>
--- a/Project Rooms/Contract for Deed/output/320 Rose - Contract for Deed Agreement - ATTORNEY REVIEW PACKAGE.docx
+++ b/Project Rooms/Contract for Deed/output/320 Rose - Contract for Deed Agreement - ATTORNEY REVIEW PACKAGE.docx
@@ -113,7 +113,20 @@
           <w:szCs w:val="28"/>
         </w:rPr>
         <w:tab/>
-        <w:t>Whose principal address is:</w:t>
+      </w:r>
+      <w:proofErr w:type="gramStart"/>
+      <w:r>
+        <w:rPr>
+          <w:szCs w:val="28"/>
+        </w:rPr>
+        <w:t>Whose</w:t>
+      </w:r>
+      <w:proofErr w:type="gramEnd"/>
+      <w:r>
+        <w:rPr>
+          <w:szCs w:val="28"/>
+        </w:rPr>
+        <w:t xml:space="preserve"> principal address is:</w:t>
       </w:r>
     </w:p>
     <w:p>
@@ -1317,7 +1330,21 @@
         <w:rPr>
           <w:szCs w:val="24"/>
         </w:rPr>
-        <w:t xml:space="preserve">Existing mortgage balance encumbering the Property to be taken subject to by Purchaser (approximately).                     </w:t>
+        <w:t xml:space="preserve">Existing mortgage balance encumbering the Property to </w:t>
+      </w:r>
+      <w:proofErr w:type="gramStart"/>
+      <w:r>
+        <w:rPr>
+          <w:szCs w:val="24"/>
+        </w:rPr>
+        <w:t>be taken</w:t>
+      </w:r>
+      <w:proofErr w:type="gramEnd"/>
+      <w:r>
+        <w:rPr>
+          <w:szCs w:val="24"/>
+        </w:rPr>
+        <w:t xml:space="preserve"> subject to by Purchaser (approximately).                     </w:t>
       </w:r>
       <w:r>
         <w:rPr>
@@ -1351,7 +1378,21 @@
         <w:rPr>
           <w:szCs w:val="24"/>
         </w:rPr>
-        <w:t>Total Purchase Price  - exactly</w:t>
+        <w:t xml:space="preserve">Total Purchase </w:t>
+      </w:r>
+      <w:proofErr w:type="gramStart"/>
+      <w:r>
+        <w:rPr>
+          <w:szCs w:val="24"/>
+        </w:rPr>
+        <w:t>Price  -</w:t>
+      </w:r>
+      <w:proofErr w:type="gramEnd"/>
+      <w:r>
+        <w:rPr>
+          <w:szCs w:val="24"/>
+        </w:rPr>
+        <w:t xml:space="preserve"> exactly</w:t>
       </w:r>
       <w:r>
         <w:rPr>
@@ -1411,7 +1452,21 @@
         <w:rPr>
           <w:szCs w:val="28"/>
         </w:rPr>
-        <w:t>Purchaser agrees to provide an additional charges and fees associated with the recording of a Memorandum of (this) Contract for Deed and administrative costs of the Seller</w:t>
+        <w:t xml:space="preserve">Purchaser agrees to provide </w:t>
+      </w:r>
+      <w:proofErr w:type="gramStart"/>
+      <w:r>
+        <w:rPr>
+          <w:szCs w:val="28"/>
+        </w:rPr>
+        <w:t>an additional</w:t>
+      </w:r>
+      <w:proofErr w:type="gramEnd"/>
+      <w:r>
+        <w:rPr>
+          <w:szCs w:val="28"/>
+        </w:rPr>
+        <w:t xml:space="preserve"> charges and fees associated with the recording of a Memorandum of (this) Contract for Deed and administrative costs of the Seller</w:t>
       </w:r>
       <w:r>
         <w:rPr>
@@ -1540,27 +1595,59 @@
         <w:rPr>
           <w:szCs w:val="28"/>
         </w:rPr>
-        <w:t xml:space="preserve"> Wood Destroying Organism Report </w:t>
-      </w:r>
-      <w:r>
-        <w:rPr>
-          <w:szCs w:val="28"/>
-        </w:rPr>
-        <w:tab/>
-      </w:r>
-      <w:r>
-        <w:rPr>
-          <w:b/>
-          <w:bCs/>
-          <w:szCs w:val="28"/>
-        </w:rPr>
-        <w:t>[X]</w:t>
-      </w:r>
-      <w:r>
-        <w:rPr>
-          <w:szCs w:val="28"/>
-        </w:rPr>
-        <w:t xml:space="preserve">  Real estate brokerage fee</w:t>
+        <w:t xml:space="preserve"> Wood Destroying Organism </w:t>
+      </w:r>
+      <w:proofErr w:type="gramStart"/>
+      <w:r>
+        <w:rPr>
+          <w:szCs w:val="28"/>
+        </w:rPr>
+        <w:t xml:space="preserve">Report </w:t>
+      </w:r>
+      <w:r>
+        <w:rPr>
+          <w:szCs w:val="28"/>
+        </w:rPr>
+        <w:tab/>
+      </w:r>
+      <w:r>
+        <w:rPr>
+          <w:b/>
+          <w:bCs/>
+          <w:szCs w:val="28"/>
+        </w:rPr>
+        <w:t>[</w:t>
+      </w:r>
+      <w:proofErr w:type="gramEnd"/>
+      <w:r>
+        <w:rPr>
+          <w:b/>
+          <w:bCs/>
+          <w:szCs w:val="28"/>
+        </w:rPr>
+        <w:t>X</w:t>
+      </w:r>
+      <w:proofErr w:type="gramStart"/>
+      <w:r>
+        <w:rPr>
+          <w:b/>
+          <w:bCs/>
+          <w:szCs w:val="28"/>
+        </w:rPr>
+        <w:t>]</w:t>
+      </w:r>
+      <w:r>
+        <w:rPr>
+          <w:szCs w:val="28"/>
+        </w:rPr>
+        <w:t xml:space="preserve">  Real</w:t>
+      </w:r>
+      <w:proofErr w:type="gramEnd"/>
+      <w:r>
+        <w:rPr>
+          <w:szCs w:val="28"/>
+        </w:rPr>
+        <w:t xml:space="preserve"> estate brokerage fee</w:t>
       </w:r>
     </w:p>
     <w:p>
@@ -1620,7 +1707,21 @@
         <w:rPr>
           <w:szCs w:val="28"/>
         </w:rPr>
-        <w:t>[   ] Other______________________________________</w:t>
+        <w:t xml:space="preserve">[ </w:t>
+      </w:r>
+      <w:proofErr w:type="gramStart"/>
+      <w:r>
+        <w:rPr>
+          <w:szCs w:val="28"/>
+        </w:rPr>
+        <w:t xml:space="preserve">  ]</w:t>
+      </w:r>
+      <w:proofErr w:type="gramEnd"/>
+      <w:r>
+        <w:rPr>
+          <w:szCs w:val="28"/>
+        </w:rPr>
+        <w:t xml:space="preserve"> Other______________________________________</w:t>
       </w:r>
     </w:p>
     <w:p>
@@ -1710,16 +1811,34 @@
           <w:bCs/>
           <w:szCs w:val="28"/>
         </w:rPr>
-        <w:t xml:space="preserve">[X]Title insurance policy   </w:t>
-      </w:r>
-      <w:r>
-        <w:rPr>
-          <w:b/>
-          <w:bCs/>
-          <w:szCs w:val="28"/>
-        </w:rPr>
-        <w:tab/>
-        <w:t xml:space="preserve">[X] Attorney's fee </w:t>
+        <w:t xml:space="preserve">[X]Title insurance </w:t>
+      </w:r>
+      <w:proofErr w:type="gramStart"/>
+      <w:r>
+        <w:rPr>
+          <w:b/>
+          <w:bCs/>
+          <w:szCs w:val="28"/>
+        </w:rPr>
+        <w:t xml:space="preserve">policy   </w:t>
+      </w:r>
+      <w:r>
+        <w:rPr>
+          <w:b/>
+          <w:bCs/>
+          <w:szCs w:val="28"/>
+        </w:rPr>
+        <w:tab/>
+        <w:t>[</w:t>
+      </w:r>
+      <w:proofErr w:type="gramEnd"/>
+      <w:r>
+        <w:rPr>
+          <w:b/>
+          <w:bCs/>
+          <w:szCs w:val="28"/>
+        </w:rPr>
+        <w:t xml:space="preserve">X] Attorney's fee </w:t>
       </w:r>
     </w:p>
     <w:p>
@@ -1744,16 +1863,34 @@
           <w:bCs/>
           <w:szCs w:val="28"/>
         </w:rPr>
-        <w:t xml:space="preserve">[X] Closing Costs   </w:t>
-      </w:r>
-      <w:r>
-        <w:rPr>
-          <w:b/>
-          <w:bCs/>
-          <w:szCs w:val="28"/>
-        </w:rPr>
-        <w:tab/>
-        <w:t xml:space="preserve">[X] Recording fees   </w:t>
+        <w:t xml:space="preserve">[X] Closing </w:t>
+      </w:r>
+      <w:proofErr w:type="gramStart"/>
+      <w:r>
+        <w:rPr>
+          <w:b/>
+          <w:bCs/>
+          <w:szCs w:val="28"/>
+        </w:rPr>
+        <w:t xml:space="preserve">Costs   </w:t>
+      </w:r>
+      <w:r>
+        <w:rPr>
+          <w:b/>
+          <w:bCs/>
+          <w:szCs w:val="28"/>
+        </w:rPr>
+        <w:tab/>
+        <w:t>[</w:t>
+      </w:r>
+      <w:proofErr w:type="gramEnd"/>
+      <w:r>
+        <w:rPr>
+          <w:b/>
+          <w:bCs/>
+          <w:szCs w:val="28"/>
+        </w:rPr>
+        <w:t xml:space="preserve">X] Recording fees   </w:t>
       </w:r>
     </w:p>
     <w:p>
@@ -1778,16 +1915,34 @@
           <w:bCs/>
           <w:szCs w:val="28"/>
         </w:rPr>
-        <w:t xml:space="preserve">[X] Note stamps   </w:t>
-      </w:r>
-      <w:r>
-        <w:rPr>
-          <w:b/>
-          <w:bCs/>
-          <w:szCs w:val="28"/>
-        </w:rPr>
-        <w:tab/>
-        <w:t xml:space="preserve">[X] Intangible tax    </w:t>
+        <w:t xml:space="preserve">[X] Note </w:t>
+      </w:r>
+      <w:proofErr w:type="gramStart"/>
+      <w:r>
+        <w:rPr>
+          <w:b/>
+          <w:bCs/>
+          <w:szCs w:val="28"/>
+        </w:rPr>
+        <w:t xml:space="preserve">stamps   </w:t>
+      </w:r>
+      <w:r>
+        <w:rPr>
+          <w:b/>
+          <w:bCs/>
+          <w:szCs w:val="28"/>
+        </w:rPr>
+        <w:tab/>
+        <w:t>[</w:t>
+      </w:r>
+      <w:proofErr w:type="gramEnd"/>
+      <w:r>
+        <w:rPr>
+          <w:b/>
+          <w:bCs/>
+          <w:szCs w:val="28"/>
+        </w:rPr>
+        <w:t xml:space="preserve">X] Intangible tax    </w:t>
       </w:r>
     </w:p>
     <w:p>
@@ -1831,14 +1986,42 @@
         <w:rPr>
           <w:szCs w:val="28"/>
         </w:rPr>
-        <w:t xml:space="preserve">[   ] Credit reports   </w:t>
-      </w:r>
-      <w:r>
-        <w:rPr>
-          <w:szCs w:val="28"/>
-        </w:rPr>
-        <w:tab/>
-        <w:t xml:space="preserve">[   ] Loan origination fee   </w:t>
+        <w:t xml:space="preserve">[ </w:t>
+      </w:r>
+      <w:proofErr w:type="gramStart"/>
+      <w:r>
+        <w:rPr>
+          <w:szCs w:val="28"/>
+        </w:rPr>
+        <w:t xml:space="preserve">  ]</w:t>
+      </w:r>
+      <w:proofErr w:type="gramEnd"/>
+      <w:r>
+        <w:rPr>
+          <w:szCs w:val="28"/>
+        </w:rPr>
+        <w:t xml:space="preserve"> Credit reports   </w:t>
+      </w:r>
+      <w:r>
+        <w:rPr>
+          <w:szCs w:val="28"/>
+        </w:rPr>
+        <w:tab/>
+        <w:t xml:space="preserve">[ </w:t>
+      </w:r>
+      <w:proofErr w:type="gramStart"/>
+      <w:r>
+        <w:rPr>
+          <w:szCs w:val="28"/>
+        </w:rPr>
+        <w:t xml:space="preserve">  ]</w:t>
+      </w:r>
+      <w:proofErr w:type="gramEnd"/>
+      <w:r>
+        <w:rPr>
+          <w:szCs w:val="28"/>
+        </w:rPr>
+        <w:t xml:space="preserve"> Loan origination fee   </w:t>
       </w:r>
     </w:p>
     <w:p>
@@ -1859,14 +2042,42 @@
         <w:rPr>
           <w:szCs w:val="28"/>
         </w:rPr>
-        <w:t xml:space="preserve">[   ] Loan insurance premium   </w:t>
-      </w:r>
-      <w:r>
-        <w:rPr>
-          <w:szCs w:val="28"/>
-        </w:rPr>
-        <w:tab/>
-        <w:t>[   ] Other_________________________________</w:t>
+        <w:t xml:space="preserve">[ </w:t>
+      </w:r>
+      <w:proofErr w:type="gramStart"/>
+      <w:r>
+        <w:rPr>
+          <w:szCs w:val="28"/>
+        </w:rPr>
+        <w:t xml:space="preserve">  ]</w:t>
+      </w:r>
+      <w:proofErr w:type="gramEnd"/>
+      <w:r>
+        <w:rPr>
+          <w:szCs w:val="28"/>
+        </w:rPr>
+        <w:t xml:space="preserve"> Loan insurance premium   </w:t>
+      </w:r>
+      <w:r>
+        <w:rPr>
+          <w:szCs w:val="28"/>
+        </w:rPr>
+        <w:tab/>
+        <w:t xml:space="preserve">[ </w:t>
+      </w:r>
+      <w:proofErr w:type="gramStart"/>
+      <w:r>
+        <w:rPr>
+          <w:szCs w:val="28"/>
+        </w:rPr>
+        <w:t xml:space="preserve">  ]</w:t>
+      </w:r>
+      <w:proofErr w:type="gramEnd"/>
+      <w:r>
+        <w:rPr>
+          <w:szCs w:val="28"/>
+        </w:rPr>
+        <w:t xml:space="preserve"> Other_________________________________</w:t>
       </w:r>
     </w:p>
     <w:p>
@@ -1883,11 +2094,19 @@
           <w:szCs w:val="28"/>
         </w:rPr>
       </w:pPr>
-      <w:r>
-        <w:rPr>
-          <w:szCs w:val="28"/>
-        </w:rPr>
-        <w:t>[  ] All other charges required by lender which Purchaser is prohibited from paying by law or regulation.</w:t>
+      <w:proofErr w:type="gramStart"/>
+      <w:r>
+        <w:rPr>
+          <w:szCs w:val="28"/>
+        </w:rPr>
+        <w:t>[  ]</w:t>
+      </w:r>
+      <w:proofErr w:type="gramEnd"/>
+      <w:r>
+        <w:rPr>
+          <w:szCs w:val="28"/>
+        </w:rPr>
+        <w:t xml:space="preserve"> All other charges required by lender which Purchaser is prohibited from paying by law or regulation.</w:t>
       </w:r>
     </w:p>
     <w:p>
@@ -1903,7 +2122,21 @@
         <w:rPr>
           <w:szCs w:val="28"/>
         </w:rPr>
-        <w:t>[   ] Repairs or replacements, in addition to those in paragraph 9, not to exceed $_________________________</w:t>
+        <w:t xml:space="preserve">[ </w:t>
+      </w:r>
+      <w:proofErr w:type="gramStart"/>
+      <w:r>
+        <w:rPr>
+          <w:szCs w:val="28"/>
+        </w:rPr>
+        <w:t xml:space="preserve">  ]</w:t>
+      </w:r>
+      <w:proofErr w:type="gramEnd"/>
+      <w:r>
+        <w:rPr>
+          <w:szCs w:val="28"/>
+        </w:rPr>
+        <w:t xml:space="preserve"> Repairs or replacements, in addition to those in paragraph 9, not to exceed $_________________________</w:t>
       </w:r>
     </w:p>
     <w:p>
@@ -1919,7 +2152,21 @@
         <w:rPr>
           <w:szCs w:val="28"/>
         </w:rPr>
-        <w:t xml:space="preserve">[   ] All mortgage payments or condominium and association fees will be </w:t>
+        <w:t xml:space="preserve">[ </w:t>
+      </w:r>
+      <w:proofErr w:type="gramStart"/>
+      <w:r>
+        <w:rPr>
+          <w:szCs w:val="28"/>
+        </w:rPr>
+        <w:t xml:space="preserve">  ]</w:t>
+      </w:r>
+      <w:proofErr w:type="gramEnd"/>
+      <w:r>
+        <w:rPr>
+          <w:szCs w:val="28"/>
+        </w:rPr>
+        <w:t xml:space="preserve"> All mortgage payments or condominium and association fees will be </w:t>
       </w:r>
       <w:r>
         <w:rPr>
@@ -2607,6 +2854,20 @@
           <w:bCs/>
         </w:rPr>
       </w:r>
+      <w:proofErr w:type="gramStart"/>
+      <w:r>
+        <w:rPr>
+          <w:b/>
+          <w:bCs/>
+        </w:rPr>
+      </w:r>
+      <w:proofErr w:type="gramEnd"/>
+      <w:r>
+        <w:rPr>
+          <w:b/>
+          <w:bCs/>
+        </w:rPr>
+      </w:r>
     </w:p>
     <w:p>
       <w:pPr>
@@ -2647,7 +2908,21 @@
           <w:szCs w:val="24"/>
         </w:rPr>
         <w:lastRenderedPageBreak/>
-        <w:t>STAT. CHAPTER 47H. A CONTRACT FOR DEED CANNOT BE FORFEITED UNLESS A BREACH HAS OCCURRED IN ONE OR MORE OF THE PURCHASER’S EXPRESS OBLIGATIONS UNDER THE CONTRACT AND THE CONTRACT PROVIDES THAT AS A RESULT OF SUCH BREACH THE SELLER IS ENTITLED TO FORFEIT THE CONTRACT. EXAMPLES OF BREACH OF CONTRACT INCLUDE LACK OF PAYMENT EXTENDING BEYOND 15 DAYS OF DUE DATE, PROHIBITED USE OF PROPERTY, FRAUDULENT IDENTIFICATION, AND FRAUDULENT PAYMENTS. FURTHERMORE, THE PURCHASER’S RIGHTS SHALL NOT BE FORFEITED UNTIL THE PURCHASER HAS BEEN NOTIFIED OF THE INTENT TO FORFEIT IN ACCORDANCE WITH N.C. GEN. STAT. 47H-4 AND BEEN GIVEN A RIGHT TO CURE THE DEFAULT AND HAS FAILED TO DO SO WITHIN THE TIME PERIOD ALLOWED. A TIMELY TENDER OF CURE SHALL REINSTATE THE CONTRACT FOR DEED.</w:t>
+        <w:t xml:space="preserve">STAT. CHAPTER 47H. A CONTRACT FOR DEED CANNOT BE FORFEITED UNLESS A BREACH HAS OCCURRED IN ONE OR MORE OF </w:t>
+      </w:r>
+      <w:proofErr w:type="gramStart"/>
+      <w:r>
+        <w:rPr>
+          <w:szCs w:val="24"/>
+        </w:rPr>
+        <w:t>THE PURCHASER’S</w:t>
+      </w:r>
+      <w:proofErr w:type="gramEnd"/>
+      <w:r>
+        <w:rPr>
+          <w:szCs w:val="24"/>
+        </w:rPr>
+        <w:t xml:space="preserve"> EXPRESS OBLIGATIONS UNDER THE CONTRACT AND THE CONTRACT PROVIDES THAT AS A RESULT OF SUCH BREACH THE SELLER IS ENTITLED TO FORFEIT THE CONTRACT. EXAMPLES OF BREACH OF CONTRACT INCLUDE LACK OF PAYMENT EXTENDING BEYOND 15 DAYS OF DUE DATE, PROHIBITED USE OF PROPERTY, FRAUDULENT IDENTIFICATION, AND FRAUDULENT PAYMENTS. FURTHERMORE, THE PURCHASER’S RIGHTS SHALL NOT BE FORFEITED UNTIL THE PURCHASER HAS BEEN NOTIFIED OF THE INTENT TO FORFEIT IN ACCORDANCE WITH N.C. GEN. STAT. 47H-4 AND BEEN GIVEN A RIGHT TO CURE THE DEFAULT AND HAS FAILED TO DO SO WITHIN THE TIME PERIOD ALLOWED. A TIMELY TENDER OF CURE SHALL REINSTATE THE CONTRACT FOR DEED.</w:t>
       </w:r>
     </w:p>
     <w:p>
@@ -2692,7 +2967,21 @@
         <w:rPr>
           <w:szCs w:val="24"/>
         </w:rPr>
-        <w:t xml:space="preserve">Any unauthorized or unpermitted construction, improvements, excavation (to include clearing, logging, and planting), or otherwise altering the property from its original condition at the time this contract is executed is prohibited.  Authorization may be given by the Seller for certain improvements if Purchaser submits an application in writing to make changes and receives authorization in writing from Seller.  Authorization will be withheld or granted solely at the discretion of the Seller. Additionally, any use not permitted by local, state, and federal laws and ordinances is prohibited. </w:t>
+        <w:t xml:space="preserve">Any unauthorized or unpermitted construction, improvements, excavation (to include clearing, logging, and planting), or otherwise altering the property from its original condition at the time this contract is executed is prohibited.  Authorization may be given by the Seller for certain improvements if Purchaser </w:t>
+      </w:r>
+      <w:proofErr w:type="gramStart"/>
+      <w:r>
+        <w:rPr>
+          <w:szCs w:val="24"/>
+        </w:rPr>
+        <w:t>submits an application</w:t>
+      </w:r>
+      <w:proofErr w:type="gramEnd"/>
+      <w:r>
+        <w:rPr>
+          <w:szCs w:val="24"/>
+        </w:rPr>
+        <w:t xml:space="preserve"> in writing to make changes and receives authorization in writing from Seller.  Authorization will be withheld or granted solely at the discretion of the Seller. Additionally, any use not permitted by local, state, and federal laws and ordinances is prohibited. </w:t>
       </w:r>
     </w:p>
     <w:p>
@@ -2727,7 +3016,21 @@
         <w:rPr>
           <w:szCs w:val="24"/>
         </w:rPr>
-        <w:t xml:space="preserve"> Purchaser may prepay some or all of the remaining Balance Owed on this contract at any time.</w:t>
+        <w:t xml:space="preserve"> Purchaser may prepay some or </w:t>
+      </w:r>
+      <w:proofErr w:type="gramStart"/>
+      <w:r>
+        <w:rPr>
+          <w:szCs w:val="24"/>
+        </w:rPr>
+        <w:t>all of</w:t>
+      </w:r>
+      <w:proofErr w:type="gramEnd"/>
+      <w:r>
+        <w:rPr>
+          <w:szCs w:val="24"/>
+        </w:rPr>
+        <w:t xml:space="preserve"> the remaining Balance Owed on this contract at any time.</w:t>
       </w:r>
     </w:p>
     <w:p>
@@ -2871,9 +3174,17 @@
       </w:pPr>
       <w:r>
         <w:rPr>
-          <w:szCs w:val="28"/>
-        </w:rPr>
-        <w:t xml:space="preserve">Seller agrees to deliver the </w:t>
+          <w:b/>
+          <w:bCs/>
+          <w:szCs w:val="28"/>
+        </w:rPr>
+        <w:t>Seller</w:t>
+      </w:r>
+      <w:r>
+        <w:rPr>
+          <w:szCs w:val="28"/>
+        </w:rPr>
+        <w:t xml:space="preserve"> agrees to deliver the </w:t>
       </w:r>
       <w:r>
         <w:rPr>
@@ -3104,7 +3415,21 @@
         <w:rPr>
           <w:szCs w:val="28"/>
         </w:rPr>
-        <w:t xml:space="preserve"> has [  ] has not inspected the property and HAS NOT RELIED UPON ANY REPRESENTATIONS MADE BY ANY REAL ESTATE AGENT in describing the property, and Purchaser accepts the property in its PRESENT AS IS CONDITION, except as </w:t>
+        <w:t xml:space="preserve"> has </w:t>
+      </w:r>
+      <w:proofErr w:type="gramStart"/>
+      <w:r>
+        <w:rPr>
+          <w:szCs w:val="28"/>
+        </w:rPr>
+        <w:t>[  ]</w:t>
+      </w:r>
+      <w:proofErr w:type="gramEnd"/>
+      <w:r>
+        <w:rPr>
+          <w:szCs w:val="28"/>
+        </w:rPr>
+        <w:t xml:space="preserve"> has not inspected the property and HAS NOT RELIED UPON ANY REPRESENTATIONS MADE BY ANY REAL ESTATE AGENT in describing the property, and Purchaser accepts the property in its PRESENT AS IS CONDITION, except as </w:t>
       </w:r>
       <w:r>
         <w:rPr>
@@ -3136,9 +3461,17 @@
       </w:pPr>
       <w:r>
         <w:rPr>
-          <w:szCs w:val="28"/>
-        </w:rPr>
-        <w:t>Title Examination and Time for Closing:</w:t>
+          <w:b/>
+          <w:bCs/>
+          <w:szCs w:val="28"/>
+        </w:rPr>
+        <w:t>Title Examination and Time for Closing</w:t>
+      </w:r>
+      <w:r>
+        <w:rPr>
+          <w:szCs w:val="28"/>
+        </w:rPr>
+        <w:t>:</w:t>
       </w:r>
     </w:p>
     <w:p>
@@ -3158,8 +3491,6 @@
       </w:pPr>
       <w:r>
         <w:rPr>
-          <w:b/>
-          <w:bCs/>
           <w:szCs w:val="28"/>
         </w:rPr>
         <w:t xml:space="preserve">If title evidence and survey, as specified above, show Seller is vested with a marketable title, subject to the usual exceptions contained in title insurance commitments  (such as exceptions for survey, current taxes, zoning ordinances, covenants, restrictions and easements of record), the transaction will be closed and the closing papers delivered on or before  </w:t>
@@ -3242,7 +3573,13 @@
           <w:bCs/>
           <w:szCs w:val="28"/>
         </w:rPr>
-        <w:t xml:space="preserve"> days after the date of acceptance, or   </w:t>
+        <w:t xml:space="preserve"> </w:t>
+      </w:r>
+      <w:r>
+        <w:rPr>
+          <w:szCs w:val="28"/>
+        </w:rPr>
+        <w:t xml:space="preserve">days after the date of acceptance, or   </w:t>
       </w:r>
     </w:p>
     <w:p>
@@ -3263,26 +3600,69 @@
           <w:bCs/>
           <w:szCs w:val="28"/>
         </w:rPr>
-        <w:t xml:space="preserve">[   ] _____________days after date of satisfaction of all conditions in the Additional Terms, Conditions or Addenda section unless extended by other conditions of this Agreement or this agreement is cancelled by the Purchaser. </w:t>
-      </w:r>
-      <w:r>
-        <w:rPr>
-          <w:b/>
-          <w:bCs/>
-          <w:szCs w:val="28"/>
-        </w:rPr>
-      </w:r>
-      <w:r>
-        <w:rPr>
-          <w:b/>
-          <w:bCs/>
-          <w:szCs w:val="28"/>
-        </w:rPr>
-      </w:r>
-      <w:r>
-        <w:rPr>
-          <w:szCs w:val="28"/>
-        </w:rPr>
+        <w:t xml:space="preserve">[ </w:t>
+      </w:r>
+      <w:proofErr w:type="gramStart"/>
+      <w:r>
+        <w:rPr>
+          <w:b/>
+          <w:bCs/>
+          <w:szCs w:val="28"/>
+        </w:rPr>
+        <w:t xml:space="preserve">  ]</w:t>
+      </w:r>
+      <w:proofErr w:type="gramEnd"/>
+      <w:r>
+        <w:rPr>
+          <w:b/>
+          <w:bCs/>
+          <w:szCs w:val="28"/>
+        </w:rPr>
+        <w:t xml:space="preserve"> _____________</w:t>
+      </w:r>
+      <w:r>
+        <w:rPr>
+          <w:szCs w:val="28"/>
+        </w:rPr>
+        <w:t>days after date of satisfaction of all conditions in the</w:t>
+      </w:r>
+      <w:r>
+        <w:rPr>
+          <w:b/>
+          <w:bCs/>
+          <w:szCs w:val="28"/>
+        </w:rPr>
+        <w:t xml:space="preserve"> </w:t>
+      </w:r>
+      <w:r>
+        <w:rPr>
+          <w:b/>
+          <w:bCs/>
+          <w:szCs w:val="28"/>
+        </w:rPr>
+        <w:t>Additional Terms, Conditions or Addenda</w:t>
+      </w:r>
+      <w:r>
+        <w:rPr>
+          <w:b/>
+          <w:bCs/>
+          <w:szCs w:val="28"/>
+        </w:rPr>
+        <w:t xml:space="preserve"> </w:t>
+      </w:r>
+      <w:r>
+        <w:rPr>
+          <w:szCs w:val="28"/>
+        </w:rPr>
+        <w:t>section unless extended by other conditions of this Agreement or this agreement is cancelled by the Purchaser</w:t>
+      </w:r>
+      <w:r>
+        <w:rPr>
+          <w:b/>
+          <w:bCs/>
+          <w:szCs w:val="28"/>
+        </w:rPr>
+        <w:t xml:space="preserve">. </w:t>
       </w:r>
     </w:p>
     <w:p>
@@ -3375,10 +3755,48 @@
       </w:r>
       <w:r>
         <w:rPr>
+          <w:b/>
+          <w:bCs/>
           <w:szCs w:val="28"/>
         </w:rPr>
         <w:lastRenderedPageBreak/>
-        <w:t>Additional Terms, Conditions or Addenda (lettered a,b,c,d, etc.)</w:t>
+        <w:t>Additional Terms, Conditions or Addenda</w:t>
+      </w:r>
+      <w:r>
+        <w:rPr>
+          <w:szCs w:val="28"/>
+        </w:rPr>
+        <w:t xml:space="preserve"> (lettered </w:t>
+      </w:r>
+      <w:proofErr w:type="spellStart"/>
+      <w:proofErr w:type="gramStart"/>
+      <w:r>
+        <w:rPr>
+          <w:szCs w:val="28"/>
+        </w:rPr>
+        <w:t>a,b</w:t>
+      </w:r>
+      <w:proofErr w:type="gramEnd"/>
+      <w:r>
+        <w:rPr>
+          <w:szCs w:val="28"/>
+        </w:rPr>
+        <w:t>,</w:t>
+      </w:r>
+      <w:proofErr w:type="gramStart"/>
+      <w:r>
+        <w:rPr>
+          <w:szCs w:val="28"/>
+        </w:rPr>
+        <w:t>c,d</w:t>
+      </w:r>
+      <w:proofErr w:type="spellEnd"/>
+      <w:proofErr w:type="gramEnd"/>
+      <w:r>
+        <w:rPr>
+          <w:szCs w:val="28"/>
+        </w:rPr>
+        <w:t>, etc.)</w:t>
       </w:r>
     </w:p>
     <w:p>
@@ -3397,6 +3815,18 @@
           <w:bCs/>
         </w:rPr>
         <w:t>This Contract is signed subject to any changes Seller's attorney may make or require. The parties shall sign the Contract again at closing, or execute any required amendment, with any such attorney-required alterations incorporated. If such changes are material and Purchaser does not agree to proceed, Seller may elect to proceed under the previously signed Contract. If Seller does not so elect, Purchaser's due diligence funds shall be returned to Purchaser.</w:t>
+      </w:r>
+      <w:proofErr w:type="gramStart"/>
+      <w:r>
+        <w:rPr>
+          <w:bCs/>
+        </w:rPr>
+      </w:r>
+      <w:proofErr w:type="gramEnd"/>
+      <w:r>
+        <w:rPr>
+          <w:bCs/>
+        </w:rPr>
       </w:r>
     </w:p>
     <w:p>
@@ -3552,9 +3982,17 @@
       </w:pPr>
       <w:r>
         <w:rPr>
-          <w:szCs w:val="28"/>
-        </w:rPr>
-        <w:t xml:space="preserve">Personal Property: included in the purchase price are all fixed equipment including ceiling fans, drapery hardware, attached lighting fixtures, mailbox, fence, plants and shrubbery as now installed on the property. </w:t>
+          <w:b/>
+          <w:bCs/>
+          <w:szCs w:val="28"/>
+        </w:rPr>
+        <w:t>Personal Property</w:t>
+      </w:r>
+      <w:r>
+        <w:rPr>
+          <w:szCs w:val="28"/>
+        </w:rPr>
+        <w:t xml:space="preserve">: included in the purchase price are all fixed equipment including ceiling fans, drapery hardware, attached lighting fixtures, mailbox, fence, plants and shrubbery as now installed on the property. </w:t>
       </w:r>
     </w:p>
     <w:p>
@@ -4319,16 +4757,27 @@
         </w:rPr>
       </w:pPr>
       <w:r>
-        <w:t xml:space="preserve">STATE:   </w:t>
-      </w:r>
-      <w:r>
-        <w:tab/>
-      </w:r>
-      <w:r>
-        <w:rPr>
-          <w:u w:val="single"/>
-        </w:rPr>
-        <w:t>North Carolina</w:t>
+        <w:t>STATE</w:t>
+      </w:r>
+      <w:proofErr w:type="gramStart"/>
+      <w:r>
+        <w:t xml:space="preserve">:   </w:t>
+      </w:r>
+      <w:r>
+        <w:tab/>
+      </w:r>
+      <w:r>
+        <w:rPr>
+          <w:u w:val="single"/>
+        </w:rPr>
+        <w:t>North</w:t>
+      </w:r>
+      <w:proofErr w:type="gramEnd"/>
+      <w:r>
+        <w:rPr>
+          <w:u w:val="single"/>
+        </w:rPr>
+        <w:t xml:space="preserve"> Carolina</w:t>
       </w:r>
     </w:p>
     <w:p>
@@ -4340,6 +4789,9 @@
       <w:r>
         <w:t>COUNTY:  Wake</w:t>
       </w:r>
+      <w:proofErr w:type="gramStart"/>
+      <w:r/>
+      <w:proofErr w:type="gramEnd"/>
     </w:p>
     <w:p>
       <w:pPr>
@@ -4490,7 +4942,14 @@
         <w:rPr>
           <w:rStyle w:val="normaltextrun"/>
         </w:rPr>
-        <w:t>Notary Public </w:t>
+        <w:t xml:space="preserve">Notary </w:t>
+      </w:r>
+      <w:proofErr w:type="gramStart"/>
+      <w:r>
+        <w:rPr>
+          <w:rStyle w:val="normaltextrun"/>
+        </w:rPr>
+        <w:t>Public </w:t>
       </w:r>
       <w:r>
         <w:rPr>
@@ -4502,7 +4961,14 @@
         <w:rPr>
           <w:rStyle w:val="normaltextrun"/>
         </w:rPr>
-        <w:t>My Commission expires:</w:t>
+        <w:t>My</w:t>
+      </w:r>
+      <w:proofErr w:type="gramEnd"/>
+      <w:r>
+        <w:rPr>
+          <w:rStyle w:val="normaltextrun"/>
+        </w:rPr>
+        <w:t xml:space="preserve"> Commission expires:</w:t>
       </w:r>
       <w:r>
         <w:rPr>
@@ -4831,11 +5297,66 @@
           <w:szCs w:val="28"/>
         </w:rPr>
       </w:pPr>
+      <w:proofErr w:type="gramStart"/>
       <w:r>
         <w:rPr>
           <w:szCs w:val="28"/>
         </w:rPr>
         <w:t>[ ] Agent   [X] Seller, by the signature below, acknowledge receipt of $6,000.00 [  ] Cash   [   ] Check, as earnest money deposit, which is credited toward the total down payment mentioned in paragraph 1A of this Agreement. The remaining down payment balance of $14,790.00 shall be paid at closing.</w:t>
+      </w:r>
+      <w:proofErr w:type="gramEnd"/>
+      <w:r>
+        <w:rPr>
+          <w:szCs w:val="28"/>
+        </w:rPr>
+      </w:r>
+      <w:proofErr w:type="gramStart"/>
+      <w:r>
+        <w:rPr>
+          <w:szCs w:val="28"/>
+        </w:rPr>
+      </w:r>
+      <w:proofErr w:type="gramEnd"/>
+      <w:r>
+        <w:rPr>
+          <w:szCs w:val="28"/>
+        </w:rPr>
+      </w:r>
+      <w:proofErr w:type="gramStart"/>
+      <w:r>
+        <w:rPr>
+          <w:szCs w:val="28"/>
+        </w:rPr>
+      </w:r>
+      <w:proofErr w:type="gramEnd"/>
+      <w:r>
+        <w:rPr>
+          <w:szCs w:val="28"/>
+        </w:rPr>
+      </w:r>
+      <w:proofErr w:type="gramStart"/>
+      <w:r>
+        <w:rPr>
+          <w:szCs w:val="28"/>
+        </w:rPr>
+      </w:r>
+      <w:proofErr w:type="gramEnd"/>
+      <w:r>
+        <w:rPr>
+          <w:szCs w:val="28"/>
+        </w:rPr>
+      </w:r>
+      <w:proofErr w:type="gramStart"/>
+      <w:r>
+        <w:rPr>
+          <w:szCs w:val="28"/>
+        </w:rPr>
+      </w:r>
+      <w:proofErr w:type="gramEnd"/>
+      <w:r>
+        <w:rPr>
+          <w:szCs w:val="28"/>
+        </w:rPr>
       </w:r>
     </w:p>
     <w:p>
@@ -5224,16 +5745,27 @@
         </w:rPr>
       </w:pPr>
       <w:r>
-        <w:t xml:space="preserve">STATE:   </w:t>
-      </w:r>
-      <w:r>
-        <w:tab/>
-      </w:r>
-      <w:r>
-        <w:rPr>
-          <w:u w:val="single"/>
-        </w:rPr>
-        <w:t>North Carolina</w:t>
+        <w:t>STATE</w:t>
+      </w:r>
+      <w:proofErr w:type="gramStart"/>
+      <w:r>
+        <w:t xml:space="preserve">:   </w:t>
+      </w:r>
+      <w:r>
+        <w:tab/>
+      </w:r>
+      <w:r>
+        <w:rPr>
+          <w:u w:val="single"/>
+        </w:rPr>
+        <w:t>North</w:t>
+      </w:r>
+      <w:proofErr w:type="gramEnd"/>
+      <w:r>
+        <w:rPr>
+          <w:u w:val="single"/>
+        </w:rPr>
+        <w:t xml:space="preserve"> Carolina</w:t>
       </w:r>
       <w:r>
         <w:rPr>
@@ -5254,6 +5786,9 @@
       <w:r>
         <w:t>COUNTY:  Wake</w:t>
       </w:r>
+      <w:proofErr w:type="gramStart"/>
+      <w:r/>
+      <w:proofErr w:type="gramEnd"/>
     </w:p>
     <w:p>
       <w:pPr>
@@ -5540,7 +6075,14 @@
         <w:rPr>
           <w:rStyle w:val="normaltextrun"/>
         </w:rPr>
-        <w:t>Notary Public </w:t>
+        <w:t xml:space="preserve">Notary </w:t>
+      </w:r>
+      <w:proofErr w:type="gramStart"/>
+      <w:r>
+        <w:rPr>
+          <w:rStyle w:val="normaltextrun"/>
+        </w:rPr>
+        <w:t>Public </w:t>
       </w:r>
       <w:r>
         <w:rPr>
@@ -5552,7 +6094,14 @@
         <w:rPr>
           <w:rStyle w:val="normaltextrun"/>
         </w:rPr>
-        <w:t>My Commission expires:</w:t>
+        <w:t>My</w:t>
+      </w:r>
+      <w:proofErr w:type="gramEnd"/>
+      <w:r>
+        <w:rPr>
+          <w:rStyle w:val="normaltextrun"/>
+        </w:rPr>
+        <w:t xml:space="preserve"> Commission expires:</w:t>
       </w:r>
       <w:r>
         <w:rPr>
@@ -7875,15 +8424,7 @@
 </file>
 
 <file path=customXml/item2.xml><?xml version="1.0" encoding="utf-8"?>
-<p:properties xmlns:p="http://schemas.microsoft.com/office/2006/metadata/properties" xmlns:xsi="http://www.w3.org/2001/XMLSchema-instance" xmlns:pc="http://schemas.microsoft.com/office/infopath/2007/PartnerControls">
-  <documentManagement>
-    <TaxCatchAll xmlns="42cc25d9-27fe-4f07-accb-ded05ec47eee" xsi:nil="true"/>
-    <lcf76f155ced4ddcb4097134ff3c332f xmlns="ab9fedca-001d-4cc9-b244-d9c3be5a27d3">
-      <Terms xmlns="http://schemas.microsoft.com/office/infopath/2007/PartnerControls"/>
-    </lcf76f155ced4ddcb4097134ff3c332f>
-    <_Flow_SignoffStatus xmlns="ab9fedca-001d-4cc9-b244-d9c3be5a27d3" xsi:nil="true"/>
-  </documentManagement>
-</p:properties>
+<b:Sources xmlns:b="http://schemas.openxmlformats.org/officeDocument/2006/bibliography" xmlns="http://schemas.openxmlformats.org/officeDocument/2006/bibliography" SelectedStyle="\APASixthEditionOfficeOnline.xsl" StyleName="APA" Version="6"/>
 </file>
 
 <file path=customXml/item3.xml><?xml version="1.0" encoding="utf-8"?>
@@ -8148,7 +8689,15 @@
 </file>
 
 <file path=customXml/item4.xml><?xml version="1.0" encoding="utf-8"?>
-<b:Sources xmlns:b="http://schemas.openxmlformats.org/officeDocument/2006/bibliography" xmlns="http://schemas.openxmlformats.org/officeDocument/2006/bibliography" SelectedStyle="\APASixthEditionOfficeOnline.xsl" StyleName="APA" Version="6"/>
+<p:properties xmlns:p="http://schemas.microsoft.com/office/2006/metadata/properties" xmlns:xsi="http://www.w3.org/2001/XMLSchema-instance" xmlns:pc="http://schemas.microsoft.com/office/infopath/2007/PartnerControls">
+  <documentManagement>
+    <TaxCatchAll xmlns="42cc25d9-27fe-4f07-accb-ded05ec47eee" xsi:nil="true"/>
+    <lcf76f155ced4ddcb4097134ff3c332f xmlns="ab9fedca-001d-4cc9-b244-d9c3be5a27d3">
+      <Terms xmlns="http://schemas.microsoft.com/office/infopath/2007/PartnerControls"/>
+    </lcf76f155ced4ddcb4097134ff3c332f>
+    <_Flow_SignoffStatus xmlns="ab9fedca-001d-4cc9-b244-d9c3be5a27d3" xsi:nil="true"/>
+  </documentManagement>
+</p:properties>
 </file>
 
 <file path=customXml/itemProps1.xml><?xml version="1.0" encoding="utf-8"?>
@@ -8160,12 +8709,9 @@
 </file>
 
 <file path=customXml/itemProps2.xml><?xml version="1.0" encoding="utf-8"?>
-<ds:datastoreItem xmlns:ds="http://schemas.openxmlformats.org/officeDocument/2006/customXml" ds:itemID="{1A4736DD-7889-4919-A280-9BE82A810A58}">
+<ds:datastoreItem xmlns:ds="http://schemas.openxmlformats.org/officeDocument/2006/customXml" ds:itemID="{3679C442-D341-425F-8964-A65FCEFD3D9B}">
   <ds:schemaRefs>
-    <ds:schemaRef ds:uri="http://schemas.microsoft.com/office/2006/metadata/properties"/>
-    <ds:schemaRef ds:uri="http://schemas.microsoft.com/office/infopath/2007/PartnerControls"/>
-    <ds:schemaRef ds:uri="42cc25d9-27fe-4f07-accb-ded05ec47eee"/>
-    <ds:schemaRef ds:uri="ab9fedca-001d-4cc9-b244-d9c3be5a27d3"/>
+    <ds:schemaRef ds:uri="http://schemas.openxmlformats.org/officeDocument/2006/bibliography"/>
   </ds:schemaRefs>
 </ds:datastoreItem>
 </file>
@@ -8190,9 +8736,12 @@
 </file>
 
 <file path=customXml/itemProps4.xml><?xml version="1.0" encoding="utf-8"?>
-<ds:datastoreItem xmlns:ds="http://schemas.openxmlformats.org/officeDocument/2006/customXml" ds:itemID="{3679C442-D341-425F-8964-A65FCEFD3D9B}">
+<ds:datastoreItem xmlns:ds="http://schemas.openxmlformats.org/officeDocument/2006/customXml" ds:itemID="{1A4736DD-7889-4919-A280-9BE82A810A58}">
   <ds:schemaRefs>
-    <ds:schemaRef ds:uri="http://schemas.openxmlformats.org/officeDocument/2006/bibliography"/>
+    <ds:schemaRef ds:uri="http://schemas.microsoft.com/office/2006/metadata/properties"/>
+    <ds:schemaRef ds:uri="http://schemas.microsoft.com/office/infopath/2007/PartnerControls"/>
+    <ds:schemaRef ds:uri="42cc25d9-27fe-4f07-accb-ded05ec47eee"/>
+    <ds:schemaRef ds:uri="ab9fedca-001d-4cc9-b244-d9c3be5a27d3"/>
   </ds:schemaRefs>
 </ds:datastoreItem>
 </file>
</xml_diff>

<commit_message>
Standardize Rose notary acknowledgment blocks
</commit_message>
<xml_diff>
--- a/Project Rooms/Contract for Deed/output/320 Rose - Contract for Deed Agreement - ATTORNEY REVIEW PACKAGE.docx
+++ b/Project Rooms/Contract for Deed/output/320 Rose - Contract for Deed Agreement - ATTORNEY REVIEW PACKAGE.docx
@@ -4748,268 +4748,38 @@
     </w:p>
     <w:p/>
     <w:p>
-      <w:pPr>
-        <w:tabs>
-          <w:tab w:val="left" w:pos="1260"/>
-        </w:tabs>
-        <w:rPr>
-          <w:u w:val="single"/>
-        </w:rPr>
-      </w:pPr>
-      <w:r>
-        <w:t>STATE</w:t>
-      </w:r>
-      <w:proofErr w:type="gramStart"/>
-      <w:r>
-        <w:t xml:space="preserve">:   </w:t>
-      </w:r>
-      <w:r>
-        <w:tab/>
-      </w:r>
-      <w:r>
-        <w:rPr>
-          <w:u w:val="single"/>
-        </w:rPr>
-        <w:t>North</w:t>
-      </w:r>
-      <w:proofErr w:type="gramEnd"/>
-      <w:r>
-        <w:rPr>
-          <w:u w:val="single"/>
-        </w:rPr>
-        <w:t xml:space="preserve"> Carolina</w:t>
-      </w:r>
-    </w:p>
-    <w:p>
-      <w:pPr>
-        <w:tabs>
-          <w:tab w:val="left" w:pos="1260"/>
-        </w:tabs>
-      </w:pPr>
-      <w:r>
-        <w:t>COUNTY:  Wake</w:t>
-      </w:r>
-      <w:proofErr w:type="gramStart"/>
-      <w:r/>
-      <w:proofErr w:type="gramEnd"/>
-    </w:p>
-    <w:p>
-      <w:pPr>
-        <w:pStyle w:val="paragraph"/>
-        <w:spacing w:before="0" w:beforeAutospacing="0" w:after="0" w:afterAutospacing="0"/>
-        <w:ind w:left="360"/>
-        <w:textAlignment w:val="baseline"/>
-        <w:rPr>
-          <w:rStyle w:val="normaltextrun"/>
-        </w:rPr>
-      </w:pPr>
-      <w:r>
-        <w:rPr>
-          <w:rStyle w:val="normaltextrun"/>
-        </w:rPr>
-        <w:t xml:space="preserve">I, </w:t>
-      </w:r>
-      <w:r>
-        <w:rPr>
-          <w:u w:val="single"/>
-        </w:rPr>
-      </w:r>
-      <w:r>
-        <w:rPr>
-          <w:u w:val="single"/>
-        </w:rPr>
-      </w:r>
-      <w:r>
-        <w:rPr>
-          <w:u w:val="single"/>
-        </w:rPr>
-      </w:r>
-      <w:r>
-        <w:rPr>
-          <w:u w:val="single"/>
-        </w:rPr>
-      </w:r>
-      <w:r>
-        <w:rPr>
-          <w:u w:val="single"/>
-        </w:rPr>
-      </w:r>
-      <w:r/>
-      <w:r>
-        <w:rPr>
-          <w:u w:val="single"/>
-        </w:rPr>
-        <w:tab/>
-        <w:tab/>
-        <w:tab/>
-        <w:tab/>
-        <w:tab/>
-      </w:r>
-      <w:r>
-        <w:t xml:space="preserve">, a Notary Public of the County and State aforesaid, do hereby certify that </w:t>
-      </w:r>
-      <w:r>
-        <w:t>Ever Cardoza and Maria Sarmjento</w:t>
-      </w:r>
-      <w:r>
-        <w:t xml:space="preserve"> personally appeared before me this day and acknowledged the execution of the foregoing instrument.  Witness my hand and notarial seal,</w:t>
-      </w:r>
-    </w:p>
-    <w:p>
-      <w:pPr>
-        <w:pStyle w:val="paragraph"/>
-        <w:spacing w:before="0" w:beforeAutospacing="0" w:after="0" w:afterAutospacing="0"/>
-        <w:ind w:left="360"/>
-        <w:textAlignment w:val="baseline"/>
-        <w:rPr>
-          <w:rStyle w:val="normaltextrun"/>
-        </w:rPr>
-      </w:pPr>
-      <w:r>
-        <w:rPr>
-          <w:rStyle w:val="normaltextrun"/>
-        </w:rPr>
-        <w:t>this the ____day of _________________, 2026.  </w:t>
-      </w:r>
-      <w:r>
-        <w:rPr>
-          <w:rStyle w:val="normaltextrun"/>
-        </w:rPr>
-        <w:tab/>
-      </w:r>
-    </w:p>
-    <w:p>
-      <w:pPr>
-        <w:pStyle w:val="paragraph"/>
-        <w:spacing w:before="0" w:beforeAutospacing="0" w:after="0" w:afterAutospacing="0"/>
-        <w:ind w:left="360"/>
-        <w:textAlignment w:val="baseline"/>
-        <w:rPr>
-          <w:rStyle w:val="normaltextrun"/>
-        </w:rPr>
-      </w:pPr>
-    </w:p>
-    <w:p>
-      <w:pPr>
-        <w:pStyle w:val="paragraph"/>
-        <w:spacing w:before="0" w:beforeAutospacing="0" w:after="0" w:afterAutospacing="0"/>
-        <w:ind w:left="360"/>
-        <w:textAlignment w:val="baseline"/>
-        <w:rPr>
-          <w:rFonts w:ascii="Segoe UI" w:hAnsi="Segoe UI" w:cs="Segoe UI"/>
-        </w:rPr>
-      </w:pPr>
-      <w:r>
-        <w:rPr>
-          <w:rStyle w:val="normaltextrun"/>
-        </w:rPr>
-        <w:t>Notary Signature</w:t>
-      </w:r>
-      <w:r>
-        <w:rPr>
-          <w:rStyle w:val="normaltextrun"/>
-        </w:rPr>
-        <w:tab/>
-        <w:t> </w:t>
-      </w:r>
-      <w:r>
-        <w:rPr>
-          <w:rStyle w:val="normaltextrun"/>
-        </w:rPr>
-        <w:tab/>
-      </w:r>
-      <w:r>
-        <w:t>____________________________________________</w:t>
-      </w:r>
-    </w:p>
-    <w:p>
-      <w:r>
-        <w:t>____________________________________________</w:t>
-      </w:r>
-    </w:p>
-    <w:p>
-      <w:pPr>
-        <w:pStyle w:val="paragraph"/>
-        <w:spacing w:before="0" w:beforeAutospacing="0" w:after="0" w:afterAutospacing="0"/>
-        <w:ind w:left="360"/>
-        <w:textAlignment w:val="baseline"/>
-        <w:rPr>
-          <w:rStyle w:val="normaltextrun"/>
-          <w:u w:val="single"/>
-        </w:rPr>
-      </w:pPr>
-      <w:r>
-        <w:rPr>
-          <w:rStyle w:val="normaltextrun"/>
-        </w:rPr>
-        <w:t xml:space="preserve">Notary </w:t>
-      </w:r>
-      <w:proofErr w:type="gramStart"/>
-      <w:r>
-        <w:rPr>
-          <w:rStyle w:val="normaltextrun"/>
-        </w:rPr>
-        <w:t>Public </w:t>
-      </w:r>
-      <w:r>
-        <w:rPr>
-          <w:rStyle w:val="eop"/>
-        </w:rPr>
-        <w:t> </w:t>
-      </w:r>
-      <w:r>
-        <w:rPr>
-          <w:rStyle w:val="normaltextrun"/>
-        </w:rPr>
-        <w:t>My</w:t>
-      </w:r>
-      <w:proofErr w:type="gramEnd"/>
-      <w:r>
-        <w:rPr>
-          <w:rStyle w:val="normaltextrun"/>
-        </w:rPr>
-        <w:t xml:space="preserve"> Commission expires:</w:t>
-      </w:r>
-      <w:r>
-        <w:rPr>
-          <w:rStyle w:val="normaltextrun"/>
-        </w:rPr>
-        <w:tab/>
-      </w:r>
-      <w:r>
-        <w:rPr>
-          <w:rStyle w:val="normaltextrun"/>
-          <w:u w:val="single"/>
-        </w:rPr>
-        <w:tab/>
-      </w:r>
-      <w:r>
-        <w:rPr>
-          <w:rStyle w:val="normaltextrun"/>
-          <w:u w:val="single"/>
-        </w:rPr>
-        <w:tab/>
-      </w:r>
-      <w:r>
-        <w:rPr>
-          <w:rStyle w:val="normaltextrun"/>
-          <w:u w:val="single"/>
-        </w:rPr>
-        <w:tab/>
-      </w:r>
-      <w:r>
-        <w:rPr>
-          <w:rStyle w:val="normaltextrun"/>
-          <w:u w:val="single"/>
-        </w:rPr>
-        <w:tab/>
-      </w:r>
-      <w:r>
-        <w:rPr>
-          <w:rStyle w:val="normaltextrun"/>
-          <w:u w:val="single"/>
-        </w:rPr>
-        <w:tab/>
+      <w:r>
+        <w:t>STATE OF: NORTH CAROLINA</w:t>
+      </w:r>
+    </w:p>
+    <w:p>
+      <w:r>
+        <w:t>COUNTY OF: Wake</w:t>
+      </w:r>
+    </w:p>
+    <w:p>
+      <w:r>
+        <w:t>I certify that the following person(s) personally appeared before me this day, each acknowledging to me that he/she/they signed the foregoing document: Ever Cardoza and Maria Sarmjento.</w:t>
+      </w:r>
+    </w:p>
+    <w:p>
+      <w:r>
+        <w:t>Date: ____________________</w:t>
+      </w:r>
+    </w:p>
+    <w:p>
+      <w:r>
+        <w:t>Official Signature of Notary: ________________________________________</w:t>
+      </w:r>
+    </w:p>
+    <w:p>
+      <w:r>
+        <w:t>Notary's printed or typed name: ______________________________, Notary Public</w:t>
+      </w:r>
+    </w:p>
+    <w:p>
+      <w:r>
+        <w:t>My commission expires: ______________________</w:t>
       </w:r>
     </w:p>
     <w:p>
@@ -5736,413 +5506,38 @@
       </w:r>
     </w:p>
     <w:p>
-      <w:pPr>
-        <w:tabs>
-          <w:tab w:val="left" w:pos="1260"/>
-        </w:tabs>
-        <w:rPr>
-          <w:u w:val="single"/>
-        </w:rPr>
-      </w:pPr>
-      <w:r>
-        <w:t>STATE</w:t>
-      </w:r>
-      <w:proofErr w:type="gramStart"/>
-      <w:r>
-        <w:t xml:space="preserve">:   </w:t>
-      </w:r>
-      <w:r>
-        <w:tab/>
-      </w:r>
-      <w:r>
-        <w:rPr>
-          <w:u w:val="single"/>
-        </w:rPr>
-        <w:t>North</w:t>
-      </w:r>
-      <w:proofErr w:type="gramEnd"/>
-      <w:r>
-        <w:rPr>
-          <w:u w:val="single"/>
-        </w:rPr>
-        <w:t xml:space="preserve"> Carolina</w:t>
-      </w:r>
-      <w:r>
-        <w:rPr>
-          <w:u w:val="single"/>
-        </w:rPr>
-        <w:tab/>
-      </w:r>
-    </w:p>
-    <w:p>
-      <w:pPr>
-        <w:tabs>
-          <w:tab w:val="left" w:pos="1260"/>
-        </w:tabs>
-        <w:rPr>
-          <w:u w:val="single"/>
-        </w:rPr>
-      </w:pPr>
-      <w:r>
-        <w:t>COUNTY:  Wake</w:t>
-      </w:r>
-      <w:proofErr w:type="gramStart"/>
-      <w:r/>
-      <w:proofErr w:type="gramEnd"/>
-    </w:p>
-    <w:p>
-      <w:pPr>
-        <w:tabs>
-          <w:tab w:val="left" w:pos="1260"/>
-        </w:tabs>
-      </w:pPr>
-    </w:p>
-    <w:p>
-      <w:pPr>
-        <w:pStyle w:val="paragraph"/>
-        <w:spacing w:before="0" w:beforeAutospacing="0" w:after="0" w:afterAutospacing="0"/>
-        <w:textAlignment w:val="baseline"/>
-        <w:rPr>
-          <w:rFonts w:ascii="Segoe UI" w:hAnsi="Segoe UI" w:cs="Segoe UI"/>
-        </w:rPr>
-      </w:pPr>
-      <w:r>
-        <w:rPr>
-          <w:rStyle w:val="eop"/>
-        </w:rPr>
-        <w:t> </w:t>
-      </w:r>
-    </w:p>
-    <w:p>
-      <w:pPr>
-        <w:pStyle w:val="paragraph"/>
-        <w:spacing w:before="0" w:beforeAutospacing="0" w:after="0" w:afterAutospacing="0"/>
-        <w:textAlignment w:val="baseline"/>
-        <w:rPr>
-          <w:rStyle w:val="normaltextrun"/>
-        </w:rPr>
-      </w:pPr>
-      <w:r>
-        <w:rPr>
-          <w:rStyle w:val="normaltextrun"/>
-        </w:rPr>
-        <w:t xml:space="preserve">I, </w:t>
-      </w:r>
-      <w:r>
-        <w:rPr>
-          <w:u w:val="single"/>
-        </w:rPr>
-      </w:r>
-      <w:r>
-        <w:rPr>
-          <w:u w:val="single"/>
-        </w:rPr>
-      </w:r>
-      <w:r>
-        <w:rPr>
-          <w:u w:val="single"/>
-        </w:rPr>
-      </w:r>
-      <w:r>
-        <w:rPr>
-          <w:u w:val="single"/>
-        </w:rPr>
-      </w:r>
-      <w:r>
-        <w:rPr>
-          <w:u w:val="single"/>
-        </w:rPr>
-      </w:r>
-      <w:r/>
-      <w:r>
-        <w:rPr>
-          <w:u w:val="single"/>
-        </w:rPr>
-        <w:tab/>
-        <w:tab/>
-        <w:tab/>
-        <w:tab/>
-        <w:tab/>
-      </w:r>
-      <w:r>
-        <w:t xml:space="preserve">, a Notary Public of the County and State aforesaid, do hereby certify that </w:t>
-      </w:r>
-    </w:p>
-    <w:p>
-      <w:pPr>
-        <w:pStyle w:val="paragraph"/>
-        <w:spacing w:before="0" w:beforeAutospacing="0" w:after="0" w:afterAutospacing="0"/>
-        <w:textAlignment w:val="baseline"/>
-        <w:rPr>
-          <w:rStyle w:val="normaltextrun"/>
-        </w:rPr>
-      </w:pPr>
-    </w:p>
-    <w:p>
-      <w:pPr>
-        <w:pStyle w:val="paragraph"/>
-        <w:spacing w:before="0" w:beforeAutospacing="0" w:after="0" w:afterAutospacing="0"/>
-        <w:textAlignment w:val="baseline"/>
-        <w:rPr>
-          <w:noProof/>
-          <w:u w:val="single"/>
-        </w:rPr>
-      </w:pPr>
-      <w:r>
-        <w:rPr>
-          <w:noProof/>
-          <w:u w:val="single"/>
-        </w:rPr>
-        <w:t>Wes Browning, Manager of Investment Services LLC, Trustee of 320 Rose Pl Real Estate Trust dated March, 5 2025,</w:t>
-      </w:r>
-      <w:r/>
-      <w:r>
-        <w:t xml:space="preserve"> personally appeared before me this day and acknowledged the execution of the foregoing instrument.  Witness my hand and notarial seal,</w:t>
-      </w:r>
-    </w:p>
-    <w:p>
-      <w:pPr>
-        <w:pStyle w:val="paragraph"/>
-        <w:spacing w:before="0" w:beforeAutospacing="0" w:after="0" w:afterAutospacing="0"/>
-        <w:textAlignment w:val="baseline"/>
-        <w:rPr>
-          <w:rStyle w:val="normaltextrun"/>
-        </w:rPr>
-      </w:pPr>
-    </w:p>
-    <w:p>
-      <w:pPr>
-        <w:pStyle w:val="paragraph"/>
-        <w:spacing w:before="0" w:beforeAutospacing="0" w:after="0" w:afterAutospacing="0"/>
-        <w:textAlignment w:val="baseline"/>
-        <w:rPr>
-          <w:rStyle w:val="eop"/>
-        </w:rPr>
-      </w:pPr>
-      <w:r>
-        <w:rPr>
-          <w:rStyle w:val="normaltextrun"/>
-        </w:rPr>
-        <w:t>this the ____day of _________________, 2026.  </w:t>
-      </w:r>
-      <w:r>
-        <w:rPr>
-          <w:rStyle w:val="normaltextrun"/>
-        </w:rPr>
-        <w:tab/>
-      </w:r>
-    </w:p>
-    <w:p>
-      <w:pPr>
-        <w:pStyle w:val="paragraph"/>
-        <w:spacing w:before="0" w:beforeAutospacing="0" w:after="0" w:afterAutospacing="0"/>
-        <w:textAlignment w:val="baseline"/>
-        <w:rPr>
-          <w:rStyle w:val="eop"/>
-        </w:rPr>
-      </w:pPr>
-    </w:p>
-    <w:p>
-      <w:pPr>
-        <w:pStyle w:val="paragraph"/>
-        <w:spacing w:before="0" w:beforeAutospacing="0" w:after="0" w:afterAutospacing="0"/>
-        <w:textAlignment w:val="baseline"/>
-        <w:rPr>
-          <w:rFonts w:ascii="Segoe UI" w:hAnsi="Segoe UI" w:cs="Segoe UI"/>
-        </w:rPr>
-      </w:pPr>
-      <w:r>
-        <w:rPr>
-          <w:rStyle w:val="eop"/>
-        </w:rPr>
-        <w:t>Notary Signature</w:t>
-      </w:r>
-      <w:r>
-        <w:rPr>
-          <w:rStyle w:val="eop"/>
-          <w:u w:val="single"/>
-        </w:rPr>
-        <w:tab/>
-      </w:r>
-      <w:r>
-        <w:rPr>
-          <w:rStyle w:val="eop"/>
-          <w:u w:val="single"/>
-        </w:rPr>
-        <w:tab/>
-      </w:r>
-      <w:r>
-        <w:rPr>
-          <w:rStyle w:val="eop"/>
-          <w:u w:val="single"/>
-        </w:rPr>
-        <w:tab/>
-      </w:r>
-      <w:r>
-        <w:rPr>
-          <w:rStyle w:val="eop"/>
-          <w:u w:val="single"/>
-        </w:rPr>
-        <w:tab/>
-      </w:r>
-      <w:r>
-        <w:rPr>
-          <w:rStyle w:val="eop"/>
-          <w:u w:val="single"/>
-        </w:rPr>
-        <w:tab/>
-      </w:r>
-      <w:r>
-        <w:rPr>
-          <w:rStyle w:val="eop"/>
-          <w:u w:val="single"/>
-        </w:rPr>
-        <w:tab/>
-      </w:r>
-      <w:r>
-        <w:rPr>
-          <w:rStyle w:val="eop"/>
-          <w:u w:val="single"/>
-        </w:rPr>
-        <w:tab/>
-      </w:r>
-      <w:r>
-        <w:rPr>
-          <w:rStyle w:val="eop"/>
-          <w:u w:val="single"/>
-        </w:rPr>
-        <w:tab/>
-      </w:r>
-      <w:r>
-        <w:rPr>
-          <w:rStyle w:val="eop"/>
-          <w:u w:val="single"/>
-        </w:rPr>
-        <w:tab/>
-      </w:r>
-      <w:r>
-        <w:rPr>
-          <w:rStyle w:val="eop"/>
-          <w:u w:val="single"/>
-        </w:rPr>
-        <w:tab/>
-        <w:t xml:space="preserve"> </w:t>
-      </w:r>
-    </w:p>
-    <w:p>
-      <w:pPr>
-        <w:pStyle w:val="paragraph"/>
-        <w:spacing w:before="0" w:beforeAutospacing="0" w:after="0" w:afterAutospacing="0"/>
-        <w:textAlignment w:val="baseline"/>
-        <w:rPr>
-          <w:rFonts w:ascii="Segoe UI" w:hAnsi="Segoe UI" w:cs="Segoe UI"/>
-        </w:rPr>
-      </w:pPr>
-      <w:r>
-        <w:rPr>
-          <w:rStyle w:val="normaltextrun"/>
-        </w:rPr>
-        <w:t>            </w:t>
-      </w:r>
-      <w:r>
-        <w:rPr>
-          <w:rStyle w:val="eop"/>
-        </w:rPr>
-        <w:t> </w:t>
-      </w:r>
-      <w:r>
-        <w:rPr>
-          <w:rStyle w:val="eop"/>
-        </w:rPr>
-        <w:tab/>
-      </w:r>
-    </w:p>
-    <w:p>
-      <w:r>
-        <w:t>____________________________________________</w:t>
-      </w:r>
-    </w:p>
-    <w:p>
-      <w:pPr>
-        <w:pStyle w:val="paragraph"/>
-        <w:spacing w:before="0" w:beforeAutospacing="0" w:after="0" w:afterAutospacing="0"/>
-        <w:textAlignment w:val="baseline"/>
-        <w:rPr>
-          <w:rStyle w:val="normaltextrun"/>
-        </w:rPr>
-      </w:pPr>
-      <w:r>
-        <w:rPr>
-          <w:rStyle w:val="normaltextrun"/>
-        </w:rPr>
-        <w:t xml:space="preserve">Notary </w:t>
-      </w:r>
-      <w:proofErr w:type="gramStart"/>
-      <w:r>
-        <w:rPr>
-          <w:rStyle w:val="normaltextrun"/>
-        </w:rPr>
-        <w:t>Public </w:t>
-      </w:r>
-      <w:r>
-        <w:rPr>
-          <w:rStyle w:val="eop"/>
-        </w:rPr>
-        <w:t> </w:t>
-      </w:r>
-      <w:r>
-        <w:rPr>
-          <w:rStyle w:val="normaltextrun"/>
-        </w:rPr>
-        <w:t>My</w:t>
-      </w:r>
-      <w:proofErr w:type="gramEnd"/>
-      <w:r>
-        <w:rPr>
-          <w:rStyle w:val="normaltextrun"/>
-        </w:rPr>
-        <w:t xml:space="preserve"> Commission expires:</w:t>
-      </w:r>
-      <w:r>
-        <w:rPr>
-          <w:rStyle w:val="normaltextrun"/>
-        </w:rPr>
-        <w:tab/>
-      </w:r>
-      <w:r>
-        <w:rPr>
-          <w:rStyle w:val="normaltextrun"/>
-          <w:u w:val="single"/>
-        </w:rPr>
-        <w:tab/>
-      </w:r>
-      <w:r>
-        <w:rPr>
-          <w:rStyle w:val="normaltextrun"/>
-          <w:u w:val="single"/>
-        </w:rPr>
-        <w:tab/>
-      </w:r>
-      <w:r>
-        <w:rPr>
-          <w:rStyle w:val="normaltextrun"/>
-          <w:u w:val="single"/>
-        </w:rPr>
-        <w:tab/>
-      </w:r>
-      <w:r>
-        <w:rPr>
-          <w:rStyle w:val="normaltextrun"/>
-          <w:u w:val="single"/>
-        </w:rPr>
-        <w:tab/>
-      </w:r>
-      <w:r>
-        <w:rPr>
-          <w:rStyle w:val="normaltextrun"/>
-          <w:u w:val="single"/>
-        </w:rPr>
-        <w:tab/>
+      <w:r>
+        <w:t>STATE OF: NORTH CAROLINA</w:t>
+      </w:r>
+    </w:p>
+    <w:p>
+      <w:r>
+        <w:t>COUNTY OF: Wake</w:t>
+      </w:r>
+    </w:p>
+    <w:p>
+      <w:r>
+        <w:t>I certify that the following person(s) personally appeared before me this day, each acknowledging to me that he/she/they signed the foregoing document: Wes Browning, Manager of Investment Services LLC, Trustee of 320 Rose Pl Real Estate Trust dated March, 5 2025.</w:t>
+      </w:r>
+    </w:p>
+    <w:p>
+      <w:r>
+        <w:t>Date: ____________________</w:t>
+      </w:r>
+    </w:p>
+    <w:p>
+      <w:r>
+        <w:t>Official Signature of Notary: ________________________________________</w:t>
+      </w:r>
+    </w:p>
+    <w:p>
+      <w:r>
+        <w:t>Notary's printed or typed name: ______________________________, Notary Public</w:t>
+      </w:r>
+    </w:p>
+    <w:p>
+      <w:r>
+        <w:t>My commission expires: ______________________</w:t>
       </w:r>
     </w:p>
     <w:sectPr>

</xml_diff>

<commit_message>
Fix CFD buyer name normalization
</commit_message>
<xml_diff>
--- a/Project Rooms/Contract for Deed/output/320 Rose - Contract for Deed Agreement - ATTORNEY REVIEW PACKAGE.docx
+++ b/Project Rooms/Contract for Deed/output/320 Rose - Contract for Deed Agreement - ATTORNEY REVIEW PACKAGE.docx
@@ -5020,7 +5020,7 @@
           <w:szCs w:val="28"/>
           <w:u w:val="single"/>
         </w:rPr>
-        <w:t>Investment Services LLC, Trustee - Al Bennett, Manager</w:t>
+        <w:t>Investment Services LLC, Trustee - José Fabre Jr., Manager</w:t>
       </w:r>
     </w:p>
     <w:p>
@@ -5517,7 +5517,7 @@
     </w:p>
     <w:p>
       <w:r>
-        <w:t>I certify that the following person(s) personally appeared before me this day, each acknowledging to me that he/she/they signed the foregoing document: Al Bennett, Manager of Investment Services LLC, Trustee of 320 Rose Pl Real Estate Trust dated March, 5 2025.</w:t>
+        <w:t>I certify that the following person(s) personally appeared before me this day, each acknowledging to me that he/she/they signed the foregoing document: José Fabre Jr., Manager of Investment Services LLC, Trustee of 320 Rose Pl Real Estate Trust dated March, 5 2025.</w:t>
       </w:r>
     </w:p>
     <w:p>

</xml_diff>